<commit_message>
chore(templates): update 13 modified QC Word (.docx) templates in templates and public/templates
</commit_message>
<xml_diff>
--- a/public/templates/00_common/qc_label.docx
+++ b/public/templates/00_common/qc_label.docx
@@ -1,10 +1,10 @@
 
 <file path=word/document.xml><?xml version="1.0" encoding="utf-8"?>
-<w:document xmlns:wpc="http://schemas.microsoft.com/office/word/2010/wordprocessingCanvas" xmlns:cx="http://schemas.microsoft.com/office/drawing/2014/chartex" xmlns:cx1="http://schemas.microsoft.com/office/drawing/2015/9/8/chartex" xmlns:cx2="http://schemas.microsoft.com/office/drawing/2015/10/21/chartex" xmlns:cx3="http://schemas.microsoft.com/office/drawing/2016/5/9/chartex" xmlns:cx4="http://schemas.microsoft.com/office/drawing/2016/5/10/chartex" xmlns:cx5="http://schemas.microsoft.com/office/drawing/2016/5/11/chartex" xmlns:cx6="http://schemas.microsoft.com/office/drawing/2016/5/12/chartex" xmlns:cx7="http://schemas.microsoft.com/office/drawing/2016/5/13/chartex" xmlns:cx8="http://schemas.microsoft.com/office/drawing/2016/5/14/chartex" xmlns:mc="http://schemas.openxmlformats.org/markup-compatibility/2006" xmlns:aink="http://schemas.microsoft.com/office/drawing/2016/ink" xmlns:am3d="http://schemas.microsoft.com/office/drawing/2017/model3d" xmlns:o="urn:schemas-microsoft-com:office:office" xmlns:oel="http://schemas.microsoft.com/office/2019/extlst" xmlns:r="http://schemas.openxmlformats.org/officeDocument/2006/relationships" xmlns:m="http://schemas.openxmlformats.org/officeDocument/2006/math" xmlns:v="urn:schemas-microsoft-com:vml" xmlns:wp14="http://schemas.microsoft.com/office/word/2010/wordprocessingDrawing" xmlns:wp="http://schemas.openxmlformats.org/drawingml/2006/wordprocessingDrawing" xmlns:w10="urn:schemas-microsoft-com:office:word" xmlns:w="http://schemas.openxmlformats.org/wordprocessingml/2006/main" xmlns:w14="http://schemas.microsoft.com/office/word/2010/wordml" xmlns:w15="http://schemas.microsoft.com/office/word/2012/wordml" xmlns:w16cex="http://schemas.microsoft.com/office/word/2018/wordml/cex" xmlns:w16cid="http://schemas.microsoft.com/office/word/2016/wordml/cid" xmlns:w16="http://schemas.microsoft.com/office/word/2018/wordml" xmlns:w16du="http://schemas.microsoft.com/office/word/2023/wordml/word16du" xmlns:w16sdtdh="http://schemas.microsoft.com/office/word/2020/wordml/sdtdatahash" xmlns:w16sdtfl="http://schemas.microsoft.com/office/word/2024/wordml/sdtformatlock" xmlns:w16se="http://schemas.microsoft.com/office/word/2015/wordml/symex" xmlns:wpg="http://schemas.microsoft.com/office/word/2010/wordprocessingGroup" xmlns:wpi="http://schemas.microsoft.com/office/word/2010/wordprocessingInk" xmlns:wne="http://schemas.microsoft.com/office/word/2006/wordml" xmlns:wps="http://schemas.microsoft.com/office/word/2010/wordprocessingShape" mc:Ignorable="w14 w15 w16se w16cid w16 w16cex w16sdtdh w16sdtfl w16du wp14">
+<w:document xmlns:wpc="http://schemas.microsoft.com/office/word/2010/wordprocessingCanvas" xmlns:cx="http://schemas.microsoft.com/office/drawing/2014/chartex" xmlns:mc="http://schemas.openxmlformats.org/markup-compatibility/2006" xmlns:o="urn:schemas-microsoft-com:office:office" xmlns:r="http://schemas.openxmlformats.org/officeDocument/2006/relationships" xmlns:m="http://schemas.openxmlformats.org/officeDocument/2006/math" xmlns:v="urn:schemas-microsoft-com:vml" xmlns:wp14="http://schemas.microsoft.com/office/word/2010/wordprocessingDrawing" xmlns:wp="http://schemas.openxmlformats.org/drawingml/2006/wordprocessingDrawing" xmlns:w10="urn:schemas-microsoft-com:office:word" xmlns:w="http://schemas.openxmlformats.org/wordprocessingml/2006/main" xmlns:w14="http://schemas.microsoft.com/office/word/2010/wordml" xmlns:w15="http://schemas.microsoft.com/office/word/2012/wordml" xmlns:w16se="http://schemas.microsoft.com/office/word/2015/wordml/symex" xmlns:wpg="http://schemas.microsoft.com/office/word/2010/wordprocessingGroup" xmlns:wpi="http://schemas.microsoft.com/office/word/2010/wordprocessingInk" xmlns:wne="http://schemas.microsoft.com/office/word/2006/wordml" xmlns:wps="http://schemas.microsoft.com/office/word/2010/wordprocessingShape" mc:Ignorable="w14 w15 w16se wp14">
   <w:body>
     <w:p>
       <w:pPr>
-        <w:spacing w:before="0"/>
+        <w:spacing w:before="5"/>
         <w:rPr>
           <w:rFonts w:ascii="Times New Roman"/>
           <w:sz w:val="2"/>
@@ -36,7 +36,7 @@
       </w:tblGrid>
       <w:tr>
         <w:trPr>
-          <w:trHeight w:val="690"/>
+          <w:trHeight w:val="239"/>
         </w:trPr>
         <w:tc>
           <w:tcPr>
@@ -46,14 +46,16 @@
           <w:p>
             <w:pPr>
               <w:pStyle w:val="TableParagraph"/>
-              <w:spacing w:before="0" w:line="502" w:lineRule="exact"/>
+              <w:spacing w:line="502" w:lineRule="exact"/>
               <w:ind w:left="3"/>
               <w:rPr>
+                <w:rFonts w:asciiTheme="minorEastAsia" w:eastAsiaTheme="minorEastAsia" w:hAnsiTheme="minorEastAsia"/>
                 <w:sz w:val="40"/>
               </w:rPr>
             </w:pPr>
             <w:r>
               <w:rPr>
+                <w:rFonts w:asciiTheme="minorEastAsia" w:eastAsiaTheme="minorEastAsia" w:hAnsiTheme="minorEastAsia"/>
                 <w:spacing w:val="-2"/>
                 <w:sz w:val="40"/>
               </w:rPr>
@@ -68,12 +70,15 @@
           <w:p>
             <w:pPr>
               <w:pStyle w:val="TableParagraph"/>
-              <w:spacing w:before="0"/>
               <w:ind w:left="11"/>
+              <w:rPr>
+                <w:rFonts w:asciiTheme="minorEastAsia" w:eastAsiaTheme="minorEastAsia" w:hAnsiTheme="minorEastAsia"/>
+              </w:rPr>
             </w:pPr>
             <w:proofErr w:type="spellStart"/>
             <w:r>
               <w:rPr>
+                <w:rFonts w:asciiTheme="minorEastAsia" w:eastAsiaTheme="minorEastAsia" w:hAnsiTheme="minorEastAsia"/>
                 <w:spacing w:val="-2"/>
               </w:rPr>
               <w:t>시험중</w:t>
@@ -81,43 +86,47 @@
             <w:proofErr w:type="spellEnd"/>
             <w:r>
               <w:rPr>
-                <w:rFonts w:ascii="Calibri" w:eastAsia="Calibri"/>
+                <w:rFonts w:asciiTheme="minorEastAsia" w:eastAsiaTheme="minorEastAsia" w:hAnsiTheme="minorEastAsia"/>
                 <w:spacing w:val="-2"/>
               </w:rPr>
               <w:t>/</w:t>
             </w:r>
             <w:r>
               <w:rPr>
+                <w:rFonts w:asciiTheme="minorEastAsia" w:eastAsiaTheme="minorEastAsia" w:hAnsiTheme="minorEastAsia"/>
                 <w:spacing w:val="-2"/>
               </w:rPr>
               <w:t>적합</w:t>
             </w:r>
             <w:r>
               <w:rPr>
-                <w:rFonts w:ascii="Calibri" w:eastAsia="Calibri"/>
+                <w:rFonts w:asciiTheme="minorEastAsia" w:eastAsiaTheme="minorEastAsia" w:hAnsiTheme="minorEastAsia"/>
                 <w:spacing w:val="-2"/>
               </w:rPr>
               <w:t>/</w:t>
             </w:r>
             <w:r>
               <w:rPr>
+                <w:rFonts w:asciiTheme="minorEastAsia" w:eastAsiaTheme="minorEastAsia" w:hAnsiTheme="minorEastAsia"/>
                 <w:spacing w:val="-2"/>
               </w:rPr>
               <w:t>부적합</w:t>
             </w:r>
-          </w:p>
-          <w:p>
-            <w:pPr>
-              <w:pStyle w:val="TableParagraph"/>
-              <w:spacing w:before="0" w:line="275" w:lineRule="exact"/>
-              <w:ind w:left="11" w:right="4"/>
-            </w:pPr>
-            <w:r>
-              <w:rPr>
+            <w:r>
+              <w:rPr>
+                <w:rFonts w:asciiTheme="minorEastAsia" w:eastAsiaTheme="minorEastAsia" w:hAnsiTheme="minorEastAsia" w:hint="eastAsia"/>
+              </w:rPr>
+              <w:t xml:space="preserve"> </w:t>
+            </w:r>
+            <w:proofErr w:type="spellStart"/>
+            <w:r>
+              <w:rPr>
+                <w:rFonts w:asciiTheme="minorEastAsia" w:eastAsiaTheme="minorEastAsia" w:hAnsiTheme="minorEastAsia"/>
                 <w:spacing w:val="-5"/>
               </w:rPr>
               <w:t>표시서</w:t>
             </w:r>
+            <w:proofErr w:type="spellEnd"/>
           </w:p>
         </w:tc>
       </w:tr>
@@ -135,20 +144,27 @@
               <w:tabs>
                 <w:tab w:val="left" w:pos="665"/>
               </w:tabs>
-              <w:spacing w:before="0"/>
               <w:ind w:left="8"/>
-            </w:pPr>
-            <w:r>
-              <w:rPr>
+              <w:rPr>
+                <w:rFonts w:asciiTheme="minorEastAsia" w:eastAsiaTheme="minorEastAsia" w:hAnsiTheme="minorEastAsia"/>
+              </w:rPr>
+            </w:pPr>
+            <w:r>
+              <w:rPr>
+                <w:rFonts w:asciiTheme="minorEastAsia" w:eastAsiaTheme="minorEastAsia" w:hAnsiTheme="minorEastAsia"/>
                 <w:spacing w:val="-10"/>
               </w:rPr>
               <w:t>구</w:t>
             </w:r>
             <w:r>
+              <w:rPr>
+                <w:rFonts w:asciiTheme="minorEastAsia" w:eastAsiaTheme="minorEastAsia" w:hAnsiTheme="minorEastAsia"/>
+              </w:rPr>
               <w:tab/>
             </w:r>
             <w:r>
               <w:rPr>
+                <w:rFonts w:asciiTheme="minorEastAsia" w:eastAsiaTheme="minorEastAsia" w:hAnsiTheme="minorEastAsia"/>
                 <w:spacing w:val="-10"/>
               </w:rPr>
               <w:t>분</w:t>
@@ -173,15 +189,16 @@
                 <w:tab w:val="left" w:pos="2542"/>
                 <w:tab w:val="left" w:pos="3857"/>
               </w:tabs>
-              <w:spacing w:before="0"/>
               <w:ind w:hanging="292"/>
               <w:jc w:val="left"/>
               <w:rPr>
-                <w:sz w:val="24"/>
-              </w:rPr>
-            </w:pPr>
-            <w:r>
-              <w:rPr>
+                <w:rFonts w:asciiTheme="minorEastAsia" w:eastAsiaTheme="minorEastAsia" w:hAnsiTheme="minorEastAsia"/>
+                <w:sz w:val="24"/>
+              </w:rPr>
+            </w:pPr>
+            <w:r>
+              <w:rPr>
+                <w:rFonts w:asciiTheme="minorEastAsia" w:eastAsiaTheme="minorEastAsia" w:hAnsiTheme="minorEastAsia"/>
                 <w:spacing w:val="-5"/>
                 <w:w w:val="105"/>
                 <w:sz w:val="24"/>
@@ -190,13 +207,14 @@
             </w:r>
             <w:r>
               <w:rPr>
+                <w:rFonts w:asciiTheme="minorEastAsia" w:eastAsiaTheme="minorEastAsia" w:hAnsiTheme="minorEastAsia"/>
                 <w:sz w:val="24"/>
               </w:rPr>
               <w:tab/>
             </w:r>
             <w:r>
               <w:rPr>
-                <w:rFonts w:ascii="Meiryo UI" w:eastAsia="Meiryo UI" w:hAnsi="Meiryo UI"/>
+                <w:rFonts w:ascii="Segoe UI Symbol" w:eastAsiaTheme="minorEastAsia" w:hAnsi="Segoe UI Symbol" w:cs="Segoe UI Symbol"/>
                 <w:w w:val="105"/>
                 <w:sz w:val="24"/>
               </w:rPr>
@@ -204,7 +222,7 @@
             </w:r>
             <w:r>
               <w:rPr>
-                <w:rFonts w:ascii="Meiryo UI" w:eastAsia="Meiryo UI" w:hAnsi="Meiryo UI"/>
+                <w:rFonts w:asciiTheme="minorEastAsia" w:eastAsiaTheme="minorEastAsia" w:hAnsiTheme="minorEastAsia"/>
                 <w:spacing w:val="46"/>
                 <w:w w:val="105"/>
                 <w:sz w:val="24"/>
@@ -213,6 +231,7 @@
             </w:r>
             <w:r>
               <w:rPr>
+                <w:rFonts w:asciiTheme="minorEastAsia" w:eastAsiaTheme="minorEastAsia" w:hAnsiTheme="minorEastAsia"/>
                 <w:spacing w:val="-5"/>
                 <w:w w:val="105"/>
                 <w:sz w:val="24"/>
@@ -221,13 +240,14 @@
             </w:r>
             <w:r>
               <w:rPr>
+                <w:rFonts w:asciiTheme="minorEastAsia" w:eastAsiaTheme="minorEastAsia" w:hAnsiTheme="minorEastAsia"/>
                 <w:sz w:val="24"/>
               </w:rPr>
               <w:tab/>
             </w:r>
             <w:r>
               <w:rPr>
-                <w:rFonts w:ascii="Meiryo UI" w:eastAsia="Meiryo UI" w:hAnsi="Meiryo UI"/>
+                <w:rFonts w:ascii="Segoe UI Symbol" w:eastAsiaTheme="minorEastAsia" w:hAnsi="Segoe UI Symbol" w:cs="Segoe UI Symbol"/>
                 <w:w w:val="105"/>
                 <w:sz w:val="24"/>
               </w:rPr>
@@ -235,7 +255,7 @@
             </w:r>
             <w:r>
               <w:rPr>
-                <w:rFonts w:ascii="Meiryo UI" w:eastAsia="Meiryo UI" w:hAnsi="Meiryo UI"/>
+                <w:rFonts w:asciiTheme="minorEastAsia" w:eastAsiaTheme="minorEastAsia" w:hAnsiTheme="minorEastAsia"/>
                 <w:spacing w:val="50"/>
                 <w:w w:val="105"/>
                 <w:sz w:val="24"/>
@@ -244,6 +264,7 @@
             </w:r>
             <w:r>
               <w:rPr>
+                <w:rFonts w:asciiTheme="minorEastAsia" w:eastAsiaTheme="minorEastAsia" w:hAnsiTheme="minorEastAsia"/>
                 <w:spacing w:val="-5"/>
                 <w:w w:val="105"/>
                 <w:sz w:val="24"/>
@@ -252,13 +273,14 @@
             </w:r>
             <w:r>
               <w:rPr>
+                <w:rFonts w:asciiTheme="minorEastAsia" w:eastAsiaTheme="minorEastAsia" w:hAnsiTheme="minorEastAsia"/>
                 <w:sz w:val="24"/>
               </w:rPr>
               <w:tab/>
             </w:r>
             <w:r>
               <w:rPr>
-                <w:rFonts w:ascii="Meiryo UI" w:eastAsia="Meiryo UI" w:hAnsi="Meiryo UI"/>
+                <w:rFonts w:ascii="Segoe UI Symbol" w:eastAsiaTheme="minorEastAsia" w:hAnsi="Segoe UI Symbol" w:cs="Segoe UI Symbol"/>
                 <w:w w:val="105"/>
                 <w:sz w:val="24"/>
               </w:rPr>
@@ -266,7 +288,7 @@
             </w:r>
             <w:r>
               <w:rPr>
-                <w:rFonts w:ascii="Meiryo UI" w:eastAsia="Meiryo UI" w:hAnsi="Meiryo UI"/>
+                <w:rFonts w:asciiTheme="minorEastAsia" w:eastAsiaTheme="minorEastAsia" w:hAnsiTheme="minorEastAsia"/>
                 <w:spacing w:val="46"/>
                 <w:w w:val="105"/>
                 <w:sz w:val="24"/>
@@ -275,6 +297,7 @@
             </w:r>
             <w:r>
               <w:rPr>
+                <w:rFonts w:asciiTheme="minorEastAsia" w:eastAsiaTheme="minorEastAsia" w:hAnsiTheme="minorEastAsia"/>
                 <w:spacing w:val="-5"/>
                 <w:w w:val="105"/>
                 <w:sz w:val="24"/>
@@ -291,10 +314,9 @@
           <w:p>
             <w:pPr>
               <w:pStyle w:val="TableParagraph"/>
-              <w:spacing w:before="0"/>
               <w:jc w:val="left"/>
               <w:rPr>
-                <w:rFonts w:ascii="Times New Roman"/>
+                <w:rFonts w:asciiTheme="minorEastAsia" w:eastAsiaTheme="minorEastAsia" w:hAnsiTheme="minorEastAsia"/>
                 <w:sz w:val="30"/>
               </w:rPr>
             </w:pPr>
@@ -304,18 +326,20 @@
               <w:pStyle w:val="TableParagraph"/>
               <w:ind w:left="11" w:right="4"/>
               <w:rPr>
+                <w:rFonts w:asciiTheme="minorEastAsia" w:eastAsiaTheme="minorEastAsia" w:hAnsiTheme="minorEastAsia"/>
                 <w:sz w:val="30"/>
               </w:rPr>
             </w:pPr>
             <w:r>
               <w:rPr>
+                <w:rFonts w:asciiTheme="minorEastAsia" w:eastAsiaTheme="minorEastAsia" w:hAnsiTheme="minorEastAsia"/>
                 <w:noProof/>
                 <w:sz w:val="30"/>
               </w:rPr>
               <mc:AlternateContent>
                 <mc:Choice Requires="wpg">
                   <w:drawing>
-                    <wp:anchor distT="0" distB="0" distL="0" distR="0" simplePos="0" relativeHeight="487402496" behindDoc="1" locked="0" layoutInCell="1" allowOverlap="1" wp14:anchorId="6C857BAD" wp14:editId="57E67AC8">
+                    <wp:anchor distT="0" distB="0" distL="0" distR="0" simplePos="0" relativeHeight="251654656" behindDoc="1" locked="0" layoutInCell="1" allowOverlap="1" wp14:anchorId="6C857BAD" wp14:editId="57E67AC8">
                       <wp:simplePos x="0" y="0"/>
                       <wp:positionH relativeFrom="column">
                         <wp:posOffset>540994</wp:posOffset>
@@ -350,7 +374,7 @@
                                 <pic:cNvPicPr/>
                               </pic:nvPicPr>
                               <pic:blipFill>
-                                <a:blip r:embed="rId5" cstate="print"/>
+                                <a:blip r:embed="rId6" cstate="print"/>
                                 <a:stretch>
                                   <a:fillRect/>
                                 </a:stretch>
@@ -373,7 +397,7 @@
                 </mc:Choice>
                 <mc:Fallback>
                   <w:pict>
-                    <v:group w14:anchorId="2CD9E20D" id="Group 1" o:spid="_x0000_s1026" style="position:absolute;margin-left:42.6pt;margin-top:-19.45pt;width:59.3pt;height:58.85pt;z-index:-15913984;mso-wrap-distance-left:0;mso-wrap-distance-right:0" coordsize="7531,7473" o:gfxdata="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">
+                    <v:group w14:anchorId="17B3460C" id="Group 1" o:spid="_x0000_s1026" style="position:absolute;left:0;text-align:left;margin-left:42.6pt;margin-top:-19.45pt;width:59.3pt;height:58.85pt;z-index:-251661824;mso-wrap-distance-left:0;mso-wrap-distance-right:0" coordsize="7531,7473" o:gfxdata="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">
                       <v:shapetype id="_x0000_t75" coordsize="21600,21600" o:spt="75" o:preferrelative="t" path="m@4@5l@4@11@9@11@9@5xe" filled="f" stroked="f">
                         <v:stroke joinstyle="miter"/>
                         <v:formulas>
@@ -393,8 +417,8 @@
                         <v:path o:extrusionok="f" gradientshapeok="t" o:connecttype="rect"/>
                         <o:lock v:ext="edit" aspectratio="t"/>
                       </v:shapetype>
-                      <v:shape id="Image 2" o:spid="_x0000_s1027" type="#_x0000_t75" style="position:absolute;width:7489;height:7429;visibility:visible;mso-wrap-style:square" o:gfxdata="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">
-                        <v:imagedata r:id="rId6" o:title=""/>
+                      <v:shape id="Image 2" o:spid="_x0000_s1027" type="#_x0000_t75" style="position:absolute;width:7489;height:7429;visibility:visible;mso-wrap-style:square" o:gfxdata="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">
+                        <v:imagedata r:id="rId7" o:title=""/>
                       </v:shape>
                     </v:group>
                   </w:pict>
@@ -403,6 +427,7 @@
             </w:r>
             <w:r>
               <w:rPr>
+                <w:rFonts w:asciiTheme="minorEastAsia" w:eastAsiaTheme="minorEastAsia" w:hAnsiTheme="minorEastAsia"/>
                 <w:spacing w:val="-5"/>
                 <w:sz w:val="30"/>
               </w:rPr>
@@ -427,18 +452,26 @@
               </w:tabs>
               <w:spacing w:line="253" w:lineRule="exact"/>
               <w:ind w:left="119"/>
-            </w:pPr>
-            <w:r>
-              <w:rPr>
+              <w:rPr>
+                <w:rFonts w:asciiTheme="minorEastAsia" w:eastAsiaTheme="minorEastAsia" w:hAnsiTheme="minorEastAsia"/>
+              </w:rPr>
+            </w:pPr>
+            <w:r>
+              <w:rPr>
+                <w:rFonts w:asciiTheme="minorEastAsia" w:eastAsiaTheme="minorEastAsia" w:hAnsiTheme="minorEastAsia"/>
                 <w:spacing w:val="-10"/>
               </w:rPr>
               <w:t>품</w:t>
             </w:r>
             <w:r>
+              <w:rPr>
+                <w:rFonts w:asciiTheme="minorEastAsia" w:eastAsiaTheme="minorEastAsia" w:hAnsiTheme="minorEastAsia"/>
+              </w:rPr>
               <w:tab/>
             </w:r>
             <w:r>
               <w:rPr>
+                <w:rFonts w:asciiTheme="minorEastAsia" w:eastAsiaTheme="minorEastAsia" w:hAnsiTheme="minorEastAsia"/>
                 <w:spacing w:val="-10"/>
               </w:rPr>
               <w:t>명</w:t>
@@ -454,13 +487,13 @@
             <w:pPr>
               <w:pStyle w:val="TableParagraph"/>
               <w:rPr>
-                <w:rFonts w:ascii="Times New Roman"/>
-                <w:sz w:val="20"/>
-              </w:rPr>
-            </w:pPr>
-            <w:r>
-              <w:rPr>
-                <w:rFonts w:ascii="맑은 고딕" w:eastAsia="맑은 고딕" w:cs="맑은 고딕"/>
+                <w:rFonts w:asciiTheme="minorEastAsia" w:eastAsiaTheme="minorEastAsia" w:hAnsiTheme="minorEastAsia"/>
+                <w:sz w:val="20"/>
+              </w:rPr>
+            </w:pPr>
+            <w:r>
+              <w:rPr>
+                <w:rFonts w:asciiTheme="minorEastAsia" w:eastAsiaTheme="minorEastAsia" w:hAnsiTheme="minorEastAsia" w:cs="맑은 고딕"/>
                 <w:sz w:val="20"/>
                 <w:szCs w:val="20"/>
               </w:rPr>
@@ -468,7 +501,7 @@
             </w:r>
             <w:r>
               <w:rPr>
-                <w:rFonts w:ascii="맑은 고딕" w:eastAsia="맑은 고딕" w:cs="맑은 고딕" w:hint="eastAsia"/>
+                <w:rFonts w:asciiTheme="minorEastAsia" w:eastAsiaTheme="minorEastAsia" w:hAnsiTheme="minorEastAsia" w:cs="맑은 고딕" w:hint="eastAsia"/>
                 <w:sz w:val="20"/>
                 <w:szCs w:val="20"/>
               </w:rPr>
@@ -476,7 +509,7 @@
             </w:r>
             <w:r>
               <w:rPr>
-                <w:rFonts w:ascii="맑은 고딕" w:eastAsia="맑은 고딕" w:cs="맑은 고딕"/>
+                <w:rFonts w:asciiTheme="minorEastAsia" w:eastAsiaTheme="minorEastAsia" w:hAnsiTheme="minorEastAsia" w:cs="맑은 고딕"/>
                 <w:sz w:val="20"/>
                 <w:szCs w:val="20"/>
               </w:rPr>
@@ -495,6 +528,7 @@
           <w:p>
             <w:pPr>
               <w:rPr>
+                <w:rFonts w:asciiTheme="minorEastAsia" w:hAnsiTheme="minorEastAsia"/>
                 <w:sz w:val="2"/>
                 <w:szCs w:val="2"/>
               </w:rPr>
@@ -515,9 +549,13 @@
               <w:pStyle w:val="TableParagraph"/>
               <w:spacing w:line="248" w:lineRule="exact"/>
               <w:ind w:left="9"/>
-            </w:pPr>
-            <w:r>
-              <w:rPr>
+              <w:rPr>
+                <w:rFonts w:asciiTheme="minorEastAsia" w:eastAsiaTheme="minorEastAsia" w:hAnsiTheme="minorEastAsia"/>
+              </w:rPr>
+            </w:pPr>
+            <w:r>
+              <w:rPr>
+                <w:rFonts w:asciiTheme="minorEastAsia" w:eastAsiaTheme="minorEastAsia" w:hAnsiTheme="minorEastAsia"/>
                 <w:spacing w:val="-4"/>
               </w:rPr>
               <w:t>유통기한</w:t>
@@ -533,30 +571,32 @@
             <w:pPr>
               <w:pStyle w:val="TableParagraph"/>
               <w:rPr>
-                <w:rFonts w:ascii="Times New Roman"/>
+                <w:rFonts w:asciiTheme="minorEastAsia" w:eastAsiaTheme="minorEastAsia" w:hAnsiTheme="minorEastAsia"/>
                 <w:sz w:val="18"/>
               </w:rPr>
             </w:pPr>
             <w:r>
               <w:rPr>
-                <w:rFonts w:ascii="Times New Roman"/>
+                <w:rFonts w:asciiTheme="minorEastAsia" w:eastAsiaTheme="minorEastAsia" w:hAnsiTheme="minorEastAsia"/>
                 <w:sz w:val="18"/>
               </w:rPr>
               <w:t>{</w:t>
             </w:r>
             <w:r>
               <w:rPr>
-                <w:rFonts w:ascii="Times New Roman" w:hint="eastAsia"/>
+                <w:rFonts w:asciiTheme="minorEastAsia" w:eastAsiaTheme="minorEastAsia" w:hAnsiTheme="minorEastAsia" w:hint="eastAsia"/>
                 <w:sz w:val="18"/>
               </w:rPr>
-              <w:t>유통기한</w:t>
-            </w:r>
-            <w:r>
-              <w:rPr>
-                <w:rFonts w:ascii="Times New Roman" w:hint="eastAsia"/>
+              <w:t>유통</w:t>
+            </w:r>
+            <w:bookmarkStart w:id="0" w:name="_GoBack"/>
+            <w:bookmarkEnd w:id="0"/>
+            <w:r>
+              <w:rPr>
+                <w:rFonts w:asciiTheme="minorEastAsia" w:eastAsiaTheme="minorEastAsia" w:hAnsiTheme="minorEastAsia" w:hint="eastAsia"/>
                 <w:sz w:val="18"/>
               </w:rPr>
-              <w:t>}</w:t>
+              <w:t>기한}</w:t>
             </w:r>
           </w:p>
         </w:tc>
@@ -571,6 +611,7 @@
           <w:p>
             <w:pPr>
               <w:rPr>
+                <w:rFonts w:asciiTheme="minorEastAsia" w:hAnsiTheme="minorEastAsia"/>
                 <w:sz w:val="2"/>
                 <w:szCs w:val="2"/>
               </w:rPr>
@@ -591,22 +632,27 @@
               <w:pStyle w:val="TableParagraph"/>
               <w:spacing w:line="253" w:lineRule="exact"/>
               <w:ind w:left="9"/>
-            </w:pPr>
-            <w:r>
-              <w:rPr>
+              <w:rPr>
+                <w:rFonts w:asciiTheme="minorEastAsia" w:eastAsiaTheme="minorEastAsia" w:hAnsiTheme="minorEastAsia"/>
+              </w:rPr>
+            </w:pPr>
+            <w:r>
+              <w:rPr>
+                <w:rFonts w:asciiTheme="minorEastAsia" w:eastAsiaTheme="minorEastAsia" w:hAnsiTheme="minorEastAsia"/>
                 <w:spacing w:val="-2"/>
               </w:rPr>
               <w:t>수량</w:t>
             </w:r>
             <w:r>
               <w:rPr>
-                <w:rFonts w:ascii="Calibri" w:eastAsia="Calibri"/>
+                <w:rFonts w:asciiTheme="minorEastAsia" w:eastAsiaTheme="minorEastAsia" w:hAnsiTheme="minorEastAsia"/>
                 <w:spacing w:val="-2"/>
               </w:rPr>
               <w:t>/</w:t>
             </w:r>
             <w:r>
               <w:rPr>
+                <w:rFonts w:asciiTheme="minorEastAsia" w:eastAsiaTheme="minorEastAsia" w:hAnsiTheme="minorEastAsia"/>
                 <w:spacing w:val="-2"/>
               </w:rPr>
               <w:t>단위</w:t>
@@ -622,30 +668,16 @@
             <w:pPr>
               <w:pStyle w:val="TableParagraph"/>
               <w:rPr>
-                <w:rFonts w:ascii="Times New Roman"/>
-                <w:sz w:val="20"/>
-              </w:rPr>
-            </w:pPr>
-            <w:r>
-              <w:rPr>
-                <w:rFonts w:ascii="Times New Roman" w:hint="eastAsia"/>
-                <w:sz w:val="20"/>
-              </w:rPr>
-              <w:t>{</w:t>
-            </w:r>
-            <w:r>
-              <w:rPr>
-                <w:rFonts w:ascii="Times New Roman" w:hint="eastAsia"/>
-                <w:sz w:val="20"/>
-              </w:rPr>
-              <w:t>수량</w:t>
-            </w:r>
-            <w:r>
-              <w:rPr>
-                <w:rFonts w:ascii="Times New Roman" w:hint="eastAsia"/>
-                <w:sz w:val="20"/>
-              </w:rPr>
-              <w:t>}</w:t>
+                <w:rFonts w:asciiTheme="minorEastAsia" w:eastAsiaTheme="minorEastAsia" w:hAnsiTheme="minorEastAsia"/>
+                <w:sz w:val="20"/>
+              </w:rPr>
+            </w:pPr>
+            <w:r>
+              <w:rPr>
+                <w:rFonts w:asciiTheme="minorEastAsia" w:eastAsiaTheme="minorEastAsia" w:hAnsiTheme="minorEastAsia" w:hint="eastAsia"/>
+                <w:sz w:val="20"/>
+              </w:rPr>
+              <w:t>{수량}</w:t>
             </w:r>
           </w:p>
         </w:tc>
@@ -660,6 +692,7 @@
           <w:p>
             <w:pPr>
               <w:rPr>
+                <w:rFonts w:asciiTheme="minorEastAsia" w:hAnsiTheme="minorEastAsia"/>
                 <w:sz w:val="2"/>
                 <w:szCs w:val="2"/>
               </w:rPr>
@@ -680,9 +713,13 @@
               <w:pStyle w:val="TableParagraph"/>
               <w:spacing w:line="253" w:lineRule="exact"/>
               <w:ind w:left="9"/>
-            </w:pPr>
-            <w:r>
-              <w:rPr>
+              <w:rPr>
+                <w:rFonts w:asciiTheme="minorEastAsia" w:eastAsiaTheme="minorEastAsia" w:hAnsiTheme="minorEastAsia"/>
+              </w:rPr>
+            </w:pPr>
+            <w:r>
+              <w:rPr>
+                <w:rFonts w:asciiTheme="minorEastAsia" w:eastAsiaTheme="minorEastAsia" w:hAnsiTheme="minorEastAsia"/>
                 <w:spacing w:val="-4"/>
               </w:rPr>
               <w:t>시험번호</w:t>
@@ -698,37 +735,30 @@
             <w:pPr>
               <w:pStyle w:val="TableParagraph"/>
               <w:rPr>
-                <w:rFonts w:ascii="Times New Roman"/>
-                <w:sz w:val="20"/>
-              </w:rPr>
-            </w:pPr>
-            <w:r>
-              <w:rPr>
-                <w:rFonts w:ascii="Times New Roman" w:hint="eastAsia"/>
+                <w:rFonts w:asciiTheme="minorEastAsia" w:eastAsiaTheme="minorEastAsia" w:hAnsiTheme="minorEastAsia"/>
+                <w:sz w:val="20"/>
+              </w:rPr>
+            </w:pPr>
+            <w:r>
+              <w:rPr>
+                <w:rFonts w:asciiTheme="minorEastAsia" w:eastAsiaTheme="minorEastAsia" w:hAnsiTheme="minorEastAsia" w:hint="eastAsia"/>
                 <w:sz w:val="20"/>
               </w:rPr>
               <w:t>{</w:t>
             </w:r>
             <w:r>
               <w:rPr>
-                <w:rFonts w:ascii="Times New Roman"/>
+                <w:rFonts w:asciiTheme="minorEastAsia" w:eastAsiaTheme="minorEastAsia" w:hAnsiTheme="minorEastAsia"/>
                 <w:sz w:val="20"/>
               </w:rPr>
               <w:t>LOT</w:t>
             </w:r>
             <w:r>
               <w:rPr>
-                <w:rFonts w:ascii="Times New Roman" w:hint="eastAsia"/>
-                <w:sz w:val="20"/>
-              </w:rPr>
-              <w:t>번호</w:t>
-            </w:r>
-            <w:r>
-              <w:rPr>
-                <w:rFonts w:ascii="Times New Roman" w:hint="eastAsia"/>
-                <w:sz w:val="20"/>
-              </w:rPr>
-              <w:t>}</w:t>
+                <w:rFonts w:asciiTheme="minorEastAsia" w:eastAsiaTheme="minorEastAsia" w:hAnsiTheme="minorEastAsia" w:hint="eastAsia"/>
+                <w:sz w:val="20"/>
+              </w:rPr>
+              <w:t>번호}</w:t>
             </w:r>
           </w:p>
         </w:tc>
@@ -742,36 +772,52 @@
               <w:spacing w:line="253" w:lineRule="exact"/>
               <w:ind w:left="838"/>
               <w:jc w:val="left"/>
-            </w:pPr>
-            <w:r>
+              <w:rPr>
+                <w:rFonts w:asciiTheme="minorEastAsia" w:eastAsiaTheme="minorEastAsia" w:hAnsiTheme="minorEastAsia"/>
+              </w:rPr>
+            </w:pPr>
+            <w:r>
+              <w:rPr>
+                <w:rFonts w:asciiTheme="minorEastAsia" w:eastAsiaTheme="minorEastAsia" w:hAnsiTheme="minorEastAsia"/>
+              </w:rPr>
               <w:t>조</w:t>
             </w:r>
             <w:r>
               <w:rPr>
+                <w:rFonts w:asciiTheme="minorEastAsia" w:eastAsiaTheme="minorEastAsia" w:hAnsiTheme="minorEastAsia"/>
                 <w:spacing w:val="36"/>
               </w:rPr>
               <w:t xml:space="preserve"> </w:t>
             </w:r>
             <w:r>
+              <w:rPr>
+                <w:rFonts w:asciiTheme="minorEastAsia" w:eastAsiaTheme="minorEastAsia" w:hAnsiTheme="minorEastAsia"/>
+              </w:rPr>
               <w:t>치</w:t>
             </w:r>
             <w:r>
               <w:rPr>
+                <w:rFonts w:asciiTheme="minorEastAsia" w:eastAsiaTheme="minorEastAsia" w:hAnsiTheme="minorEastAsia"/>
                 <w:spacing w:val="32"/>
               </w:rPr>
               <w:t xml:space="preserve"> </w:t>
             </w:r>
             <w:r>
+              <w:rPr>
+                <w:rFonts w:asciiTheme="minorEastAsia" w:eastAsiaTheme="minorEastAsia" w:hAnsiTheme="minorEastAsia"/>
+              </w:rPr>
               <w:t>사</w:t>
             </w:r>
             <w:r>
               <w:rPr>
+                <w:rFonts w:asciiTheme="minorEastAsia" w:eastAsiaTheme="minorEastAsia" w:hAnsiTheme="minorEastAsia"/>
                 <w:spacing w:val="36"/>
               </w:rPr>
               <w:t xml:space="preserve"> </w:t>
             </w:r>
             <w:r>
               <w:rPr>
+                <w:rFonts w:asciiTheme="minorEastAsia" w:eastAsiaTheme="minorEastAsia" w:hAnsiTheme="minorEastAsia"/>
                 <w:spacing w:val="-10"/>
               </w:rPr>
               <w:t>항</w:t>
@@ -792,18 +838,26 @@
               <w:pStyle w:val="TableParagraph"/>
               <w:spacing w:line="248" w:lineRule="exact"/>
               <w:ind w:left="13"/>
-            </w:pPr>
-            <w:r>
+              <w:rPr>
+                <w:rFonts w:asciiTheme="minorEastAsia" w:eastAsiaTheme="minorEastAsia" w:hAnsiTheme="minorEastAsia"/>
+              </w:rPr>
+            </w:pPr>
+            <w:r>
+              <w:rPr>
+                <w:rFonts w:asciiTheme="minorEastAsia" w:eastAsiaTheme="minorEastAsia" w:hAnsiTheme="minorEastAsia"/>
+              </w:rPr>
               <w:t>시험</w:t>
             </w:r>
             <w:r>
               <w:rPr>
+                <w:rFonts w:asciiTheme="minorEastAsia" w:eastAsiaTheme="minorEastAsia" w:hAnsiTheme="minorEastAsia"/>
                 <w:spacing w:val="31"/>
               </w:rPr>
               <w:t xml:space="preserve"> </w:t>
             </w:r>
             <w:r>
               <w:rPr>
+                <w:rFonts w:asciiTheme="minorEastAsia" w:eastAsiaTheme="minorEastAsia" w:hAnsiTheme="minorEastAsia"/>
                 <w:spacing w:val="-5"/>
               </w:rPr>
               <w:t>의뢰일</w:t>
@@ -819,30 +873,16 @@
             <w:pPr>
               <w:pStyle w:val="TableParagraph"/>
               <w:rPr>
-                <w:rFonts w:ascii="Times New Roman"/>
+                <w:rFonts w:asciiTheme="minorEastAsia" w:eastAsiaTheme="minorEastAsia" w:hAnsiTheme="minorEastAsia"/>
                 <w:sz w:val="18"/>
               </w:rPr>
             </w:pPr>
             <w:r>
               <w:rPr>
-                <w:rFonts w:ascii="Times New Roman" w:hint="eastAsia"/>
-                <w:sz w:val="20"/>
-              </w:rPr>
-              <w:t>{</w:t>
-            </w:r>
-            <w:r>
-              <w:rPr>
-                <w:rFonts w:ascii="Times New Roman" w:hint="eastAsia"/>
-                <w:sz w:val="20"/>
-              </w:rPr>
-              <w:t>오늘날짜</w:t>
-            </w:r>
-            <w:r>
-              <w:rPr>
-                <w:rFonts w:ascii="Times New Roman" w:hint="eastAsia"/>
-                <w:sz w:val="20"/>
-              </w:rPr>
-              <w:t>}</w:t>
+                <w:rFonts w:asciiTheme="minorEastAsia" w:eastAsiaTheme="minorEastAsia" w:hAnsiTheme="minorEastAsia" w:hint="eastAsia"/>
+                <w:sz w:val="20"/>
+              </w:rPr>
+              <w:t>{오늘날짜}</w:t>
             </w:r>
           </w:p>
         </w:tc>
@@ -856,7 +896,7 @@
               <w:pStyle w:val="TableParagraph"/>
               <w:jc w:val="left"/>
               <w:rPr>
-                <w:rFonts w:ascii="Times New Roman"/>
+                <w:rFonts w:asciiTheme="minorEastAsia" w:eastAsiaTheme="minorEastAsia" w:hAnsiTheme="minorEastAsia"/>
                 <w:sz w:val="24"/>
               </w:rPr>
             </w:pPr>
@@ -876,10 +916,14 @@
               <w:pStyle w:val="TableParagraph"/>
               <w:spacing w:line="253" w:lineRule="exact"/>
               <w:ind w:left="9"/>
+              <w:rPr>
+                <w:rFonts w:asciiTheme="minorEastAsia" w:eastAsiaTheme="minorEastAsia" w:hAnsiTheme="minorEastAsia"/>
+              </w:rPr>
             </w:pPr>
             <w:proofErr w:type="spellStart"/>
             <w:r>
               <w:rPr>
+                <w:rFonts w:asciiTheme="minorEastAsia" w:eastAsiaTheme="minorEastAsia" w:hAnsiTheme="minorEastAsia"/>
                 <w:spacing w:val="-2"/>
               </w:rPr>
               <w:t>검체채취일</w:t>
@@ -895,30 +939,16 @@
             <w:pPr>
               <w:pStyle w:val="TableParagraph"/>
               <w:rPr>
-                <w:rFonts w:ascii="Times New Roman"/>
-                <w:sz w:val="20"/>
-              </w:rPr>
-            </w:pPr>
-            <w:r>
-              <w:rPr>
-                <w:rFonts w:ascii="Times New Roman" w:hint="eastAsia"/>
-                <w:sz w:val="20"/>
-              </w:rPr>
-              <w:t>{</w:t>
-            </w:r>
-            <w:r>
-              <w:rPr>
-                <w:rFonts w:ascii="Times New Roman" w:hint="eastAsia"/>
-                <w:sz w:val="20"/>
-              </w:rPr>
-              <w:t>오늘날짜</w:t>
-            </w:r>
-            <w:r>
-              <w:rPr>
-                <w:rFonts w:ascii="Times New Roman" w:hint="eastAsia"/>
-                <w:sz w:val="20"/>
-              </w:rPr>
-              <w:t>}</w:t>
+                <w:rFonts w:asciiTheme="minorEastAsia" w:eastAsiaTheme="minorEastAsia" w:hAnsiTheme="minorEastAsia"/>
+                <w:sz w:val="20"/>
+              </w:rPr>
+            </w:pPr>
+            <w:r>
+              <w:rPr>
+                <w:rFonts w:asciiTheme="minorEastAsia" w:eastAsiaTheme="minorEastAsia" w:hAnsiTheme="minorEastAsia" w:hint="eastAsia"/>
+                <w:sz w:val="20"/>
+              </w:rPr>
+              <w:t>{오늘날짜}</w:t>
             </w:r>
           </w:p>
         </w:tc>
@@ -931,27 +961,39 @@
               <w:pStyle w:val="TableParagraph"/>
               <w:spacing w:line="253" w:lineRule="exact"/>
               <w:ind w:left="7"/>
-            </w:pPr>
-            <w:r>
+              <w:rPr>
+                <w:rFonts w:asciiTheme="minorEastAsia" w:eastAsiaTheme="minorEastAsia" w:hAnsiTheme="minorEastAsia"/>
+              </w:rPr>
+            </w:pPr>
+            <w:r>
+              <w:rPr>
+                <w:rFonts w:asciiTheme="minorEastAsia" w:eastAsiaTheme="minorEastAsia" w:hAnsiTheme="minorEastAsia"/>
+              </w:rPr>
               <w:t>판</w:t>
             </w:r>
             <w:r>
               <w:rPr>
+                <w:rFonts w:asciiTheme="minorEastAsia" w:eastAsiaTheme="minorEastAsia" w:hAnsiTheme="minorEastAsia"/>
                 <w:spacing w:val="36"/>
               </w:rPr>
               <w:t xml:space="preserve"> </w:t>
             </w:r>
             <w:r>
+              <w:rPr>
+                <w:rFonts w:asciiTheme="minorEastAsia" w:eastAsiaTheme="minorEastAsia" w:hAnsiTheme="minorEastAsia"/>
+              </w:rPr>
               <w:t>정</w:t>
             </w:r>
             <w:r>
               <w:rPr>
+                <w:rFonts w:asciiTheme="minorEastAsia" w:eastAsiaTheme="minorEastAsia" w:hAnsiTheme="minorEastAsia"/>
                 <w:spacing w:val="32"/>
               </w:rPr>
               <w:t xml:space="preserve"> </w:t>
             </w:r>
             <w:r>
               <w:rPr>
+                <w:rFonts w:asciiTheme="minorEastAsia" w:eastAsiaTheme="minorEastAsia" w:hAnsiTheme="minorEastAsia"/>
                 <w:spacing w:val="-10"/>
               </w:rPr>
               <w:t>일</w:t>
@@ -966,30 +1008,16 @@
             <w:pPr>
               <w:pStyle w:val="TableParagraph"/>
               <w:rPr>
-                <w:rFonts w:ascii="Times New Roman"/>
-                <w:sz w:val="20"/>
-              </w:rPr>
-            </w:pPr>
-            <w:r>
-              <w:rPr>
-                <w:rFonts w:ascii="Times New Roman" w:hint="eastAsia"/>
-                <w:sz w:val="20"/>
-              </w:rPr>
-              <w:t>{</w:t>
-            </w:r>
-            <w:r>
-              <w:rPr>
-                <w:rFonts w:ascii="Times New Roman" w:hint="eastAsia"/>
-                <w:sz w:val="20"/>
-              </w:rPr>
-              <w:t>오늘날짜</w:t>
-            </w:r>
-            <w:r>
-              <w:rPr>
-                <w:rFonts w:ascii="Times New Roman" w:hint="eastAsia"/>
-                <w:sz w:val="20"/>
-              </w:rPr>
-              <w:t>}</w:t>
+                <w:rFonts w:asciiTheme="minorEastAsia" w:eastAsiaTheme="minorEastAsia" w:hAnsiTheme="minorEastAsia"/>
+                <w:sz w:val="20"/>
+              </w:rPr>
+            </w:pPr>
+            <w:r>
+              <w:rPr>
+                <w:rFonts w:asciiTheme="minorEastAsia" w:eastAsiaTheme="minorEastAsia" w:hAnsiTheme="minorEastAsia" w:hint="eastAsia"/>
+                <w:sz w:val="20"/>
+              </w:rPr>
+              <w:t>{오늘날짜}</w:t>
             </w:r>
           </w:p>
         </w:tc>
@@ -1004,6 +1032,7 @@
           <w:p>
             <w:pPr>
               <w:rPr>
+                <w:rFonts w:asciiTheme="minorEastAsia" w:hAnsiTheme="minorEastAsia"/>
                 <w:sz w:val="2"/>
                 <w:szCs w:val="2"/>
               </w:rPr>
@@ -1024,10 +1053,14 @@
               <w:pStyle w:val="TableParagraph"/>
               <w:spacing w:line="248" w:lineRule="exact"/>
               <w:ind w:left="9"/>
+              <w:rPr>
+                <w:rFonts w:asciiTheme="minorEastAsia" w:eastAsiaTheme="minorEastAsia" w:hAnsiTheme="minorEastAsia"/>
+              </w:rPr>
             </w:pPr>
             <w:proofErr w:type="spellStart"/>
             <w:r>
               <w:rPr>
+                <w:rFonts w:asciiTheme="minorEastAsia" w:eastAsiaTheme="minorEastAsia" w:hAnsiTheme="minorEastAsia"/>
                 <w:spacing w:val="-2"/>
               </w:rPr>
               <w:t>검체채취자</w:t>
@@ -1043,13 +1076,13 @@
             <w:pPr>
               <w:pStyle w:val="TableParagraph"/>
               <w:rPr>
-                <w:rFonts w:ascii="Times New Roman"/>
+                <w:rFonts w:asciiTheme="minorEastAsia" w:eastAsiaTheme="minorEastAsia" w:hAnsiTheme="minorEastAsia"/>
                 <w:sz w:val="18"/>
               </w:rPr>
             </w:pPr>
             <w:r>
               <w:rPr>
-                <w:rFonts w:ascii="Times New Roman" w:hint="eastAsia"/>
+                <w:rFonts w:asciiTheme="minorEastAsia" w:eastAsiaTheme="minorEastAsia" w:hAnsiTheme="minorEastAsia" w:hint="eastAsia"/>
                 <w:sz w:val="18"/>
               </w:rPr>
               <w:t>이상은</w:t>
@@ -1065,27 +1098,39 @@
               <w:pStyle w:val="TableParagraph"/>
               <w:spacing w:line="248" w:lineRule="exact"/>
               <w:ind w:left="7"/>
-            </w:pPr>
-            <w:r>
+              <w:rPr>
+                <w:rFonts w:asciiTheme="minorEastAsia" w:eastAsiaTheme="minorEastAsia" w:hAnsiTheme="minorEastAsia"/>
+              </w:rPr>
+            </w:pPr>
+            <w:r>
+              <w:rPr>
+                <w:rFonts w:asciiTheme="minorEastAsia" w:eastAsiaTheme="minorEastAsia" w:hAnsiTheme="minorEastAsia"/>
+              </w:rPr>
               <w:t>확</w:t>
             </w:r>
             <w:r>
               <w:rPr>
+                <w:rFonts w:asciiTheme="minorEastAsia" w:eastAsiaTheme="minorEastAsia" w:hAnsiTheme="minorEastAsia"/>
                 <w:spacing w:val="36"/>
               </w:rPr>
               <w:t xml:space="preserve"> </w:t>
             </w:r>
             <w:r>
+              <w:rPr>
+                <w:rFonts w:asciiTheme="minorEastAsia" w:eastAsiaTheme="minorEastAsia" w:hAnsiTheme="minorEastAsia"/>
+              </w:rPr>
               <w:t>인</w:t>
             </w:r>
             <w:r>
               <w:rPr>
+                <w:rFonts w:asciiTheme="minorEastAsia" w:eastAsiaTheme="minorEastAsia" w:hAnsiTheme="minorEastAsia"/>
                 <w:spacing w:val="32"/>
               </w:rPr>
               <w:t xml:space="preserve"> </w:t>
             </w:r>
             <w:r>
               <w:rPr>
+                <w:rFonts w:asciiTheme="minorEastAsia" w:eastAsiaTheme="minorEastAsia" w:hAnsiTheme="minorEastAsia"/>
                 <w:spacing w:val="-10"/>
               </w:rPr>
               <w:t>자</w:t>
@@ -1100,7 +1145,7 @@
             <w:pPr>
               <w:pStyle w:val="TableParagraph"/>
               <w:rPr>
-                <w:rFonts w:ascii="Times New Roman"/>
+                <w:rFonts w:asciiTheme="minorEastAsia" w:eastAsiaTheme="minorEastAsia" w:hAnsiTheme="minorEastAsia"/>
                 <w:sz w:val="18"/>
               </w:rPr>
             </w:pPr>
@@ -1117,6 +1162,7 @@
           <w:p>
             <w:pPr>
               <w:rPr>
+                <w:rFonts w:asciiTheme="minorEastAsia" w:hAnsiTheme="minorEastAsia"/>
                 <w:sz w:val="2"/>
                 <w:szCs w:val="2"/>
               </w:rPr>
@@ -1127,9 +1173,8 @@
     </w:tbl>
     <w:p>
       <w:pPr>
-        <w:spacing w:before="0"/>
         <w:rPr>
-          <w:rFonts w:ascii="Times New Roman"/>
+          <w:rFonts w:asciiTheme="minorEastAsia" w:hAnsiTheme="minorEastAsia"/>
           <w:sz w:val="20"/>
         </w:rPr>
       </w:pPr>
@@ -1159,7 +1204,7 @@
       </w:tblGrid>
       <w:tr>
         <w:trPr>
-          <w:trHeight w:val="690"/>
+          <w:trHeight w:val="252"/>
         </w:trPr>
         <w:tc>
           <w:tcPr>
@@ -1169,14 +1214,16 @@
           <w:p>
             <w:pPr>
               <w:pStyle w:val="TableParagraph"/>
-              <w:spacing w:before="0" w:line="502" w:lineRule="exact"/>
+              <w:spacing w:line="502" w:lineRule="exact"/>
               <w:ind w:left="3"/>
               <w:rPr>
+                <w:rFonts w:asciiTheme="minorEastAsia" w:eastAsiaTheme="minorEastAsia" w:hAnsiTheme="minorEastAsia"/>
                 <w:sz w:val="40"/>
               </w:rPr>
             </w:pPr>
             <w:r>
               <w:rPr>
+                <w:rFonts w:asciiTheme="minorEastAsia" w:eastAsiaTheme="minorEastAsia" w:hAnsiTheme="minorEastAsia"/>
                 <w:spacing w:val="-2"/>
                 <w:sz w:val="40"/>
               </w:rPr>
@@ -1191,12 +1238,15 @@
           <w:p>
             <w:pPr>
               <w:pStyle w:val="TableParagraph"/>
-              <w:spacing w:before="0"/>
               <w:ind w:left="11"/>
+              <w:rPr>
+                <w:rFonts w:asciiTheme="minorEastAsia" w:eastAsiaTheme="minorEastAsia" w:hAnsiTheme="minorEastAsia"/>
+              </w:rPr>
             </w:pPr>
             <w:proofErr w:type="spellStart"/>
             <w:r>
               <w:rPr>
+                <w:rFonts w:asciiTheme="minorEastAsia" w:eastAsiaTheme="minorEastAsia" w:hAnsiTheme="minorEastAsia"/>
                 <w:spacing w:val="-2"/>
               </w:rPr>
               <w:t>시험중</w:t>
@@ -1204,43 +1254,47 @@
             <w:proofErr w:type="spellEnd"/>
             <w:r>
               <w:rPr>
-                <w:rFonts w:ascii="Calibri" w:eastAsia="Calibri"/>
+                <w:rFonts w:asciiTheme="minorEastAsia" w:eastAsiaTheme="minorEastAsia" w:hAnsiTheme="minorEastAsia"/>
                 <w:spacing w:val="-2"/>
               </w:rPr>
               <w:t>/</w:t>
             </w:r>
             <w:r>
               <w:rPr>
+                <w:rFonts w:asciiTheme="minorEastAsia" w:eastAsiaTheme="minorEastAsia" w:hAnsiTheme="minorEastAsia"/>
                 <w:spacing w:val="-2"/>
               </w:rPr>
               <w:t>적합</w:t>
             </w:r>
             <w:r>
               <w:rPr>
-                <w:rFonts w:ascii="Calibri" w:eastAsia="Calibri"/>
+                <w:rFonts w:asciiTheme="minorEastAsia" w:eastAsiaTheme="minorEastAsia" w:hAnsiTheme="minorEastAsia"/>
                 <w:spacing w:val="-2"/>
               </w:rPr>
               <w:t>/</w:t>
             </w:r>
             <w:r>
               <w:rPr>
+                <w:rFonts w:asciiTheme="minorEastAsia" w:eastAsiaTheme="minorEastAsia" w:hAnsiTheme="minorEastAsia"/>
                 <w:spacing w:val="-2"/>
               </w:rPr>
               <w:t>부적합</w:t>
             </w:r>
-          </w:p>
-          <w:p>
-            <w:pPr>
-              <w:pStyle w:val="TableParagraph"/>
-              <w:spacing w:before="0" w:line="271" w:lineRule="exact"/>
-              <w:ind w:left="11" w:right="4"/>
-            </w:pPr>
-            <w:r>
-              <w:rPr>
+            <w:r>
+              <w:rPr>
+                <w:rFonts w:asciiTheme="minorEastAsia" w:eastAsiaTheme="minorEastAsia" w:hAnsiTheme="minorEastAsia" w:hint="eastAsia"/>
+              </w:rPr>
+              <w:t xml:space="preserve"> </w:t>
+            </w:r>
+            <w:proofErr w:type="spellStart"/>
+            <w:r>
+              <w:rPr>
+                <w:rFonts w:asciiTheme="minorEastAsia" w:eastAsiaTheme="minorEastAsia" w:hAnsiTheme="minorEastAsia"/>
                 <w:spacing w:val="-5"/>
               </w:rPr>
               <w:t>표시서</w:t>
             </w:r>
+            <w:proofErr w:type="spellEnd"/>
           </w:p>
         </w:tc>
       </w:tr>
@@ -1258,20 +1312,27 @@
               <w:tabs>
                 <w:tab w:val="left" w:pos="665"/>
               </w:tabs>
-              <w:spacing w:before="0"/>
               <w:ind w:left="8"/>
-            </w:pPr>
-            <w:r>
-              <w:rPr>
+              <w:rPr>
+                <w:rFonts w:asciiTheme="minorEastAsia" w:eastAsiaTheme="minorEastAsia" w:hAnsiTheme="minorEastAsia"/>
+              </w:rPr>
+            </w:pPr>
+            <w:r>
+              <w:rPr>
+                <w:rFonts w:asciiTheme="minorEastAsia" w:eastAsiaTheme="minorEastAsia" w:hAnsiTheme="minorEastAsia"/>
                 <w:spacing w:val="-10"/>
               </w:rPr>
               <w:t>구</w:t>
             </w:r>
             <w:r>
+              <w:rPr>
+                <w:rFonts w:asciiTheme="minorEastAsia" w:eastAsiaTheme="minorEastAsia" w:hAnsiTheme="minorEastAsia"/>
+              </w:rPr>
               <w:tab/>
             </w:r>
             <w:r>
               <w:rPr>
+                <w:rFonts w:asciiTheme="minorEastAsia" w:eastAsiaTheme="minorEastAsia" w:hAnsiTheme="minorEastAsia"/>
                 <w:spacing w:val="-10"/>
               </w:rPr>
               <w:t>분</w:t>
@@ -1296,15 +1357,16 @@
                 <w:tab w:val="left" w:pos="2542"/>
                 <w:tab w:val="left" w:pos="3857"/>
               </w:tabs>
-              <w:spacing w:before="0"/>
               <w:ind w:hanging="292"/>
               <w:jc w:val="left"/>
               <w:rPr>
-                <w:sz w:val="24"/>
-              </w:rPr>
-            </w:pPr>
-            <w:r>
-              <w:rPr>
+                <w:rFonts w:asciiTheme="minorEastAsia" w:eastAsiaTheme="minorEastAsia" w:hAnsiTheme="minorEastAsia"/>
+                <w:sz w:val="24"/>
+              </w:rPr>
+            </w:pPr>
+            <w:r>
+              <w:rPr>
+                <w:rFonts w:asciiTheme="minorEastAsia" w:eastAsiaTheme="minorEastAsia" w:hAnsiTheme="minorEastAsia"/>
                 <w:spacing w:val="-5"/>
                 <w:w w:val="105"/>
                 <w:sz w:val="24"/>
@@ -1313,13 +1375,14 @@
             </w:r>
             <w:r>
               <w:rPr>
+                <w:rFonts w:asciiTheme="minorEastAsia" w:eastAsiaTheme="minorEastAsia" w:hAnsiTheme="minorEastAsia"/>
                 <w:sz w:val="24"/>
               </w:rPr>
               <w:tab/>
             </w:r>
             <w:r>
               <w:rPr>
-                <w:rFonts w:ascii="Meiryo UI" w:eastAsia="Meiryo UI" w:hAnsi="Meiryo UI"/>
+                <w:rFonts w:ascii="Segoe UI Symbol" w:eastAsiaTheme="minorEastAsia" w:hAnsi="Segoe UI Symbol" w:cs="Segoe UI Symbol"/>
                 <w:w w:val="105"/>
                 <w:sz w:val="24"/>
               </w:rPr>
@@ -1327,7 +1390,7 @@
             </w:r>
             <w:r>
               <w:rPr>
-                <w:rFonts w:ascii="Meiryo UI" w:eastAsia="Meiryo UI" w:hAnsi="Meiryo UI"/>
+                <w:rFonts w:asciiTheme="minorEastAsia" w:eastAsiaTheme="minorEastAsia" w:hAnsiTheme="minorEastAsia"/>
                 <w:spacing w:val="46"/>
                 <w:w w:val="105"/>
                 <w:sz w:val="24"/>
@@ -1336,6 +1399,7 @@
             </w:r>
             <w:r>
               <w:rPr>
+                <w:rFonts w:asciiTheme="minorEastAsia" w:eastAsiaTheme="minorEastAsia" w:hAnsiTheme="minorEastAsia"/>
                 <w:spacing w:val="-5"/>
                 <w:w w:val="105"/>
                 <w:sz w:val="24"/>
@@ -1344,13 +1408,14 @@
             </w:r>
             <w:r>
               <w:rPr>
+                <w:rFonts w:asciiTheme="minorEastAsia" w:eastAsiaTheme="minorEastAsia" w:hAnsiTheme="minorEastAsia"/>
                 <w:sz w:val="24"/>
               </w:rPr>
               <w:tab/>
             </w:r>
             <w:r>
               <w:rPr>
-                <w:rFonts w:ascii="Meiryo UI" w:eastAsia="Meiryo UI" w:hAnsi="Meiryo UI"/>
+                <w:rFonts w:ascii="Segoe UI Symbol" w:eastAsiaTheme="minorEastAsia" w:hAnsi="Segoe UI Symbol" w:cs="Segoe UI Symbol"/>
                 <w:w w:val="105"/>
                 <w:sz w:val="24"/>
               </w:rPr>
@@ -1358,7 +1423,7 @@
             </w:r>
             <w:r>
               <w:rPr>
-                <w:rFonts w:ascii="Meiryo UI" w:eastAsia="Meiryo UI" w:hAnsi="Meiryo UI"/>
+                <w:rFonts w:asciiTheme="minorEastAsia" w:eastAsiaTheme="minorEastAsia" w:hAnsiTheme="minorEastAsia"/>
                 <w:spacing w:val="50"/>
                 <w:w w:val="105"/>
                 <w:sz w:val="24"/>
@@ -1367,6 +1432,7 @@
             </w:r>
             <w:r>
               <w:rPr>
+                <w:rFonts w:asciiTheme="minorEastAsia" w:eastAsiaTheme="minorEastAsia" w:hAnsiTheme="minorEastAsia"/>
                 <w:spacing w:val="-5"/>
                 <w:w w:val="105"/>
                 <w:sz w:val="24"/>
@@ -1375,13 +1441,14 @@
             </w:r>
             <w:r>
               <w:rPr>
+                <w:rFonts w:asciiTheme="minorEastAsia" w:eastAsiaTheme="minorEastAsia" w:hAnsiTheme="minorEastAsia"/>
                 <w:sz w:val="24"/>
               </w:rPr>
               <w:tab/>
             </w:r>
             <w:r>
               <w:rPr>
-                <w:rFonts w:ascii="Meiryo UI" w:eastAsia="Meiryo UI" w:hAnsi="Meiryo UI"/>
+                <w:rFonts w:ascii="Segoe UI Symbol" w:eastAsiaTheme="minorEastAsia" w:hAnsi="Segoe UI Symbol" w:cs="Segoe UI Symbol"/>
                 <w:w w:val="105"/>
                 <w:sz w:val="24"/>
               </w:rPr>
@@ -1389,7 +1456,7 @@
             </w:r>
             <w:r>
               <w:rPr>
-                <w:rFonts w:ascii="Meiryo UI" w:eastAsia="Meiryo UI" w:hAnsi="Meiryo UI"/>
+                <w:rFonts w:asciiTheme="minorEastAsia" w:eastAsiaTheme="minorEastAsia" w:hAnsiTheme="minorEastAsia"/>
                 <w:spacing w:val="46"/>
                 <w:w w:val="105"/>
                 <w:sz w:val="24"/>
@@ -1398,6 +1465,7 @@
             </w:r>
             <w:r>
               <w:rPr>
+                <w:rFonts w:asciiTheme="minorEastAsia" w:eastAsiaTheme="minorEastAsia" w:hAnsiTheme="minorEastAsia"/>
                 <w:spacing w:val="-5"/>
                 <w:w w:val="105"/>
                 <w:sz w:val="24"/>
@@ -1414,10 +1482,9 @@
           <w:p>
             <w:pPr>
               <w:pStyle w:val="TableParagraph"/>
-              <w:spacing w:before="0"/>
               <w:jc w:val="left"/>
               <w:rPr>
-                <w:rFonts w:ascii="Times New Roman"/>
+                <w:rFonts w:asciiTheme="minorEastAsia" w:eastAsiaTheme="minorEastAsia" w:hAnsiTheme="minorEastAsia"/>
                 <w:sz w:val="30"/>
               </w:rPr>
             </w:pPr>
@@ -1427,18 +1494,20 @@
               <w:pStyle w:val="TableParagraph"/>
               <w:ind w:left="11" w:right="4"/>
               <w:rPr>
+                <w:rFonts w:asciiTheme="minorEastAsia" w:eastAsiaTheme="minorEastAsia" w:hAnsiTheme="minorEastAsia"/>
                 <w:sz w:val="30"/>
               </w:rPr>
             </w:pPr>
             <w:r>
               <w:rPr>
+                <w:rFonts w:asciiTheme="minorEastAsia" w:eastAsiaTheme="minorEastAsia" w:hAnsiTheme="minorEastAsia"/>
                 <w:noProof/>
                 <w:sz w:val="30"/>
               </w:rPr>
               <mc:AlternateContent>
                 <mc:Choice Requires="wpg">
                   <w:drawing>
-                    <wp:anchor distT="0" distB="0" distL="0" distR="0" simplePos="0" relativeHeight="487403008" behindDoc="1" locked="0" layoutInCell="1" allowOverlap="1" wp14:anchorId="400129E4" wp14:editId="07B0E480">
+                    <wp:anchor distT="0" distB="0" distL="0" distR="0" simplePos="0" relativeHeight="251656704" behindDoc="1" locked="0" layoutInCell="1" allowOverlap="1" wp14:anchorId="400129E4" wp14:editId="07B0E480">
                       <wp:simplePos x="0" y="0"/>
                       <wp:positionH relativeFrom="column">
                         <wp:posOffset>540994</wp:posOffset>
@@ -1473,7 +1542,7 @@
                                 <pic:cNvPicPr/>
                               </pic:nvPicPr>
                               <pic:blipFill>
-                                <a:blip r:embed="rId7" cstate="print"/>
+                                <a:blip r:embed="rId8" cstate="print"/>
                                 <a:stretch>
                                   <a:fillRect/>
                                 </a:stretch>
@@ -1496,9 +1565,9 @@
                 </mc:Choice>
                 <mc:Fallback>
                   <w:pict>
-                    <v:group w14:anchorId="2FB4AC84" id="Group 3" o:spid="_x0000_s1026" style="position:absolute;margin-left:42.6pt;margin-top:-19.2pt;width:59.3pt;height:58.35pt;z-index:-15913472;mso-wrap-distance-left:0;mso-wrap-distance-right:0" coordsize="7531,7410" o:gfxdata="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">
-                      <v:shape id="Image 4" o:spid="_x0000_s1027" type="#_x0000_t75" style="position:absolute;width:7503;height:7381;visibility:visible;mso-wrap-style:square" o:gfxdata="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">
-                        <v:imagedata r:id="rId8" o:title=""/>
+                    <v:group w14:anchorId="35895755" id="Group 3" o:spid="_x0000_s1026" style="position:absolute;left:0;text-align:left;margin-left:42.6pt;margin-top:-19.2pt;width:59.3pt;height:58.35pt;z-index:-251659776;mso-wrap-distance-left:0;mso-wrap-distance-right:0" coordsize="7531,7410" o:gfxdata="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">
+                      <v:shape id="Image 4" o:spid="_x0000_s1027" type="#_x0000_t75" style="position:absolute;width:7503;height:7381;visibility:visible;mso-wrap-style:square" o:gfxdata="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">
+                        <v:imagedata r:id="rId9" o:title=""/>
                       </v:shape>
                     </v:group>
                   </w:pict>
@@ -1507,6 +1576,7 @@
             </w:r>
             <w:r>
               <w:rPr>
+                <w:rFonts w:asciiTheme="minorEastAsia" w:eastAsiaTheme="minorEastAsia" w:hAnsiTheme="minorEastAsia"/>
                 <w:spacing w:val="-5"/>
                 <w:sz w:val="30"/>
               </w:rPr>
@@ -1531,18 +1601,26 @@
               </w:tabs>
               <w:spacing w:line="253" w:lineRule="exact"/>
               <w:ind w:left="119"/>
-            </w:pPr>
-            <w:r>
-              <w:rPr>
+              <w:rPr>
+                <w:rFonts w:asciiTheme="minorEastAsia" w:eastAsiaTheme="minorEastAsia" w:hAnsiTheme="minorEastAsia"/>
+              </w:rPr>
+            </w:pPr>
+            <w:r>
+              <w:rPr>
+                <w:rFonts w:asciiTheme="minorEastAsia" w:eastAsiaTheme="minorEastAsia" w:hAnsiTheme="minorEastAsia"/>
                 <w:spacing w:val="-10"/>
               </w:rPr>
               <w:t>품</w:t>
             </w:r>
             <w:r>
+              <w:rPr>
+                <w:rFonts w:asciiTheme="minorEastAsia" w:eastAsiaTheme="minorEastAsia" w:hAnsiTheme="minorEastAsia"/>
+              </w:rPr>
               <w:tab/>
             </w:r>
             <w:r>
               <w:rPr>
+                <w:rFonts w:asciiTheme="minorEastAsia" w:eastAsiaTheme="minorEastAsia" w:hAnsiTheme="minorEastAsia"/>
                 <w:spacing w:val="-10"/>
               </w:rPr>
               <w:t>명</w:t>
@@ -1558,13 +1636,13 @@
             <w:pPr>
               <w:pStyle w:val="TableParagraph"/>
               <w:rPr>
-                <w:rFonts w:ascii="Times New Roman"/>
-                <w:sz w:val="20"/>
-              </w:rPr>
-            </w:pPr>
-            <w:r>
-              <w:rPr>
-                <w:rFonts w:ascii="맑은 고딕" w:eastAsia="맑은 고딕" w:cs="맑은 고딕"/>
+                <w:rFonts w:asciiTheme="minorEastAsia" w:eastAsiaTheme="minorEastAsia" w:hAnsiTheme="minorEastAsia"/>
+                <w:sz w:val="20"/>
+              </w:rPr>
+            </w:pPr>
+            <w:r>
+              <w:rPr>
+                <w:rFonts w:asciiTheme="minorEastAsia" w:eastAsiaTheme="minorEastAsia" w:hAnsiTheme="minorEastAsia" w:cs="맑은 고딕"/>
                 <w:sz w:val="20"/>
                 <w:szCs w:val="20"/>
               </w:rPr>
@@ -1572,7 +1650,7 @@
             </w:r>
             <w:r>
               <w:rPr>
-                <w:rFonts w:ascii="맑은 고딕" w:eastAsia="맑은 고딕" w:cs="맑은 고딕" w:hint="eastAsia"/>
+                <w:rFonts w:asciiTheme="minorEastAsia" w:eastAsiaTheme="minorEastAsia" w:hAnsiTheme="minorEastAsia" w:cs="맑은 고딕" w:hint="eastAsia"/>
                 <w:sz w:val="20"/>
                 <w:szCs w:val="20"/>
               </w:rPr>
@@ -1580,7 +1658,7 @@
             </w:r>
             <w:r>
               <w:rPr>
-                <w:rFonts w:ascii="맑은 고딕" w:eastAsia="맑은 고딕" w:cs="맑은 고딕"/>
+                <w:rFonts w:asciiTheme="minorEastAsia" w:eastAsiaTheme="minorEastAsia" w:hAnsiTheme="minorEastAsia" w:cs="맑은 고딕"/>
                 <w:sz w:val="20"/>
                 <w:szCs w:val="20"/>
               </w:rPr>
@@ -1599,6 +1677,7 @@
           <w:p>
             <w:pPr>
               <w:rPr>
+                <w:rFonts w:asciiTheme="minorEastAsia" w:hAnsiTheme="minorEastAsia"/>
                 <w:sz w:val="2"/>
                 <w:szCs w:val="2"/>
               </w:rPr>
@@ -1619,9 +1698,13 @@
               <w:pStyle w:val="TableParagraph"/>
               <w:spacing w:line="253" w:lineRule="exact"/>
               <w:ind w:left="9"/>
-            </w:pPr>
-            <w:r>
-              <w:rPr>
+              <w:rPr>
+                <w:rFonts w:asciiTheme="minorEastAsia" w:eastAsiaTheme="minorEastAsia" w:hAnsiTheme="minorEastAsia"/>
+              </w:rPr>
+            </w:pPr>
+            <w:r>
+              <w:rPr>
+                <w:rFonts w:asciiTheme="minorEastAsia" w:eastAsiaTheme="minorEastAsia" w:hAnsiTheme="minorEastAsia"/>
                 <w:spacing w:val="-4"/>
               </w:rPr>
               <w:t>유통기한</w:t>
@@ -1637,30 +1720,23 @@
             <w:pPr>
               <w:pStyle w:val="TableParagraph"/>
               <w:rPr>
-                <w:rFonts w:ascii="Times New Roman"/>
-                <w:sz w:val="20"/>
-              </w:rPr>
-            </w:pPr>
-            <w:r>
-              <w:rPr>
-                <w:rFonts w:ascii="Times New Roman"/>
+                <w:rFonts w:asciiTheme="minorEastAsia" w:eastAsiaTheme="minorEastAsia" w:hAnsiTheme="minorEastAsia"/>
+                <w:sz w:val="20"/>
+              </w:rPr>
+            </w:pPr>
+            <w:r>
+              <w:rPr>
+                <w:rFonts w:asciiTheme="minorEastAsia" w:eastAsiaTheme="minorEastAsia" w:hAnsiTheme="minorEastAsia"/>
                 <w:sz w:val="18"/>
               </w:rPr>
               <w:t>{</w:t>
             </w:r>
             <w:r>
               <w:rPr>
-                <w:rFonts w:ascii="Times New Roman" w:hint="eastAsia"/>
+                <w:rFonts w:asciiTheme="minorEastAsia" w:eastAsiaTheme="minorEastAsia" w:hAnsiTheme="minorEastAsia" w:hint="eastAsia"/>
                 <w:sz w:val="18"/>
               </w:rPr>
-              <w:t>유통기한</w:t>
-            </w:r>
-            <w:r>
-              <w:rPr>
-                <w:rFonts w:ascii="Times New Roman" w:hint="eastAsia"/>
-                <w:sz w:val="18"/>
-              </w:rPr>
-              <w:t>}</w:t>
+              <w:t>유통기한}</w:t>
             </w:r>
           </w:p>
         </w:tc>
@@ -1675,6 +1751,7 @@
           <w:p>
             <w:pPr>
               <w:rPr>
+                <w:rFonts w:asciiTheme="minorEastAsia" w:hAnsiTheme="minorEastAsia"/>
                 <w:sz w:val="2"/>
                 <w:szCs w:val="2"/>
               </w:rPr>
@@ -1695,25 +1772,16 @@
               <w:pStyle w:val="TableParagraph"/>
               <w:spacing w:line="248" w:lineRule="exact"/>
               <w:ind w:left="9"/>
-            </w:pPr>
-            <w:r>
-              <w:rPr>
+              <w:rPr>
+                <w:rFonts w:asciiTheme="minorEastAsia" w:eastAsiaTheme="minorEastAsia" w:hAnsiTheme="minorEastAsia"/>
+              </w:rPr>
+            </w:pPr>
+            <w:r>
+              <w:rPr>
+                <w:rFonts w:asciiTheme="minorEastAsia" w:eastAsiaTheme="minorEastAsia" w:hAnsiTheme="minorEastAsia"/>
                 <w:spacing w:val="-2"/>
               </w:rPr>
-              <w:t>수량</w:t>
-            </w:r>
-            <w:r>
-              <w:rPr>
-                <w:rFonts w:ascii="Calibri" w:eastAsia="Calibri"/>
-                <w:spacing w:val="-2"/>
-              </w:rPr>
-              <w:t>/</w:t>
-            </w:r>
-            <w:r>
-              <w:rPr>
-                <w:spacing w:val="-2"/>
-              </w:rPr>
-              <w:t>단위</w:t>
+              <w:t>수량/단위</w:t>
             </w:r>
           </w:p>
         </w:tc>
@@ -1726,30 +1794,16 @@
             <w:pPr>
               <w:pStyle w:val="TableParagraph"/>
               <w:rPr>
-                <w:rFonts w:ascii="Times New Roman"/>
+                <w:rFonts w:asciiTheme="minorEastAsia" w:eastAsiaTheme="minorEastAsia" w:hAnsiTheme="minorEastAsia"/>
                 <w:sz w:val="18"/>
               </w:rPr>
             </w:pPr>
             <w:r>
               <w:rPr>
-                <w:rFonts w:ascii="Times New Roman" w:hint="eastAsia"/>
-                <w:sz w:val="20"/>
-              </w:rPr>
-              <w:t>{</w:t>
-            </w:r>
-            <w:r>
-              <w:rPr>
-                <w:rFonts w:ascii="Times New Roman" w:hint="eastAsia"/>
-                <w:sz w:val="20"/>
-              </w:rPr>
-              <w:t>수량</w:t>
-            </w:r>
-            <w:r>
-              <w:rPr>
-                <w:rFonts w:ascii="Times New Roman" w:hint="eastAsia"/>
-                <w:sz w:val="20"/>
-              </w:rPr>
-              <w:t>}</w:t>
+                <w:rFonts w:asciiTheme="minorEastAsia" w:eastAsiaTheme="minorEastAsia" w:hAnsiTheme="minorEastAsia" w:hint="eastAsia"/>
+                <w:sz w:val="20"/>
+              </w:rPr>
+              <w:t>{수량}</w:t>
             </w:r>
           </w:p>
         </w:tc>
@@ -1764,6 +1818,7 @@
           <w:p>
             <w:pPr>
               <w:rPr>
+                <w:rFonts w:asciiTheme="minorEastAsia" w:hAnsiTheme="minorEastAsia"/>
                 <w:sz w:val="2"/>
                 <w:szCs w:val="2"/>
               </w:rPr>
@@ -1784,9 +1839,13 @@
               <w:pStyle w:val="TableParagraph"/>
               <w:spacing w:line="253" w:lineRule="exact"/>
               <w:ind w:left="9"/>
-            </w:pPr>
-            <w:r>
-              <w:rPr>
+              <w:rPr>
+                <w:rFonts w:asciiTheme="minorEastAsia" w:eastAsiaTheme="minorEastAsia" w:hAnsiTheme="minorEastAsia"/>
+              </w:rPr>
+            </w:pPr>
+            <w:r>
+              <w:rPr>
+                <w:rFonts w:asciiTheme="minorEastAsia" w:eastAsiaTheme="minorEastAsia" w:hAnsiTheme="minorEastAsia"/>
                 <w:spacing w:val="-4"/>
               </w:rPr>
               <w:t>시험번호</w:t>
@@ -1802,37 +1861,30 @@
             <w:pPr>
               <w:pStyle w:val="TableParagraph"/>
               <w:rPr>
-                <w:rFonts w:ascii="Times New Roman"/>
-                <w:sz w:val="20"/>
-              </w:rPr>
-            </w:pPr>
-            <w:r>
-              <w:rPr>
-                <w:rFonts w:ascii="Times New Roman" w:hint="eastAsia"/>
+                <w:rFonts w:asciiTheme="minorEastAsia" w:eastAsiaTheme="minorEastAsia" w:hAnsiTheme="minorEastAsia"/>
+                <w:sz w:val="20"/>
+              </w:rPr>
+            </w:pPr>
+            <w:r>
+              <w:rPr>
+                <w:rFonts w:asciiTheme="minorEastAsia" w:eastAsiaTheme="minorEastAsia" w:hAnsiTheme="minorEastAsia" w:hint="eastAsia"/>
                 <w:sz w:val="20"/>
               </w:rPr>
               <w:t>{</w:t>
             </w:r>
             <w:r>
               <w:rPr>
-                <w:rFonts w:ascii="Times New Roman"/>
+                <w:rFonts w:asciiTheme="minorEastAsia" w:eastAsiaTheme="minorEastAsia" w:hAnsiTheme="minorEastAsia"/>
                 <w:sz w:val="20"/>
               </w:rPr>
               <w:t>LOT</w:t>
             </w:r>
             <w:r>
               <w:rPr>
-                <w:rFonts w:ascii="Times New Roman" w:hint="eastAsia"/>
-                <w:sz w:val="20"/>
-              </w:rPr>
-              <w:t>번호</w:t>
-            </w:r>
-            <w:r>
-              <w:rPr>
-                <w:rFonts w:ascii="Times New Roman" w:hint="eastAsia"/>
-                <w:sz w:val="20"/>
-              </w:rPr>
-              <w:t>}</w:t>
+                <w:rFonts w:asciiTheme="minorEastAsia" w:eastAsiaTheme="minorEastAsia" w:hAnsiTheme="minorEastAsia" w:hint="eastAsia"/>
+                <w:sz w:val="20"/>
+              </w:rPr>
+              <w:t>번호}</w:t>
             </w:r>
           </w:p>
         </w:tc>
@@ -1846,36 +1898,52 @@
               <w:spacing w:line="253" w:lineRule="exact"/>
               <w:ind w:left="838"/>
               <w:jc w:val="left"/>
-            </w:pPr>
-            <w:r>
+              <w:rPr>
+                <w:rFonts w:asciiTheme="minorEastAsia" w:eastAsiaTheme="minorEastAsia" w:hAnsiTheme="minorEastAsia"/>
+              </w:rPr>
+            </w:pPr>
+            <w:r>
+              <w:rPr>
+                <w:rFonts w:asciiTheme="minorEastAsia" w:eastAsiaTheme="minorEastAsia" w:hAnsiTheme="minorEastAsia"/>
+              </w:rPr>
               <w:t>조</w:t>
             </w:r>
             <w:r>
               <w:rPr>
+                <w:rFonts w:asciiTheme="minorEastAsia" w:eastAsiaTheme="minorEastAsia" w:hAnsiTheme="minorEastAsia"/>
                 <w:spacing w:val="36"/>
               </w:rPr>
               <w:t xml:space="preserve"> </w:t>
             </w:r>
             <w:r>
+              <w:rPr>
+                <w:rFonts w:asciiTheme="minorEastAsia" w:eastAsiaTheme="minorEastAsia" w:hAnsiTheme="minorEastAsia"/>
+              </w:rPr>
               <w:t>치</w:t>
             </w:r>
             <w:r>
               <w:rPr>
+                <w:rFonts w:asciiTheme="minorEastAsia" w:eastAsiaTheme="minorEastAsia" w:hAnsiTheme="minorEastAsia"/>
                 <w:spacing w:val="32"/>
               </w:rPr>
               <w:t xml:space="preserve"> </w:t>
             </w:r>
             <w:r>
+              <w:rPr>
+                <w:rFonts w:asciiTheme="minorEastAsia" w:eastAsiaTheme="minorEastAsia" w:hAnsiTheme="minorEastAsia"/>
+              </w:rPr>
               <w:t>사</w:t>
             </w:r>
             <w:r>
               <w:rPr>
+                <w:rFonts w:asciiTheme="minorEastAsia" w:eastAsiaTheme="minorEastAsia" w:hAnsiTheme="minorEastAsia"/>
                 <w:spacing w:val="36"/>
               </w:rPr>
               <w:t xml:space="preserve"> </w:t>
             </w:r>
             <w:r>
               <w:rPr>
+                <w:rFonts w:asciiTheme="minorEastAsia" w:eastAsiaTheme="minorEastAsia" w:hAnsiTheme="minorEastAsia"/>
                 <w:spacing w:val="-10"/>
               </w:rPr>
               <w:t>항</w:t>
@@ -1896,18 +1964,26 @@
               <w:pStyle w:val="TableParagraph"/>
               <w:spacing w:line="253" w:lineRule="exact"/>
               <w:ind w:left="13"/>
-            </w:pPr>
-            <w:r>
+              <w:rPr>
+                <w:rFonts w:asciiTheme="minorEastAsia" w:eastAsiaTheme="minorEastAsia" w:hAnsiTheme="minorEastAsia"/>
+              </w:rPr>
+            </w:pPr>
+            <w:r>
+              <w:rPr>
+                <w:rFonts w:asciiTheme="minorEastAsia" w:eastAsiaTheme="minorEastAsia" w:hAnsiTheme="minorEastAsia"/>
+              </w:rPr>
               <w:t>시험</w:t>
             </w:r>
             <w:r>
               <w:rPr>
+                <w:rFonts w:asciiTheme="minorEastAsia" w:eastAsiaTheme="minorEastAsia" w:hAnsiTheme="minorEastAsia"/>
                 <w:spacing w:val="31"/>
               </w:rPr>
               <w:t xml:space="preserve"> </w:t>
             </w:r>
             <w:r>
               <w:rPr>
+                <w:rFonts w:asciiTheme="minorEastAsia" w:eastAsiaTheme="minorEastAsia" w:hAnsiTheme="minorEastAsia"/>
                 <w:spacing w:val="-5"/>
               </w:rPr>
               <w:t>의뢰일</w:t>
@@ -1923,30 +1999,16 @@
             <w:pPr>
               <w:pStyle w:val="TableParagraph"/>
               <w:rPr>
-                <w:rFonts w:ascii="Times New Roman"/>
-                <w:sz w:val="20"/>
-              </w:rPr>
-            </w:pPr>
-            <w:r>
-              <w:rPr>
-                <w:rFonts w:ascii="Times New Roman" w:hint="eastAsia"/>
-                <w:sz w:val="20"/>
-              </w:rPr>
-              <w:t>{</w:t>
-            </w:r>
-            <w:r>
-              <w:rPr>
-                <w:rFonts w:ascii="Times New Roman" w:hint="eastAsia"/>
-                <w:sz w:val="20"/>
-              </w:rPr>
-              <w:t>오늘날짜</w:t>
-            </w:r>
-            <w:r>
-              <w:rPr>
-                <w:rFonts w:ascii="Times New Roman" w:hint="eastAsia"/>
-                <w:sz w:val="20"/>
-              </w:rPr>
-              <w:t>}</w:t>
+                <w:rFonts w:asciiTheme="minorEastAsia" w:eastAsiaTheme="minorEastAsia" w:hAnsiTheme="minorEastAsia"/>
+                <w:sz w:val="20"/>
+              </w:rPr>
+            </w:pPr>
+            <w:r>
+              <w:rPr>
+                <w:rFonts w:asciiTheme="minorEastAsia" w:eastAsiaTheme="minorEastAsia" w:hAnsiTheme="minorEastAsia" w:hint="eastAsia"/>
+                <w:sz w:val="20"/>
+              </w:rPr>
+              <w:t>{오늘날짜}</w:t>
             </w:r>
           </w:p>
         </w:tc>
@@ -1960,7 +2022,7 @@
               <w:pStyle w:val="TableParagraph"/>
               <w:jc w:val="left"/>
               <w:rPr>
-                <w:rFonts w:ascii="Times New Roman"/>
+                <w:rFonts w:asciiTheme="minorEastAsia" w:eastAsiaTheme="minorEastAsia" w:hAnsiTheme="minorEastAsia"/>
                 <w:sz w:val="24"/>
               </w:rPr>
             </w:pPr>
@@ -1980,10 +2042,14 @@
               <w:pStyle w:val="TableParagraph"/>
               <w:spacing w:line="253" w:lineRule="exact"/>
               <w:ind w:left="9"/>
+              <w:rPr>
+                <w:rFonts w:asciiTheme="minorEastAsia" w:eastAsiaTheme="minorEastAsia" w:hAnsiTheme="minorEastAsia"/>
+              </w:rPr>
             </w:pPr>
             <w:proofErr w:type="spellStart"/>
             <w:r>
               <w:rPr>
+                <w:rFonts w:asciiTheme="minorEastAsia" w:eastAsiaTheme="minorEastAsia" w:hAnsiTheme="minorEastAsia"/>
                 <w:spacing w:val="-2"/>
               </w:rPr>
               <w:t>검체채취일</w:t>
@@ -1999,30 +2065,16 @@
             <w:pPr>
               <w:pStyle w:val="TableParagraph"/>
               <w:rPr>
-                <w:rFonts w:ascii="Times New Roman"/>
-                <w:sz w:val="20"/>
-              </w:rPr>
-            </w:pPr>
-            <w:r>
-              <w:rPr>
-                <w:rFonts w:ascii="Times New Roman" w:hint="eastAsia"/>
-                <w:sz w:val="20"/>
-              </w:rPr>
-              <w:t>{</w:t>
-            </w:r>
-            <w:r>
-              <w:rPr>
-                <w:rFonts w:ascii="Times New Roman" w:hint="eastAsia"/>
-                <w:sz w:val="20"/>
-              </w:rPr>
-              <w:t>오늘날짜</w:t>
-            </w:r>
-            <w:r>
-              <w:rPr>
-                <w:rFonts w:ascii="Times New Roman" w:hint="eastAsia"/>
-                <w:sz w:val="20"/>
-              </w:rPr>
-              <w:t>}</w:t>
+                <w:rFonts w:asciiTheme="minorEastAsia" w:eastAsiaTheme="minorEastAsia" w:hAnsiTheme="minorEastAsia"/>
+                <w:sz w:val="20"/>
+              </w:rPr>
+            </w:pPr>
+            <w:r>
+              <w:rPr>
+                <w:rFonts w:asciiTheme="minorEastAsia" w:eastAsiaTheme="minorEastAsia" w:hAnsiTheme="minorEastAsia" w:hint="eastAsia"/>
+                <w:sz w:val="20"/>
+              </w:rPr>
+              <w:t>{오늘날짜}</w:t>
             </w:r>
           </w:p>
         </w:tc>
@@ -2035,27 +2087,39 @@
               <w:pStyle w:val="TableParagraph"/>
               <w:spacing w:line="253" w:lineRule="exact"/>
               <w:ind w:left="7"/>
-            </w:pPr>
-            <w:r>
+              <w:rPr>
+                <w:rFonts w:asciiTheme="minorEastAsia" w:eastAsiaTheme="minorEastAsia" w:hAnsiTheme="minorEastAsia"/>
+              </w:rPr>
+            </w:pPr>
+            <w:r>
+              <w:rPr>
+                <w:rFonts w:asciiTheme="minorEastAsia" w:eastAsiaTheme="minorEastAsia" w:hAnsiTheme="minorEastAsia"/>
+              </w:rPr>
               <w:t>판</w:t>
             </w:r>
             <w:r>
               <w:rPr>
+                <w:rFonts w:asciiTheme="minorEastAsia" w:eastAsiaTheme="minorEastAsia" w:hAnsiTheme="minorEastAsia"/>
                 <w:spacing w:val="36"/>
               </w:rPr>
               <w:t xml:space="preserve"> </w:t>
             </w:r>
             <w:r>
+              <w:rPr>
+                <w:rFonts w:asciiTheme="minorEastAsia" w:eastAsiaTheme="minorEastAsia" w:hAnsiTheme="minorEastAsia"/>
+              </w:rPr>
               <w:t>정</w:t>
             </w:r>
             <w:r>
               <w:rPr>
+                <w:rFonts w:asciiTheme="minorEastAsia" w:eastAsiaTheme="minorEastAsia" w:hAnsiTheme="minorEastAsia"/>
                 <w:spacing w:val="32"/>
               </w:rPr>
               <w:t xml:space="preserve"> </w:t>
             </w:r>
             <w:r>
               <w:rPr>
+                <w:rFonts w:asciiTheme="minorEastAsia" w:eastAsiaTheme="minorEastAsia" w:hAnsiTheme="minorEastAsia"/>
                 <w:spacing w:val="-10"/>
               </w:rPr>
               <w:t>일</w:t>
@@ -2070,30 +2134,16 @@
             <w:pPr>
               <w:pStyle w:val="TableParagraph"/>
               <w:rPr>
-                <w:rFonts w:ascii="Times New Roman"/>
-                <w:sz w:val="20"/>
-              </w:rPr>
-            </w:pPr>
-            <w:r>
-              <w:rPr>
-                <w:rFonts w:ascii="Times New Roman" w:hint="eastAsia"/>
-                <w:sz w:val="20"/>
-              </w:rPr>
-              <w:t>{</w:t>
-            </w:r>
-            <w:r>
-              <w:rPr>
-                <w:rFonts w:ascii="Times New Roman" w:hint="eastAsia"/>
-                <w:sz w:val="20"/>
-              </w:rPr>
-              <w:t>오늘날짜</w:t>
-            </w:r>
-            <w:r>
-              <w:rPr>
-                <w:rFonts w:ascii="Times New Roman" w:hint="eastAsia"/>
-                <w:sz w:val="20"/>
-              </w:rPr>
-              <w:t>}</w:t>
+                <w:rFonts w:asciiTheme="minorEastAsia" w:eastAsiaTheme="minorEastAsia" w:hAnsiTheme="minorEastAsia"/>
+                <w:sz w:val="20"/>
+              </w:rPr>
+            </w:pPr>
+            <w:r>
+              <w:rPr>
+                <w:rFonts w:asciiTheme="minorEastAsia" w:eastAsiaTheme="minorEastAsia" w:hAnsiTheme="minorEastAsia" w:hint="eastAsia"/>
+                <w:sz w:val="20"/>
+              </w:rPr>
+              <w:t>{오늘날짜}</w:t>
             </w:r>
           </w:p>
         </w:tc>
@@ -2108,6 +2158,7 @@
           <w:p>
             <w:pPr>
               <w:rPr>
+                <w:rFonts w:asciiTheme="minorEastAsia" w:hAnsiTheme="minorEastAsia"/>
                 <w:sz w:val="2"/>
                 <w:szCs w:val="2"/>
               </w:rPr>
@@ -2128,10 +2179,14 @@
               <w:pStyle w:val="TableParagraph"/>
               <w:spacing w:line="244" w:lineRule="exact"/>
               <w:ind w:left="9"/>
+              <w:rPr>
+                <w:rFonts w:asciiTheme="minorEastAsia" w:eastAsiaTheme="minorEastAsia" w:hAnsiTheme="minorEastAsia"/>
+              </w:rPr>
             </w:pPr>
             <w:proofErr w:type="spellStart"/>
             <w:r>
               <w:rPr>
+                <w:rFonts w:asciiTheme="minorEastAsia" w:eastAsiaTheme="minorEastAsia" w:hAnsiTheme="minorEastAsia"/>
                 <w:spacing w:val="-2"/>
               </w:rPr>
               <w:t>검체채취자</w:t>
@@ -2147,13 +2202,13 @@
             <w:pPr>
               <w:pStyle w:val="TableParagraph"/>
               <w:rPr>
-                <w:rFonts w:ascii="Times New Roman"/>
+                <w:rFonts w:asciiTheme="minorEastAsia" w:eastAsiaTheme="minorEastAsia" w:hAnsiTheme="minorEastAsia"/>
                 <w:sz w:val="18"/>
               </w:rPr>
             </w:pPr>
             <w:r>
               <w:rPr>
-                <w:rFonts w:ascii="Times New Roman" w:hint="eastAsia"/>
+                <w:rFonts w:asciiTheme="minorEastAsia" w:eastAsiaTheme="minorEastAsia" w:hAnsiTheme="minorEastAsia" w:hint="eastAsia"/>
                 <w:sz w:val="18"/>
               </w:rPr>
               <w:t>이상은</w:t>
@@ -2169,27 +2224,39 @@
               <w:pStyle w:val="TableParagraph"/>
               <w:spacing w:line="244" w:lineRule="exact"/>
               <w:ind w:left="7"/>
-            </w:pPr>
-            <w:r>
+              <w:rPr>
+                <w:rFonts w:asciiTheme="minorEastAsia" w:eastAsiaTheme="minorEastAsia" w:hAnsiTheme="minorEastAsia"/>
+              </w:rPr>
+            </w:pPr>
+            <w:r>
+              <w:rPr>
+                <w:rFonts w:asciiTheme="minorEastAsia" w:eastAsiaTheme="minorEastAsia" w:hAnsiTheme="minorEastAsia"/>
+              </w:rPr>
               <w:t>확</w:t>
             </w:r>
             <w:r>
               <w:rPr>
+                <w:rFonts w:asciiTheme="minorEastAsia" w:eastAsiaTheme="minorEastAsia" w:hAnsiTheme="minorEastAsia"/>
                 <w:spacing w:val="36"/>
               </w:rPr>
               <w:t xml:space="preserve"> </w:t>
             </w:r>
             <w:r>
+              <w:rPr>
+                <w:rFonts w:asciiTheme="minorEastAsia" w:eastAsiaTheme="minorEastAsia" w:hAnsiTheme="minorEastAsia"/>
+              </w:rPr>
               <w:t>인</w:t>
             </w:r>
             <w:r>
               <w:rPr>
+                <w:rFonts w:asciiTheme="minorEastAsia" w:eastAsiaTheme="minorEastAsia" w:hAnsiTheme="minorEastAsia"/>
                 <w:spacing w:val="32"/>
               </w:rPr>
               <w:t xml:space="preserve"> </w:t>
             </w:r>
             <w:r>
               <w:rPr>
+                <w:rFonts w:asciiTheme="minorEastAsia" w:eastAsiaTheme="minorEastAsia" w:hAnsiTheme="minorEastAsia"/>
                 <w:spacing w:val="-10"/>
               </w:rPr>
               <w:t>자</w:t>
@@ -2204,7 +2271,7 @@
             <w:pPr>
               <w:pStyle w:val="TableParagraph"/>
               <w:rPr>
-                <w:rFonts w:ascii="Times New Roman"/>
+                <w:rFonts w:asciiTheme="minorEastAsia" w:eastAsiaTheme="minorEastAsia" w:hAnsiTheme="minorEastAsia"/>
                 <w:sz w:val="18"/>
               </w:rPr>
             </w:pPr>
@@ -2221,6 +2288,7 @@
           <w:p>
             <w:pPr>
               <w:rPr>
+                <w:rFonts w:asciiTheme="minorEastAsia" w:hAnsiTheme="minorEastAsia"/>
                 <w:sz w:val="2"/>
                 <w:szCs w:val="2"/>
               </w:rPr>
@@ -2231,9 +2299,9 @@
     </w:tbl>
     <w:p>
       <w:pPr>
-        <w:spacing w:before="0" w:after="0"/>
+        <w:spacing w:before="141" w:after="1"/>
         <w:rPr>
-          <w:rFonts w:ascii="Times New Roman"/>
+          <w:rFonts w:asciiTheme="minorEastAsia" w:hAnsiTheme="minorEastAsia"/>
           <w:sz w:val="20"/>
         </w:rPr>
       </w:pPr>
@@ -2263,7 +2331,7 @@
       </w:tblGrid>
       <w:tr>
         <w:trPr>
-          <w:trHeight w:val="690"/>
+          <w:trHeight w:val="268"/>
         </w:trPr>
         <w:tc>
           <w:tcPr>
@@ -2273,14 +2341,16 @@
           <w:p>
             <w:pPr>
               <w:pStyle w:val="TableParagraph"/>
-              <w:spacing w:before="0" w:line="502" w:lineRule="exact"/>
+              <w:spacing w:line="502" w:lineRule="exact"/>
               <w:ind w:left="3"/>
               <w:rPr>
+                <w:rFonts w:asciiTheme="minorEastAsia" w:eastAsiaTheme="minorEastAsia" w:hAnsiTheme="minorEastAsia"/>
                 <w:sz w:val="40"/>
               </w:rPr>
             </w:pPr>
             <w:r>
               <w:rPr>
+                <w:rFonts w:asciiTheme="minorEastAsia" w:eastAsiaTheme="minorEastAsia" w:hAnsiTheme="minorEastAsia"/>
                 <w:spacing w:val="-2"/>
                 <w:sz w:val="40"/>
               </w:rPr>
@@ -2295,12 +2365,15 @@
           <w:p>
             <w:pPr>
               <w:pStyle w:val="TableParagraph"/>
-              <w:spacing w:before="0"/>
               <w:ind w:left="11"/>
+              <w:rPr>
+                <w:rFonts w:asciiTheme="minorEastAsia" w:eastAsiaTheme="minorEastAsia" w:hAnsiTheme="minorEastAsia"/>
+              </w:rPr>
             </w:pPr>
             <w:proofErr w:type="spellStart"/>
             <w:r>
               <w:rPr>
+                <w:rFonts w:asciiTheme="minorEastAsia" w:eastAsiaTheme="minorEastAsia" w:hAnsiTheme="minorEastAsia"/>
                 <w:spacing w:val="-2"/>
               </w:rPr>
               <w:t>시험중</w:t>
@@ -2308,43 +2381,47 @@
             <w:proofErr w:type="spellEnd"/>
             <w:r>
               <w:rPr>
-                <w:rFonts w:ascii="Calibri" w:eastAsia="Calibri"/>
+                <w:rFonts w:asciiTheme="minorEastAsia" w:eastAsiaTheme="minorEastAsia" w:hAnsiTheme="minorEastAsia"/>
                 <w:spacing w:val="-2"/>
               </w:rPr>
               <w:t>/</w:t>
             </w:r>
             <w:r>
               <w:rPr>
+                <w:rFonts w:asciiTheme="minorEastAsia" w:eastAsiaTheme="minorEastAsia" w:hAnsiTheme="minorEastAsia"/>
                 <w:spacing w:val="-2"/>
               </w:rPr>
               <w:t>적합</w:t>
             </w:r>
             <w:r>
               <w:rPr>
-                <w:rFonts w:ascii="Calibri" w:eastAsia="Calibri"/>
+                <w:rFonts w:asciiTheme="minorEastAsia" w:eastAsiaTheme="minorEastAsia" w:hAnsiTheme="minorEastAsia"/>
                 <w:spacing w:val="-2"/>
               </w:rPr>
               <w:t>/</w:t>
             </w:r>
             <w:r>
               <w:rPr>
+                <w:rFonts w:asciiTheme="minorEastAsia" w:eastAsiaTheme="minorEastAsia" w:hAnsiTheme="minorEastAsia"/>
                 <w:spacing w:val="-2"/>
               </w:rPr>
               <w:t>부적합</w:t>
             </w:r>
-          </w:p>
-          <w:p>
-            <w:pPr>
-              <w:pStyle w:val="TableParagraph"/>
-              <w:spacing w:before="0" w:line="276" w:lineRule="exact"/>
-              <w:ind w:left="11" w:right="4"/>
-            </w:pPr>
-            <w:r>
-              <w:rPr>
+            <w:r>
+              <w:rPr>
+                <w:rFonts w:asciiTheme="minorEastAsia" w:eastAsiaTheme="minorEastAsia" w:hAnsiTheme="minorEastAsia" w:hint="eastAsia"/>
+              </w:rPr>
+              <w:t xml:space="preserve"> </w:t>
+            </w:r>
+            <w:proofErr w:type="spellStart"/>
+            <w:r>
+              <w:rPr>
+                <w:rFonts w:asciiTheme="minorEastAsia" w:eastAsiaTheme="minorEastAsia" w:hAnsiTheme="minorEastAsia"/>
                 <w:spacing w:val="-5"/>
               </w:rPr>
               <w:t>표시서</w:t>
             </w:r>
+            <w:proofErr w:type="spellEnd"/>
           </w:p>
         </w:tc>
       </w:tr>
@@ -2362,20 +2439,27 @@
               <w:tabs>
                 <w:tab w:val="left" w:pos="665"/>
               </w:tabs>
-              <w:spacing w:before="0"/>
               <w:ind w:left="8"/>
-            </w:pPr>
-            <w:r>
-              <w:rPr>
+              <w:rPr>
+                <w:rFonts w:asciiTheme="minorEastAsia" w:eastAsiaTheme="minorEastAsia" w:hAnsiTheme="minorEastAsia"/>
+              </w:rPr>
+            </w:pPr>
+            <w:r>
+              <w:rPr>
+                <w:rFonts w:asciiTheme="minorEastAsia" w:eastAsiaTheme="minorEastAsia" w:hAnsiTheme="minorEastAsia"/>
                 <w:spacing w:val="-10"/>
               </w:rPr>
               <w:t>구</w:t>
             </w:r>
             <w:r>
+              <w:rPr>
+                <w:rFonts w:asciiTheme="minorEastAsia" w:eastAsiaTheme="minorEastAsia" w:hAnsiTheme="minorEastAsia"/>
+              </w:rPr>
               <w:tab/>
             </w:r>
             <w:r>
               <w:rPr>
+                <w:rFonts w:asciiTheme="minorEastAsia" w:eastAsiaTheme="minorEastAsia" w:hAnsiTheme="minorEastAsia"/>
                 <w:spacing w:val="-10"/>
               </w:rPr>
               <w:t>분</w:t>
@@ -2400,15 +2484,16 @@
                 <w:tab w:val="left" w:pos="2542"/>
                 <w:tab w:val="left" w:pos="3857"/>
               </w:tabs>
-              <w:spacing w:before="0"/>
               <w:ind w:hanging="292"/>
               <w:jc w:val="left"/>
               <w:rPr>
-                <w:sz w:val="24"/>
-              </w:rPr>
-            </w:pPr>
-            <w:r>
-              <w:rPr>
+                <w:rFonts w:asciiTheme="minorEastAsia" w:eastAsiaTheme="minorEastAsia" w:hAnsiTheme="minorEastAsia"/>
+                <w:sz w:val="24"/>
+              </w:rPr>
+            </w:pPr>
+            <w:r>
+              <w:rPr>
+                <w:rFonts w:asciiTheme="minorEastAsia" w:eastAsiaTheme="minorEastAsia" w:hAnsiTheme="minorEastAsia"/>
                 <w:spacing w:val="-5"/>
                 <w:w w:val="105"/>
                 <w:sz w:val="24"/>
@@ -2417,13 +2502,14 @@
             </w:r>
             <w:r>
               <w:rPr>
+                <w:rFonts w:asciiTheme="minorEastAsia" w:eastAsiaTheme="minorEastAsia" w:hAnsiTheme="minorEastAsia"/>
                 <w:sz w:val="24"/>
               </w:rPr>
               <w:tab/>
             </w:r>
             <w:r>
               <w:rPr>
-                <w:rFonts w:ascii="Meiryo UI" w:eastAsia="Meiryo UI" w:hAnsi="Meiryo UI"/>
+                <w:rFonts w:ascii="Segoe UI Symbol" w:eastAsiaTheme="minorEastAsia" w:hAnsi="Segoe UI Symbol" w:cs="Segoe UI Symbol"/>
                 <w:w w:val="105"/>
                 <w:sz w:val="24"/>
               </w:rPr>
@@ -2431,7 +2517,7 @@
             </w:r>
             <w:r>
               <w:rPr>
-                <w:rFonts w:ascii="Meiryo UI" w:eastAsia="Meiryo UI" w:hAnsi="Meiryo UI"/>
+                <w:rFonts w:asciiTheme="minorEastAsia" w:eastAsiaTheme="minorEastAsia" w:hAnsiTheme="minorEastAsia"/>
                 <w:spacing w:val="46"/>
                 <w:w w:val="105"/>
                 <w:sz w:val="24"/>
@@ -2440,6 +2526,7 @@
             </w:r>
             <w:r>
               <w:rPr>
+                <w:rFonts w:asciiTheme="minorEastAsia" w:eastAsiaTheme="minorEastAsia" w:hAnsiTheme="minorEastAsia"/>
                 <w:spacing w:val="-5"/>
                 <w:w w:val="105"/>
                 <w:sz w:val="24"/>
@@ -2448,13 +2535,14 @@
             </w:r>
             <w:r>
               <w:rPr>
+                <w:rFonts w:asciiTheme="minorEastAsia" w:eastAsiaTheme="minorEastAsia" w:hAnsiTheme="minorEastAsia"/>
                 <w:sz w:val="24"/>
               </w:rPr>
               <w:tab/>
             </w:r>
             <w:r>
               <w:rPr>
-                <w:rFonts w:ascii="Meiryo UI" w:eastAsia="Meiryo UI" w:hAnsi="Meiryo UI"/>
+                <w:rFonts w:ascii="Segoe UI Symbol" w:eastAsiaTheme="minorEastAsia" w:hAnsi="Segoe UI Symbol" w:cs="Segoe UI Symbol"/>
                 <w:w w:val="105"/>
                 <w:sz w:val="24"/>
               </w:rPr>
@@ -2462,7 +2550,7 @@
             </w:r>
             <w:r>
               <w:rPr>
-                <w:rFonts w:ascii="Meiryo UI" w:eastAsia="Meiryo UI" w:hAnsi="Meiryo UI"/>
+                <w:rFonts w:asciiTheme="minorEastAsia" w:eastAsiaTheme="minorEastAsia" w:hAnsiTheme="minorEastAsia"/>
                 <w:spacing w:val="50"/>
                 <w:w w:val="105"/>
                 <w:sz w:val="24"/>
@@ -2471,6 +2559,7 @@
             </w:r>
             <w:r>
               <w:rPr>
+                <w:rFonts w:asciiTheme="minorEastAsia" w:eastAsiaTheme="minorEastAsia" w:hAnsiTheme="minorEastAsia"/>
                 <w:spacing w:val="-5"/>
                 <w:w w:val="105"/>
                 <w:sz w:val="24"/>
@@ -2479,13 +2568,14 @@
             </w:r>
             <w:r>
               <w:rPr>
+                <w:rFonts w:asciiTheme="minorEastAsia" w:eastAsiaTheme="minorEastAsia" w:hAnsiTheme="minorEastAsia"/>
                 <w:sz w:val="24"/>
               </w:rPr>
               <w:tab/>
             </w:r>
             <w:r>
               <w:rPr>
-                <w:rFonts w:ascii="Meiryo UI" w:eastAsia="Meiryo UI" w:hAnsi="Meiryo UI"/>
+                <w:rFonts w:ascii="Segoe UI Symbol" w:eastAsiaTheme="minorEastAsia" w:hAnsi="Segoe UI Symbol" w:cs="Segoe UI Symbol"/>
                 <w:w w:val="105"/>
                 <w:sz w:val="24"/>
               </w:rPr>
@@ -2493,7 +2583,7 @@
             </w:r>
             <w:r>
               <w:rPr>
-                <w:rFonts w:ascii="Meiryo UI" w:eastAsia="Meiryo UI" w:hAnsi="Meiryo UI"/>
+                <w:rFonts w:asciiTheme="minorEastAsia" w:eastAsiaTheme="minorEastAsia" w:hAnsiTheme="minorEastAsia"/>
                 <w:spacing w:val="46"/>
                 <w:w w:val="105"/>
                 <w:sz w:val="24"/>
@@ -2502,6 +2592,7 @@
             </w:r>
             <w:r>
               <w:rPr>
+                <w:rFonts w:asciiTheme="minorEastAsia" w:eastAsiaTheme="minorEastAsia" w:hAnsiTheme="minorEastAsia"/>
                 <w:spacing w:val="-5"/>
                 <w:w w:val="105"/>
                 <w:sz w:val="24"/>
@@ -2518,10 +2609,9 @@
           <w:p>
             <w:pPr>
               <w:pStyle w:val="TableParagraph"/>
-              <w:spacing w:before="0"/>
               <w:jc w:val="left"/>
               <w:rPr>
-                <w:rFonts w:ascii="Times New Roman"/>
+                <w:rFonts w:asciiTheme="minorEastAsia" w:eastAsiaTheme="minorEastAsia" w:hAnsiTheme="minorEastAsia"/>
                 <w:sz w:val="30"/>
               </w:rPr>
             </w:pPr>
@@ -2529,21 +2619,22 @@
           <w:p>
             <w:pPr>
               <w:pStyle w:val="TableParagraph"/>
-              <w:spacing w:before="0"/>
               <w:ind w:left="11" w:right="4"/>
               <w:rPr>
+                <w:rFonts w:asciiTheme="minorEastAsia" w:eastAsiaTheme="minorEastAsia" w:hAnsiTheme="minorEastAsia"/>
                 <w:sz w:val="30"/>
               </w:rPr>
             </w:pPr>
             <w:r>
               <w:rPr>
+                <w:rFonts w:asciiTheme="minorEastAsia" w:eastAsiaTheme="minorEastAsia" w:hAnsiTheme="minorEastAsia"/>
                 <w:noProof/>
                 <w:sz w:val="30"/>
               </w:rPr>
               <mc:AlternateContent>
                 <mc:Choice Requires="wpg">
                   <w:drawing>
-                    <wp:anchor distT="0" distB="0" distL="0" distR="0" simplePos="0" relativeHeight="487403520" behindDoc="1" locked="0" layoutInCell="1" allowOverlap="1" wp14:anchorId="283ABFB8" wp14:editId="70D9B8AD">
+                    <wp:anchor distT="0" distB="0" distL="0" distR="0" simplePos="0" relativeHeight="251658752" behindDoc="1" locked="0" layoutInCell="1" allowOverlap="1" wp14:anchorId="283ABFB8" wp14:editId="70D9B8AD">
                       <wp:simplePos x="0" y="0"/>
                       <wp:positionH relativeFrom="column">
                         <wp:posOffset>540994</wp:posOffset>
@@ -2578,7 +2669,7 @@
                                 <pic:cNvPicPr/>
                               </pic:nvPicPr>
                               <pic:blipFill>
-                                <a:blip r:embed="rId9" cstate="print"/>
+                                <a:blip r:embed="rId10" cstate="print"/>
                                 <a:stretch>
                                   <a:fillRect/>
                                 </a:stretch>
@@ -2601,9 +2692,9 @@
                 </mc:Choice>
                 <mc:Fallback>
                   <w:pict>
-                    <v:group w14:anchorId="005BEFFB" id="Group 5" o:spid="_x0000_s1026" style="position:absolute;margin-left:42.6pt;margin-top:-19.4pt;width:59.3pt;height:58.8pt;z-index:-15912960;mso-wrap-distance-left:0;mso-wrap-distance-right:0" coordsize="7531,7467" o:gfxdata="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">
-                      <v:shape id="Image 6" o:spid="_x0000_s1027" type="#_x0000_t75" style="position:absolute;width:7490;height:7429;visibility:visible;mso-wrap-style:square" o:gfxdata="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">
-                        <v:imagedata r:id="rId10" o:title=""/>
+                    <v:group w14:anchorId="3F2120CE" id="Group 5" o:spid="_x0000_s1026" style="position:absolute;left:0;text-align:left;margin-left:42.6pt;margin-top:-19.4pt;width:59.3pt;height:58.8pt;z-index:-251657728;mso-wrap-distance-left:0;mso-wrap-distance-right:0" coordsize="7531,7467" o:gfxdata="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">
+                      <v:shape id="Image 6" o:spid="_x0000_s1027" type="#_x0000_t75" style="position:absolute;width:7490;height:7429;visibility:visible;mso-wrap-style:square" o:gfxdata="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">
+                        <v:imagedata r:id="rId11" o:title=""/>
                       </v:shape>
                     </v:group>
                   </w:pict>
@@ -2612,6 +2703,7 @@
             </w:r>
             <w:r>
               <w:rPr>
+                <w:rFonts w:asciiTheme="minorEastAsia" w:eastAsiaTheme="minorEastAsia" w:hAnsiTheme="minorEastAsia"/>
                 <w:spacing w:val="-5"/>
                 <w:sz w:val="30"/>
               </w:rPr>
@@ -2636,18 +2728,26 @@
               </w:tabs>
               <w:spacing w:line="248" w:lineRule="exact"/>
               <w:ind w:left="119"/>
-            </w:pPr>
-            <w:r>
-              <w:rPr>
+              <w:rPr>
+                <w:rFonts w:asciiTheme="minorEastAsia" w:eastAsiaTheme="minorEastAsia" w:hAnsiTheme="minorEastAsia"/>
+              </w:rPr>
+            </w:pPr>
+            <w:r>
+              <w:rPr>
+                <w:rFonts w:asciiTheme="minorEastAsia" w:eastAsiaTheme="minorEastAsia" w:hAnsiTheme="minorEastAsia"/>
                 <w:spacing w:val="-10"/>
               </w:rPr>
               <w:t>품</w:t>
             </w:r>
             <w:r>
+              <w:rPr>
+                <w:rFonts w:asciiTheme="minorEastAsia" w:eastAsiaTheme="minorEastAsia" w:hAnsiTheme="minorEastAsia"/>
+              </w:rPr>
               <w:tab/>
             </w:r>
             <w:r>
               <w:rPr>
+                <w:rFonts w:asciiTheme="minorEastAsia" w:eastAsiaTheme="minorEastAsia" w:hAnsiTheme="minorEastAsia"/>
                 <w:spacing w:val="-10"/>
               </w:rPr>
               <w:t>명</w:t>
@@ -2663,13 +2763,13 @@
             <w:pPr>
               <w:pStyle w:val="TableParagraph"/>
               <w:rPr>
-                <w:rFonts w:ascii="Times New Roman"/>
+                <w:rFonts w:asciiTheme="minorEastAsia" w:eastAsiaTheme="minorEastAsia" w:hAnsiTheme="minorEastAsia"/>
                 <w:sz w:val="18"/>
               </w:rPr>
             </w:pPr>
             <w:r>
               <w:rPr>
-                <w:rFonts w:ascii="맑은 고딕" w:eastAsia="맑은 고딕" w:cs="맑은 고딕"/>
+                <w:rFonts w:asciiTheme="minorEastAsia" w:eastAsiaTheme="minorEastAsia" w:hAnsiTheme="minorEastAsia" w:cs="맑은 고딕"/>
                 <w:sz w:val="20"/>
                 <w:szCs w:val="20"/>
               </w:rPr>
@@ -2677,7 +2777,7 @@
             </w:r>
             <w:r>
               <w:rPr>
-                <w:rFonts w:ascii="맑은 고딕" w:eastAsia="맑은 고딕" w:cs="맑은 고딕" w:hint="eastAsia"/>
+                <w:rFonts w:asciiTheme="minorEastAsia" w:eastAsiaTheme="minorEastAsia" w:hAnsiTheme="minorEastAsia" w:cs="맑은 고딕" w:hint="eastAsia"/>
                 <w:sz w:val="20"/>
                 <w:szCs w:val="20"/>
               </w:rPr>
@@ -2685,7 +2785,7 @@
             </w:r>
             <w:r>
               <w:rPr>
-                <w:rFonts w:ascii="맑은 고딕" w:eastAsia="맑은 고딕" w:cs="맑은 고딕"/>
+                <w:rFonts w:asciiTheme="minorEastAsia" w:eastAsiaTheme="minorEastAsia" w:hAnsiTheme="minorEastAsia" w:cs="맑은 고딕"/>
                 <w:sz w:val="20"/>
                 <w:szCs w:val="20"/>
               </w:rPr>
@@ -2704,6 +2804,7 @@
           <w:p>
             <w:pPr>
               <w:rPr>
+                <w:rFonts w:asciiTheme="minorEastAsia" w:hAnsiTheme="minorEastAsia"/>
                 <w:sz w:val="2"/>
                 <w:szCs w:val="2"/>
               </w:rPr>
@@ -2724,9 +2825,13 @@
               <w:pStyle w:val="TableParagraph"/>
               <w:spacing w:line="253" w:lineRule="exact"/>
               <w:ind w:left="9"/>
-            </w:pPr>
-            <w:r>
-              <w:rPr>
+              <w:rPr>
+                <w:rFonts w:asciiTheme="minorEastAsia" w:eastAsiaTheme="minorEastAsia" w:hAnsiTheme="minorEastAsia"/>
+              </w:rPr>
+            </w:pPr>
+            <w:r>
+              <w:rPr>
+                <w:rFonts w:asciiTheme="minorEastAsia" w:eastAsiaTheme="minorEastAsia" w:hAnsiTheme="minorEastAsia"/>
                 <w:spacing w:val="-4"/>
               </w:rPr>
               <w:t>유통기한</w:t>
@@ -2742,30 +2847,23 @@
             <w:pPr>
               <w:pStyle w:val="TableParagraph"/>
               <w:rPr>
-                <w:rFonts w:ascii="Times New Roman"/>
-                <w:sz w:val="20"/>
-              </w:rPr>
-            </w:pPr>
-            <w:r>
-              <w:rPr>
-                <w:rFonts w:ascii="Times New Roman"/>
+                <w:rFonts w:asciiTheme="minorEastAsia" w:eastAsiaTheme="minorEastAsia" w:hAnsiTheme="minorEastAsia"/>
+                <w:sz w:val="20"/>
+              </w:rPr>
+            </w:pPr>
+            <w:r>
+              <w:rPr>
+                <w:rFonts w:asciiTheme="minorEastAsia" w:eastAsiaTheme="minorEastAsia" w:hAnsiTheme="minorEastAsia"/>
                 <w:sz w:val="18"/>
               </w:rPr>
               <w:t>{</w:t>
             </w:r>
             <w:r>
               <w:rPr>
-                <w:rFonts w:ascii="Times New Roman" w:hint="eastAsia"/>
+                <w:rFonts w:asciiTheme="minorEastAsia" w:eastAsiaTheme="minorEastAsia" w:hAnsiTheme="minorEastAsia" w:hint="eastAsia"/>
                 <w:sz w:val="18"/>
               </w:rPr>
-              <w:t>유통기한</w:t>
-            </w:r>
-            <w:r>
-              <w:rPr>
-                <w:rFonts w:ascii="Times New Roman" w:hint="eastAsia"/>
-                <w:sz w:val="18"/>
-              </w:rPr>
-              <w:t>}</w:t>
+              <w:t>유통기한}</w:t>
             </w:r>
           </w:p>
         </w:tc>
@@ -2780,6 +2878,7 @@
           <w:p>
             <w:pPr>
               <w:rPr>
+                <w:rFonts w:asciiTheme="minorEastAsia" w:hAnsiTheme="minorEastAsia"/>
                 <w:sz w:val="2"/>
                 <w:szCs w:val="2"/>
               </w:rPr>
@@ -2800,25 +2899,16 @@
               <w:pStyle w:val="TableParagraph"/>
               <w:spacing w:line="253" w:lineRule="exact"/>
               <w:ind w:left="9"/>
-            </w:pPr>
-            <w:r>
-              <w:rPr>
+              <w:rPr>
+                <w:rFonts w:asciiTheme="minorEastAsia" w:eastAsiaTheme="minorEastAsia" w:hAnsiTheme="minorEastAsia"/>
+              </w:rPr>
+            </w:pPr>
+            <w:r>
+              <w:rPr>
+                <w:rFonts w:asciiTheme="minorEastAsia" w:eastAsiaTheme="minorEastAsia" w:hAnsiTheme="minorEastAsia"/>
                 <w:spacing w:val="-2"/>
               </w:rPr>
-              <w:t>수량</w:t>
-            </w:r>
-            <w:r>
-              <w:rPr>
-                <w:rFonts w:ascii="Calibri" w:eastAsia="Calibri"/>
-                <w:spacing w:val="-2"/>
-              </w:rPr>
-              <w:t>/</w:t>
-            </w:r>
-            <w:r>
-              <w:rPr>
-                <w:spacing w:val="-2"/>
-              </w:rPr>
-              <w:t>단위</w:t>
+              <w:t>수량/단위</w:t>
             </w:r>
           </w:p>
         </w:tc>
@@ -2831,30 +2921,16 @@
             <w:pPr>
               <w:pStyle w:val="TableParagraph"/>
               <w:rPr>
-                <w:rFonts w:ascii="Times New Roman"/>
-                <w:sz w:val="20"/>
-              </w:rPr>
-            </w:pPr>
-            <w:r>
-              <w:rPr>
-                <w:rFonts w:ascii="Times New Roman" w:hint="eastAsia"/>
-                <w:sz w:val="20"/>
-              </w:rPr>
-              <w:t>{</w:t>
-            </w:r>
-            <w:r>
-              <w:rPr>
-                <w:rFonts w:ascii="Times New Roman" w:hint="eastAsia"/>
-                <w:sz w:val="20"/>
-              </w:rPr>
-              <w:t>수량</w:t>
-            </w:r>
-            <w:r>
-              <w:rPr>
-                <w:rFonts w:ascii="Times New Roman" w:hint="eastAsia"/>
-                <w:sz w:val="20"/>
-              </w:rPr>
-              <w:t>}</w:t>
+                <w:rFonts w:asciiTheme="minorEastAsia" w:eastAsiaTheme="minorEastAsia" w:hAnsiTheme="minorEastAsia"/>
+                <w:sz w:val="20"/>
+              </w:rPr>
+            </w:pPr>
+            <w:r>
+              <w:rPr>
+                <w:rFonts w:asciiTheme="minorEastAsia" w:eastAsiaTheme="minorEastAsia" w:hAnsiTheme="minorEastAsia" w:hint="eastAsia"/>
+                <w:sz w:val="20"/>
+              </w:rPr>
+              <w:t>{수량}</w:t>
             </w:r>
           </w:p>
         </w:tc>
@@ -2869,6 +2945,7 @@
           <w:p>
             <w:pPr>
               <w:rPr>
+                <w:rFonts w:asciiTheme="minorEastAsia" w:hAnsiTheme="minorEastAsia"/>
                 <w:sz w:val="2"/>
                 <w:szCs w:val="2"/>
               </w:rPr>
@@ -2889,9 +2966,13 @@
               <w:pStyle w:val="TableParagraph"/>
               <w:spacing w:line="253" w:lineRule="exact"/>
               <w:ind w:left="9"/>
-            </w:pPr>
-            <w:r>
-              <w:rPr>
+              <w:rPr>
+                <w:rFonts w:asciiTheme="minorEastAsia" w:eastAsiaTheme="minorEastAsia" w:hAnsiTheme="minorEastAsia"/>
+              </w:rPr>
+            </w:pPr>
+            <w:r>
+              <w:rPr>
+                <w:rFonts w:asciiTheme="minorEastAsia" w:eastAsiaTheme="minorEastAsia" w:hAnsiTheme="minorEastAsia"/>
                 <w:spacing w:val="-4"/>
               </w:rPr>
               <w:t>시험번호</w:t>
@@ -2907,37 +2988,30 @@
             <w:pPr>
               <w:pStyle w:val="TableParagraph"/>
               <w:rPr>
-                <w:rFonts w:ascii="Times New Roman"/>
-                <w:sz w:val="20"/>
-              </w:rPr>
-            </w:pPr>
-            <w:r>
-              <w:rPr>
-                <w:rFonts w:ascii="Times New Roman" w:hint="eastAsia"/>
+                <w:rFonts w:asciiTheme="minorEastAsia" w:eastAsiaTheme="minorEastAsia" w:hAnsiTheme="minorEastAsia"/>
+                <w:sz w:val="20"/>
+              </w:rPr>
+            </w:pPr>
+            <w:r>
+              <w:rPr>
+                <w:rFonts w:asciiTheme="minorEastAsia" w:eastAsiaTheme="minorEastAsia" w:hAnsiTheme="minorEastAsia" w:hint="eastAsia"/>
                 <w:sz w:val="20"/>
               </w:rPr>
               <w:t>{</w:t>
             </w:r>
             <w:r>
               <w:rPr>
-                <w:rFonts w:ascii="Times New Roman"/>
+                <w:rFonts w:asciiTheme="minorEastAsia" w:eastAsiaTheme="minorEastAsia" w:hAnsiTheme="minorEastAsia"/>
                 <w:sz w:val="20"/>
               </w:rPr>
               <w:t>LOT</w:t>
             </w:r>
             <w:r>
               <w:rPr>
-                <w:rFonts w:ascii="Times New Roman" w:hint="eastAsia"/>
-                <w:sz w:val="20"/>
-              </w:rPr>
-              <w:t>번호</w:t>
-            </w:r>
-            <w:r>
-              <w:rPr>
-                <w:rFonts w:ascii="Times New Roman" w:hint="eastAsia"/>
-                <w:sz w:val="20"/>
-              </w:rPr>
-              <w:t>}</w:t>
+                <w:rFonts w:asciiTheme="minorEastAsia" w:eastAsiaTheme="minorEastAsia" w:hAnsiTheme="minorEastAsia" w:hint="eastAsia"/>
+                <w:sz w:val="20"/>
+              </w:rPr>
+              <w:t>번호}</w:t>
             </w:r>
           </w:p>
         </w:tc>
@@ -2951,36 +3025,52 @@
               <w:spacing w:line="253" w:lineRule="exact"/>
               <w:ind w:left="838"/>
               <w:jc w:val="left"/>
-            </w:pPr>
-            <w:r>
+              <w:rPr>
+                <w:rFonts w:asciiTheme="minorEastAsia" w:eastAsiaTheme="minorEastAsia" w:hAnsiTheme="minorEastAsia"/>
+              </w:rPr>
+            </w:pPr>
+            <w:r>
+              <w:rPr>
+                <w:rFonts w:asciiTheme="minorEastAsia" w:eastAsiaTheme="minorEastAsia" w:hAnsiTheme="minorEastAsia"/>
+              </w:rPr>
               <w:t>조</w:t>
             </w:r>
             <w:r>
               <w:rPr>
+                <w:rFonts w:asciiTheme="minorEastAsia" w:eastAsiaTheme="minorEastAsia" w:hAnsiTheme="minorEastAsia"/>
                 <w:spacing w:val="36"/>
               </w:rPr>
               <w:t xml:space="preserve"> </w:t>
             </w:r>
             <w:r>
+              <w:rPr>
+                <w:rFonts w:asciiTheme="minorEastAsia" w:eastAsiaTheme="minorEastAsia" w:hAnsiTheme="minorEastAsia"/>
+              </w:rPr>
               <w:t>치</w:t>
             </w:r>
             <w:r>
               <w:rPr>
+                <w:rFonts w:asciiTheme="minorEastAsia" w:eastAsiaTheme="minorEastAsia" w:hAnsiTheme="minorEastAsia"/>
                 <w:spacing w:val="32"/>
               </w:rPr>
               <w:t xml:space="preserve"> </w:t>
             </w:r>
             <w:r>
+              <w:rPr>
+                <w:rFonts w:asciiTheme="minorEastAsia" w:eastAsiaTheme="minorEastAsia" w:hAnsiTheme="minorEastAsia"/>
+              </w:rPr>
               <w:t>사</w:t>
             </w:r>
             <w:r>
               <w:rPr>
+                <w:rFonts w:asciiTheme="minorEastAsia" w:eastAsiaTheme="minorEastAsia" w:hAnsiTheme="minorEastAsia"/>
                 <w:spacing w:val="36"/>
               </w:rPr>
               <w:t xml:space="preserve"> </w:t>
             </w:r>
             <w:r>
               <w:rPr>
+                <w:rFonts w:asciiTheme="minorEastAsia" w:eastAsiaTheme="minorEastAsia" w:hAnsiTheme="minorEastAsia"/>
                 <w:spacing w:val="-10"/>
               </w:rPr>
               <w:t>항</w:t>
@@ -3001,18 +3091,26 @@
               <w:pStyle w:val="TableParagraph"/>
               <w:spacing w:line="248" w:lineRule="exact"/>
               <w:ind w:left="13"/>
-            </w:pPr>
-            <w:r>
+              <w:rPr>
+                <w:rFonts w:asciiTheme="minorEastAsia" w:eastAsiaTheme="minorEastAsia" w:hAnsiTheme="minorEastAsia"/>
+              </w:rPr>
+            </w:pPr>
+            <w:r>
+              <w:rPr>
+                <w:rFonts w:asciiTheme="minorEastAsia" w:eastAsiaTheme="minorEastAsia" w:hAnsiTheme="minorEastAsia"/>
+              </w:rPr>
               <w:t>시험</w:t>
             </w:r>
             <w:r>
               <w:rPr>
+                <w:rFonts w:asciiTheme="minorEastAsia" w:eastAsiaTheme="minorEastAsia" w:hAnsiTheme="minorEastAsia"/>
                 <w:spacing w:val="31"/>
               </w:rPr>
               <w:t xml:space="preserve"> </w:t>
             </w:r>
             <w:r>
               <w:rPr>
+                <w:rFonts w:asciiTheme="minorEastAsia" w:eastAsiaTheme="minorEastAsia" w:hAnsiTheme="minorEastAsia"/>
                 <w:spacing w:val="-5"/>
               </w:rPr>
               <w:t>의뢰일</w:t>
@@ -3028,30 +3126,16 @@
             <w:pPr>
               <w:pStyle w:val="TableParagraph"/>
               <w:rPr>
-                <w:rFonts w:ascii="Times New Roman"/>
+                <w:rFonts w:asciiTheme="minorEastAsia" w:eastAsiaTheme="minorEastAsia" w:hAnsiTheme="minorEastAsia"/>
                 <w:sz w:val="18"/>
               </w:rPr>
             </w:pPr>
             <w:r>
               <w:rPr>
-                <w:rFonts w:ascii="Times New Roman" w:hint="eastAsia"/>
-                <w:sz w:val="20"/>
-              </w:rPr>
-              <w:t>{</w:t>
-            </w:r>
-            <w:r>
-              <w:rPr>
-                <w:rFonts w:ascii="Times New Roman" w:hint="eastAsia"/>
-                <w:sz w:val="20"/>
-              </w:rPr>
-              <w:t>오늘날짜</w:t>
-            </w:r>
-            <w:r>
-              <w:rPr>
-                <w:rFonts w:ascii="Times New Roman" w:hint="eastAsia"/>
-                <w:sz w:val="20"/>
-              </w:rPr>
-              <w:t>}</w:t>
+                <w:rFonts w:asciiTheme="minorEastAsia" w:eastAsiaTheme="minorEastAsia" w:hAnsiTheme="minorEastAsia" w:hint="eastAsia"/>
+                <w:sz w:val="20"/>
+              </w:rPr>
+              <w:t>{오늘날짜}</w:t>
             </w:r>
           </w:p>
         </w:tc>
@@ -3065,7 +3149,7 @@
               <w:pStyle w:val="TableParagraph"/>
               <w:jc w:val="left"/>
               <w:rPr>
-                <w:rFonts w:ascii="Times New Roman"/>
+                <w:rFonts w:asciiTheme="minorEastAsia" w:eastAsiaTheme="minorEastAsia" w:hAnsiTheme="minorEastAsia"/>
                 <w:sz w:val="24"/>
               </w:rPr>
             </w:pPr>
@@ -3085,10 +3169,14 @@
               <w:pStyle w:val="TableParagraph"/>
               <w:spacing w:line="253" w:lineRule="exact"/>
               <w:ind w:left="9"/>
+              <w:rPr>
+                <w:rFonts w:asciiTheme="minorEastAsia" w:eastAsiaTheme="minorEastAsia" w:hAnsiTheme="minorEastAsia"/>
+              </w:rPr>
             </w:pPr>
             <w:proofErr w:type="spellStart"/>
             <w:r>
               <w:rPr>
+                <w:rFonts w:asciiTheme="minorEastAsia" w:eastAsiaTheme="minorEastAsia" w:hAnsiTheme="minorEastAsia"/>
                 <w:spacing w:val="-2"/>
               </w:rPr>
               <w:t>검체채취일</w:t>
@@ -3104,30 +3192,16 @@
             <w:pPr>
               <w:pStyle w:val="TableParagraph"/>
               <w:rPr>
-                <w:rFonts w:ascii="Times New Roman"/>
-                <w:sz w:val="20"/>
-              </w:rPr>
-            </w:pPr>
-            <w:r>
-              <w:rPr>
-                <w:rFonts w:ascii="Times New Roman" w:hint="eastAsia"/>
-                <w:sz w:val="20"/>
-              </w:rPr>
-              <w:t>{</w:t>
-            </w:r>
-            <w:r>
-              <w:rPr>
-                <w:rFonts w:ascii="Times New Roman" w:hint="eastAsia"/>
-                <w:sz w:val="20"/>
-              </w:rPr>
-              <w:t>오늘날짜</w:t>
-            </w:r>
-            <w:r>
-              <w:rPr>
-                <w:rFonts w:ascii="Times New Roman" w:hint="eastAsia"/>
-                <w:sz w:val="20"/>
-              </w:rPr>
-              <w:t>}</w:t>
+                <w:rFonts w:asciiTheme="minorEastAsia" w:eastAsiaTheme="minorEastAsia" w:hAnsiTheme="minorEastAsia"/>
+                <w:sz w:val="20"/>
+              </w:rPr>
+            </w:pPr>
+            <w:r>
+              <w:rPr>
+                <w:rFonts w:asciiTheme="minorEastAsia" w:eastAsiaTheme="minorEastAsia" w:hAnsiTheme="minorEastAsia" w:hint="eastAsia"/>
+                <w:sz w:val="20"/>
+              </w:rPr>
+              <w:t>{오늘날짜}</w:t>
             </w:r>
           </w:p>
         </w:tc>
@@ -3140,27 +3214,39 @@
               <w:pStyle w:val="TableParagraph"/>
               <w:spacing w:line="253" w:lineRule="exact"/>
               <w:ind w:left="7"/>
-            </w:pPr>
-            <w:r>
+              <w:rPr>
+                <w:rFonts w:asciiTheme="minorEastAsia" w:eastAsiaTheme="minorEastAsia" w:hAnsiTheme="minorEastAsia"/>
+              </w:rPr>
+            </w:pPr>
+            <w:r>
+              <w:rPr>
+                <w:rFonts w:asciiTheme="minorEastAsia" w:eastAsiaTheme="minorEastAsia" w:hAnsiTheme="minorEastAsia"/>
+              </w:rPr>
               <w:t>판</w:t>
             </w:r>
             <w:r>
               <w:rPr>
+                <w:rFonts w:asciiTheme="minorEastAsia" w:eastAsiaTheme="minorEastAsia" w:hAnsiTheme="minorEastAsia"/>
                 <w:spacing w:val="36"/>
               </w:rPr>
               <w:t xml:space="preserve"> </w:t>
             </w:r>
             <w:r>
+              <w:rPr>
+                <w:rFonts w:asciiTheme="minorEastAsia" w:eastAsiaTheme="minorEastAsia" w:hAnsiTheme="minorEastAsia"/>
+              </w:rPr>
               <w:t>정</w:t>
             </w:r>
             <w:r>
               <w:rPr>
+                <w:rFonts w:asciiTheme="minorEastAsia" w:eastAsiaTheme="minorEastAsia" w:hAnsiTheme="minorEastAsia"/>
                 <w:spacing w:val="32"/>
               </w:rPr>
               <w:t xml:space="preserve"> </w:t>
             </w:r>
             <w:r>
               <w:rPr>
+                <w:rFonts w:asciiTheme="minorEastAsia" w:eastAsiaTheme="minorEastAsia" w:hAnsiTheme="minorEastAsia"/>
                 <w:spacing w:val="-10"/>
               </w:rPr>
               <w:t>일</w:t>
@@ -3175,30 +3261,16 @@
             <w:pPr>
               <w:pStyle w:val="TableParagraph"/>
               <w:rPr>
-                <w:rFonts w:ascii="Times New Roman"/>
-                <w:sz w:val="20"/>
-              </w:rPr>
-            </w:pPr>
-            <w:r>
-              <w:rPr>
-                <w:rFonts w:ascii="Times New Roman" w:hint="eastAsia"/>
-                <w:sz w:val="20"/>
-              </w:rPr>
-              <w:t>{</w:t>
-            </w:r>
-            <w:r>
-              <w:rPr>
-                <w:rFonts w:ascii="Times New Roman" w:hint="eastAsia"/>
-                <w:sz w:val="20"/>
-              </w:rPr>
-              <w:t>오늘날짜</w:t>
-            </w:r>
-            <w:r>
-              <w:rPr>
-                <w:rFonts w:ascii="Times New Roman" w:hint="eastAsia"/>
-                <w:sz w:val="20"/>
-              </w:rPr>
-              <w:t>}</w:t>
+                <w:rFonts w:asciiTheme="minorEastAsia" w:eastAsiaTheme="minorEastAsia" w:hAnsiTheme="minorEastAsia"/>
+                <w:sz w:val="20"/>
+              </w:rPr>
+            </w:pPr>
+            <w:r>
+              <w:rPr>
+                <w:rFonts w:asciiTheme="minorEastAsia" w:eastAsiaTheme="minorEastAsia" w:hAnsiTheme="minorEastAsia" w:hint="eastAsia"/>
+                <w:sz w:val="20"/>
+              </w:rPr>
+              <w:t>{오늘날짜}</w:t>
             </w:r>
           </w:p>
         </w:tc>
@@ -3213,6 +3285,7 @@
           <w:p>
             <w:pPr>
               <w:rPr>
+                <w:rFonts w:asciiTheme="minorEastAsia" w:hAnsiTheme="minorEastAsia"/>
                 <w:sz w:val="2"/>
                 <w:szCs w:val="2"/>
               </w:rPr>
@@ -3233,10 +3306,14 @@
               <w:pStyle w:val="TableParagraph"/>
               <w:spacing w:line="248" w:lineRule="exact"/>
               <w:ind w:left="9"/>
+              <w:rPr>
+                <w:rFonts w:asciiTheme="minorEastAsia" w:eastAsiaTheme="minorEastAsia" w:hAnsiTheme="minorEastAsia"/>
+              </w:rPr>
             </w:pPr>
             <w:proofErr w:type="spellStart"/>
             <w:r>
               <w:rPr>
+                <w:rFonts w:asciiTheme="minorEastAsia" w:eastAsiaTheme="minorEastAsia" w:hAnsiTheme="minorEastAsia"/>
                 <w:spacing w:val="-2"/>
               </w:rPr>
               <w:t>검체채취자</w:t>
@@ -3252,13 +3329,13 @@
             <w:pPr>
               <w:pStyle w:val="TableParagraph"/>
               <w:rPr>
-                <w:rFonts w:ascii="Times New Roman"/>
+                <w:rFonts w:asciiTheme="minorEastAsia" w:eastAsiaTheme="minorEastAsia" w:hAnsiTheme="minorEastAsia"/>
                 <w:sz w:val="18"/>
               </w:rPr>
             </w:pPr>
             <w:r>
               <w:rPr>
-                <w:rFonts w:ascii="Times New Roman" w:hint="eastAsia"/>
+                <w:rFonts w:asciiTheme="minorEastAsia" w:eastAsiaTheme="minorEastAsia" w:hAnsiTheme="minorEastAsia" w:hint="eastAsia"/>
                 <w:sz w:val="18"/>
               </w:rPr>
               <w:t>이상은</w:t>
@@ -3274,27 +3351,39 @@
               <w:pStyle w:val="TableParagraph"/>
               <w:spacing w:line="248" w:lineRule="exact"/>
               <w:ind w:left="7"/>
-            </w:pPr>
-            <w:r>
+              <w:rPr>
+                <w:rFonts w:asciiTheme="minorEastAsia" w:eastAsiaTheme="minorEastAsia" w:hAnsiTheme="minorEastAsia"/>
+              </w:rPr>
+            </w:pPr>
+            <w:r>
+              <w:rPr>
+                <w:rFonts w:asciiTheme="minorEastAsia" w:eastAsiaTheme="minorEastAsia" w:hAnsiTheme="minorEastAsia"/>
+              </w:rPr>
               <w:t>확</w:t>
             </w:r>
             <w:r>
               <w:rPr>
+                <w:rFonts w:asciiTheme="minorEastAsia" w:eastAsiaTheme="minorEastAsia" w:hAnsiTheme="minorEastAsia"/>
                 <w:spacing w:val="36"/>
               </w:rPr>
               <w:t xml:space="preserve"> </w:t>
             </w:r>
             <w:r>
+              <w:rPr>
+                <w:rFonts w:asciiTheme="minorEastAsia" w:eastAsiaTheme="minorEastAsia" w:hAnsiTheme="minorEastAsia"/>
+              </w:rPr>
               <w:t>인</w:t>
             </w:r>
             <w:r>
               <w:rPr>
+                <w:rFonts w:asciiTheme="minorEastAsia" w:eastAsiaTheme="minorEastAsia" w:hAnsiTheme="minorEastAsia"/>
                 <w:spacing w:val="32"/>
               </w:rPr>
               <w:t xml:space="preserve"> </w:t>
             </w:r>
             <w:r>
               <w:rPr>
+                <w:rFonts w:asciiTheme="minorEastAsia" w:eastAsiaTheme="minorEastAsia" w:hAnsiTheme="minorEastAsia"/>
                 <w:spacing w:val="-10"/>
               </w:rPr>
               <w:t>자</w:t>
@@ -3309,7 +3398,7 @@
             <w:pPr>
               <w:pStyle w:val="TableParagraph"/>
               <w:rPr>
-                <w:rFonts w:ascii="Times New Roman"/>
+                <w:rFonts w:asciiTheme="minorEastAsia" w:eastAsiaTheme="minorEastAsia" w:hAnsiTheme="minorEastAsia"/>
                 <w:sz w:val="18"/>
               </w:rPr>
             </w:pPr>
@@ -3326,6 +3415,7 @@
           <w:p>
             <w:pPr>
               <w:rPr>
+                <w:rFonts w:asciiTheme="minorEastAsia" w:hAnsiTheme="minorEastAsia"/>
                 <w:sz w:val="2"/>
                 <w:szCs w:val="2"/>
               </w:rPr>
@@ -3336,9 +3426,8 @@
     </w:tbl>
     <w:p>
       <w:pPr>
-        <w:spacing w:before="0"/>
         <w:rPr>
-          <w:rFonts w:ascii="Times New Roman"/>
+          <w:rFonts w:asciiTheme="minorEastAsia" w:hAnsiTheme="minorEastAsia"/>
           <w:sz w:val="20"/>
         </w:rPr>
       </w:pPr>
@@ -3368,7 +3457,7 @@
       </w:tblGrid>
       <w:tr>
         <w:trPr>
-          <w:trHeight w:val="690"/>
+          <w:trHeight w:val="70"/>
         </w:trPr>
         <w:tc>
           <w:tcPr>
@@ -3378,14 +3467,16 @@
           <w:p>
             <w:pPr>
               <w:pStyle w:val="TableParagraph"/>
-              <w:spacing w:before="0" w:line="502" w:lineRule="exact"/>
+              <w:spacing w:line="502" w:lineRule="exact"/>
               <w:ind w:left="3"/>
               <w:rPr>
+                <w:rFonts w:asciiTheme="minorEastAsia" w:eastAsiaTheme="minorEastAsia" w:hAnsiTheme="minorEastAsia"/>
                 <w:sz w:val="40"/>
               </w:rPr>
             </w:pPr>
             <w:r>
               <w:rPr>
+                <w:rFonts w:asciiTheme="minorEastAsia" w:eastAsiaTheme="minorEastAsia" w:hAnsiTheme="minorEastAsia"/>
                 <w:spacing w:val="-2"/>
                 <w:sz w:val="40"/>
               </w:rPr>
@@ -3400,12 +3491,15 @@
           <w:p>
             <w:pPr>
               <w:pStyle w:val="TableParagraph"/>
-              <w:spacing w:before="0"/>
               <w:ind w:left="11"/>
+              <w:rPr>
+                <w:rFonts w:asciiTheme="minorEastAsia" w:eastAsiaTheme="minorEastAsia" w:hAnsiTheme="minorEastAsia"/>
+              </w:rPr>
             </w:pPr>
             <w:proofErr w:type="spellStart"/>
             <w:r>
               <w:rPr>
+                <w:rFonts w:asciiTheme="minorEastAsia" w:eastAsiaTheme="minorEastAsia" w:hAnsiTheme="minorEastAsia"/>
                 <w:spacing w:val="-2"/>
               </w:rPr>
               <w:t>시험중</w:t>
@@ -3413,43 +3507,47 @@
             <w:proofErr w:type="spellEnd"/>
             <w:r>
               <w:rPr>
-                <w:rFonts w:ascii="Calibri" w:eastAsia="Calibri"/>
+                <w:rFonts w:asciiTheme="minorEastAsia" w:eastAsiaTheme="minorEastAsia" w:hAnsiTheme="minorEastAsia"/>
                 <w:spacing w:val="-2"/>
               </w:rPr>
               <w:t>/</w:t>
             </w:r>
             <w:r>
               <w:rPr>
+                <w:rFonts w:asciiTheme="minorEastAsia" w:eastAsiaTheme="minorEastAsia" w:hAnsiTheme="minorEastAsia"/>
                 <w:spacing w:val="-2"/>
               </w:rPr>
               <w:t>적합</w:t>
             </w:r>
             <w:r>
               <w:rPr>
-                <w:rFonts w:ascii="Calibri" w:eastAsia="Calibri"/>
+                <w:rFonts w:asciiTheme="minorEastAsia" w:eastAsiaTheme="minorEastAsia" w:hAnsiTheme="minorEastAsia"/>
                 <w:spacing w:val="-2"/>
               </w:rPr>
               <w:t>/</w:t>
             </w:r>
             <w:r>
               <w:rPr>
+                <w:rFonts w:asciiTheme="minorEastAsia" w:eastAsiaTheme="minorEastAsia" w:hAnsiTheme="minorEastAsia"/>
                 <w:spacing w:val="-2"/>
               </w:rPr>
               <w:t>부적합</w:t>
             </w:r>
-          </w:p>
-          <w:p>
-            <w:pPr>
-              <w:pStyle w:val="TableParagraph"/>
-              <w:spacing w:before="0" w:line="271" w:lineRule="exact"/>
-              <w:ind w:left="11" w:right="4"/>
-            </w:pPr>
-            <w:r>
-              <w:rPr>
+            <w:r>
+              <w:rPr>
+                <w:rFonts w:asciiTheme="minorEastAsia" w:eastAsiaTheme="minorEastAsia" w:hAnsiTheme="minorEastAsia" w:hint="eastAsia"/>
+              </w:rPr>
+              <w:t xml:space="preserve"> </w:t>
+            </w:r>
+            <w:proofErr w:type="spellStart"/>
+            <w:r>
+              <w:rPr>
+                <w:rFonts w:asciiTheme="minorEastAsia" w:eastAsiaTheme="minorEastAsia" w:hAnsiTheme="minorEastAsia"/>
                 <w:spacing w:val="-5"/>
               </w:rPr>
               <w:t>표시서</w:t>
             </w:r>
+            <w:proofErr w:type="spellEnd"/>
           </w:p>
         </w:tc>
       </w:tr>
@@ -3467,20 +3565,27 @@
               <w:tabs>
                 <w:tab w:val="left" w:pos="665"/>
               </w:tabs>
-              <w:spacing w:before="0"/>
               <w:ind w:left="8"/>
-            </w:pPr>
-            <w:r>
-              <w:rPr>
+              <w:rPr>
+                <w:rFonts w:asciiTheme="minorEastAsia" w:eastAsiaTheme="minorEastAsia" w:hAnsiTheme="minorEastAsia"/>
+              </w:rPr>
+            </w:pPr>
+            <w:r>
+              <w:rPr>
+                <w:rFonts w:asciiTheme="minorEastAsia" w:eastAsiaTheme="minorEastAsia" w:hAnsiTheme="minorEastAsia"/>
                 <w:spacing w:val="-10"/>
               </w:rPr>
               <w:t>구</w:t>
             </w:r>
             <w:r>
+              <w:rPr>
+                <w:rFonts w:asciiTheme="minorEastAsia" w:eastAsiaTheme="minorEastAsia" w:hAnsiTheme="minorEastAsia"/>
+              </w:rPr>
               <w:tab/>
             </w:r>
             <w:r>
               <w:rPr>
+                <w:rFonts w:asciiTheme="minorEastAsia" w:eastAsiaTheme="minorEastAsia" w:hAnsiTheme="minorEastAsia"/>
                 <w:spacing w:val="-10"/>
               </w:rPr>
               <w:t>분</w:t>
@@ -3505,15 +3610,16 @@
                 <w:tab w:val="left" w:pos="2542"/>
                 <w:tab w:val="left" w:pos="3857"/>
               </w:tabs>
-              <w:spacing w:before="0"/>
               <w:ind w:hanging="292"/>
               <w:jc w:val="left"/>
               <w:rPr>
-                <w:sz w:val="24"/>
-              </w:rPr>
-            </w:pPr>
-            <w:r>
-              <w:rPr>
+                <w:rFonts w:asciiTheme="minorEastAsia" w:eastAsiaTheme="minorEastAsia" w:hAnsiTheme="minorEastAsia"/>
+                <w:sz w:val="24"/>
+              </w:rPr>
+            </w:pPr>
+            <w:r>
+              <w:rPr>
+                <w:rFonts w:asciiTheme="minorEastAsia" w:eastAsiaTheme="minorEastAsia" w:hAnsiTheme="minorEastAsia"/>
                 <w:spacing w:val="-5"/>
                 <w:w w:val="105"/>
                 <w:sz w:val="24"/>
@@ -3522,13 +3628,14 @@
             </w:r>
             <w:r>
               <w:rPr>
+                <w:rFonts w:asciiTheme="minorEastAsia" w:eastAsiaTheme="minorEastAsia" w:hAnsiTheme="minorEastAsia"/>
                 <w:sz w:val="24"/>
               </w:rPr>
               <w:tab/>
             </w:r>
             <w:r>
               <w:rPr>
-                <w:rFonts w:ascii="Meiryo UI" w:eastAsia="Meiryo UI" w:hAnsi="Meiryo UI"/>
+                <w:rFonts w:ascii="Segoe UI Symbol" w:eastAsiaTheme="minorEastAsia" w:hAnsi="Segoe UI Symbol" w:cs="Segoe UI Symbol"/>
                 <w:w w:val="105"/>
                 <w:sz w:val="24"/>
               </w:rPr>
@@ -3536,7 +3643,7 @@
             </w:r>
             <w:r>
               <w:rPr>
-                <w:rFonts w:ascii="Meiryo UI" w:eastAsia="Meiryo UI" w:hAnsi="Meiryo UI"/>
+                <w:rFonts w:asciiTheme="minorEastAsia" w:eastAsiaTheme="minorEastAsia" w:hAnsiTheme="minorEastAsia"/>
                 <w:spacing w:val="46"/>
                 <w:w w:val="105"/>
                 <w:sz w:val="24"/>
@@ -3545,6 +3652,7 @@
             </w:r>
             <w:r>
               <w:rPr>
+                <w:rFonts w:asciiTheme="minorEastAsia" w:eastAsiaTheme="minorEastAsia" w:hAnsiTheme="minorEastAsia"/>
                 <w:spacing w:val="-5"/>
                 <w:w w:val="105"/>
                 <w:sz w:val="24"/>
@@ -3553,13 +3661,14 @@
             </w:r>
             <w:r>
               <w:rPr>
+                <w:rFonts w:asciiTheme="minorEastAsia" w:eastAsiaTheme="minorEastAsia" w:hAnsiTheme="minorEastAsia"/>
                 <w:sz w:val="24"/>
               </w:rPr>
               <w:tab/>
             </w:r>
             <w:r>
               <w:rPr>
-                <w:rFonts w:ascii="Meiryo UI" w:eastAsia="Meiryo UI" w:hAnsi="Meiryo UI"/>
+                <w:rFonts w:ascii="Segoe UI Symbol" w:eastAsiaTheme="minorEastAsia" w:hAnsi="Segoe UI Symbol" w:cs="Segoe UI Symbol"/>
                 <w:w w:val="105"/>
                 <w:sz w:val="24"/>
               </w:rPr>
@@ -3567,7 +3676,7 @@
             </w:r>
             <w:r>
               <w:rPr>
-                <w:rFonts w:ascii="Meiryo UI" w:eastAsia="Meiryo UI" w:hAnsi="Meiryo UI"/>
+                <w:rFonts w:asciiTheme="minorEastAsia" w:eastAsiaTheme="minorEastAsia" w:hAnsiTheme="minorEastAsia"/>
                 <w:spacing w:val="50"/>
                 <w:w w:val="105"/>
                 <w:sz w:val="24"/>
@@ -3576,6 +3685,7 @@
             </w:r>
             <w:r>
               <w:rPr>
+                <w:rFonts w:asciiTheme="minorEastAsia" w:eastAsiaTheme="minorEastAsia" w:hAnsiTheme="minorEastAsia"/>
                 <w:spacing w:val="-5"/>
                 <w:w w:val="105"/>
                 <w:sz w:val="24"/>
@@ -3584,13 +3694,14 @@
             </w:r>
             <w:r>
               <w:rPr>
+                <w:rFonts w:asciiTheme="minorEastAsia" w:eastAsiaTheme="minorEastAsia" w:hAnsiTheme="minorEastAsia"/>
                 <w:sz w:val="24"/>
               </w:rPr>
               <w:tab/>
             </w:r>
             <w:r>
               <w:rPr>
-                <w:rFonts w:ascii="Meiryo UI" w:eastAsia="Meiryo UI" w:hAnsi="Meiryo UI"/>
+                <w:rFonts w:ascii="Segoe UI Symbol" w:eastAsiaTheme="minorEastAsia" w:hAnsi="Segoe UI Symbol" w:cs="Segoe UI Symbol"/>
                 <w:w w:val="105"/>
                 <w:sz w:val="24"/>
               </w:rPr>
@@ -3598,7 +3709,7 @@
             </w:r>
             <w:r>
               <w:rPr>
-                <w:rFonts w:ascii="Meiryo UI" w:eastAsia="Meiryo UI" w:hAnsi="Meiryo UI"/>
+                <w:rFonts w:asciiTheme="minorEastAsia" w:eastAsiaTheme="minorEastAsia" w:hAnsiTheme="minorEastAsia"/>
                 <w:spacing w:val="46"/>
                 <w:w w:val="105"/>
                 <w:sz w:val="24"/>
@@ -3607,6 +3718,7 @@
             </w:r>
             <w:r>
               <w:rPr>
+                <w:rFonts w:asciiTheme="minorEastAsia" w:eastAsiaTheme="minorEastAsia" w:hAnsiTheme="minorEastAsia"/>
                 <w:spacing w:val="-5"/>
                 <w:w w:val="105"/>
                 <w:sz w:val="24"/>
@@ -3623,10 +3735,9 @@
           <w:p>
             <w:pPr>
               <w:pStyle w:val="TableParagraph"/>
-              <w:spacing w:before="0"/>
               <w:jc w:val="left"/>
               <w:rPr>
-                <w:rFonts w:ascii="Times New Roman"/>
+                <w:rFonts w:asciiTheme="minorEastAsia" w:eastAsiaTheme="minorEastAsia" w:hAnsiTheme="minorEastAsia"/>
                 <w:sz w:val="30"/>
               </w:rPr>
             </w:pPr>
@@ -3634,21 +3745,22 @@
           <w:p>
             <w:pPr>
               <w:pStyle w:val="TableParagraph"/>
-              <w:spacing w:before="0"/>
               <w:ind w:left="11" w:right="4"/>
               <w:rPr>
+                <w:rFonts w:asciiTheme="minorEastAsia" w:eastAsiaTheme="minorEastAsia" w:hAnsiTheme="minorEastAsia"/>
                 <w:sz w:val="30"/>
               </w:rPr>
             </w:pPr>
             <w:r>
               <w:rPr>
+                <w:rFonts w:asciiTheme="minorEastAsia" w:eastAsiaTheme="minorEastAsia" w:hAnsiTheme="minorEastAsia"/>
                 <w:noProof/>
                 <w:sz w:val="30"/>
               </w:rPr>
               <mc:AlternateContent>
                 <mc:Choice Requires="wpg">
                   <w:drawing>
-                    <wp:anchor distT="0" distB="0" distL="0" distR="0" simplePos="0" relativeHeight="487404032" behindDoc="1" locked="0" layoutInCell="1" allowOverlap="1" wp14:anchorId="6B8EC5F2" wp14:editId="5F4CD3EA">
+                    <wp:anchor distT="0" distB="0" distL="0" distR="0" simplePos="0" relativeHeight="251661824" behindDoc="1" locked="0" layoutInCell="1" allowOverlap="1" wp14:anchorId="6B8EC5F2" wp14:editId="5F4CD3EA">
                       <wp:simplePos x="0" y="0"/>
                       <wp:positionH relativeFrom="column">
                         <wp:posOffset>540994</wp:posOffset>
@@ -3683,7 +3795,7 @@
                                 <pic:cNvPicPr/>
                               </pic:nvPicPr>
                               <pic:blipFill>
-                                <a:blip r:embed="rId11" cstate="print"/>
+                                <a:blip r:embed="rId12" cstate="print"/>
                                 <a:stretch>
                                   <a:fillRect/>
                                 </a:stretch>
@@ -3706,9 +3818,9 @@
                 </mc:Choice>
                 <mc:Fallback>
                   <w:pict>
-                    <v:group w14:anchorId="1150C8A2" id="Group 7" o:spid="_x0000_s1026" style="position:absolute;margin-left:42.6pt;margin-top:-19.4pt;width:59.3pt;height:58.8pt;z-index:-15912448;mso-wrap-distance-left:0;mso-wrap-distance-right:0" coordsize="7531,7467" o:gfxdata="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">
-                      <v:shape id="Image 8" o:spid="_x0000_s1027" type="#_x0000_t75" style="position:absolute;width:7538;height:7477;visibility:visible;mso-wrap-style:square" o:gfxdata="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">
-                        <v:imagedata r:id="rId12" o:title=""/>
+                    <v:group w14:anchorId="289DA39B" id="Group 7" o:spid="_x0000_s1026" style="position:absolute;left:0;text-align:left;margin-left:42.6pt;margin-top:-19.4pt;width:59.3pt;height:58.8pt;z-index:-251654656;mso-wrap-distance-left:0;mso-wrap-distance-right:0" coordsize="7531,7467" o:gfxdata="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">
+                      <v:shape id="Image 8" o:spid="_x0000_s1027" type="#_x0000_t75" style="position:absolute;width:7538;height:7477;visibility:visible;mso-wrap-style:square" o:gfxdata="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">
+                        <v:imagedata r:id="rId13" o:title=""/>
                       </v:shape>
                     </v:group>
                   </w:pict>
@@ -3717,6 +3829,7 @@
             </w:r>
             <w:r>
               <w:rPr>
+                <w:rFonts w:asciiTheme="minorEastAsia" w:eastAsiaTheme="minorEastAsia" w:hAnsiTheme="minorEastAsia"/>
                 <w:spacing w:val="-5"/>
                 <w:sz w:val="30"/>
               </w:rPr>
@@ -3741,18 +3854,26 @@
               </w:tabs>
               <w:spacing w:line="253" w:lineRule="exact"/>
               <w:ind w:left="119"/>
-            </w:pPr>
-            <w:r>
-              <w:rPr>
+              <w:rPr>
+                <w:rFonts w:asciiTheme="minorEastAsia" w:eastAsiaTheme="minorEastAsia" w:hAnsiTheme="minorEastAsia"/>
+              </w:rPr>
+            </w:pPr>
+            <w:r>
+              <w:rPr>
+                <w:rFonts w:asciiTheme="minorEastAsia" w:eastAsiaTheme="minorEastAsia" w:hAnsiTheme="minorEastAsia"/>
                 <w:spacing w:val="-10"/>
               </w:rPr>
               <w:t>품</w:t>
             </w:r>
             <w:r>
+              <w:rPr>
+                <w:rFonts w:asciiTheme="minorEastAsia" w:eastAsiaTheme="minorEastAsia" w:hAnsiTheme="minorEastAsia"/>
+              </w:rPr>
               <w:tab/>
             </w:r>
             <w:r>
               <w:rPr>
+                <w:rFonts w:asciiTheme="minorEastAsia" w:eastAsiaTheme="minorEastAsia" w:hAnsiTheme="minorEastAsia"/>
                 <w:spacing w:val="-10"/>
               </w:rPr>
               <w:t>명</w:t>
@@ -3768,13 +3889,13 @@
             <w:pPr>
               <w:pStyle w:val="TableParagraph"/>
               <w:rPr>
-                <w:rFonts w:ascii="Times New Roman"/>
-                <w:sz w:val="20"/>
-              </w:rPr>
-            </w:pPr>
-            <w:r>
-              <w:rPr>
-                <w:rFonts w:ascii="맑은 고딕" w:eastAsia="맑은 고딕" w:cs="맑은 고딕"/>
+                <w:rFonts w:asciiTheme="minorEastAsia" w:eastAsiaTheme="minorEastAsia" w:hAnsiTheme="minorEastAsia"/>
+                <w:sz w:val="20"/>
+              </w:rPr>
+            </w:pPr>
+            <w:r>
+              <w:rPr>
+                <w:rFonts w:asciiTheme="minorEastAsia" w:eastAsiaTheme="minorEastAsia" w:hAnsiTheme="minorEastAsia" w:cs="맑은 고딕"/>
                 <w:sz w:val="20"/>
                 <w:szCs w:val="20"/>
               </w:rPr>
@@ -3782,7 +3903,7 @@
             </w:r>
             <w:r>
               <w:rPr>
-                <w:rFonts w:ascii="맑은 고딕" w:eastAsia="맑은 고딕" w:cs="맑은 고딕" w:hint="eastAsia"/>
+                <w:rFonts w:asciiTheme="minorEastAsia" w:eastAsiaTheme="minorEastAsia" w:hAnsiTheme="minorEastAsia" w:cs="맑은 고딕" w:hint="eastAsia"/>
                 <w:sz w:val="20"/>
                 <w:szCs w:val="20"/>
               </w:rPr>
@@ -3790,7 +3911,7 @@
             </w:r>
             <w:r>
               <w:rPr>
-                <w:rFonts w:ascii="맑은 고딕" w:eastAsia="맑은 고딕" w:cs="맑은 고딕"/>
+                <w:rFonts w:asciiTheme="minorEastAsia" w:eastAsiaTheme="minorEastAsia" w:hAnsiTheme="minorEastAsia" w:cs="맑은 고딕"/>
                 <w:sz w:val="20"/>
                 <w:szCs w:val="20"/>
               </w:rPr>
@@ -3809,6 +3930,7 @@
           <w:p>
             <w:pPr>
               <w:rPr>
+                <w:rFonts w:asciiTheme="minorEastAsia" w:hAnsiTheme="minorEastAsia"/>
                 <w:sz w:val="2"/>
                 <w:szCs w:val="2"/>
               </w:rPr>
@@ -3829,9 +3951,13 @@
               <w:pStyle w:val="TableParagraph"/>
               <w:spacing w:line="253" w:lineRule="exact"/>
               <w:ind w:left="9"/>
-            </w:pPr>
-            <w:r>
-              <w:rPr>
+              <w:rPr>
+                <w:rFonts w:asciiTheme="minorEastAsia" w:eastAsiaTheme="minorEastAsia" w:hAnsiTheme="minorEastAsia"/>
+              </w:rPr>
+            </w:pPr>
+            <w:r>
+              <w:rPr>
+                <w:rFonts w:asciiTheme="minorEastAsia" w:eastAsiaTheme="minorEastAsia" w:hAnsiTheme="minorEastAsia"/>
                 <w:spacing w:val="-4"/>
               </w:rPr>
               <w:t>유통기한</w:t>
@@ -3847,30 +3973,23 @@
             <w:pPr>
               <w:pStyle w:val="TableParagraph"/>
               <w:rPr>
-                <w:rFonts w:ascii="Times New Roman"/>
-                <w:sz w:val="20"/>
-              </w:rPr>
-            </w:pPr>
-            <w:r>
-              <w:rPr>
-                <w:rFonts w:ascii="Times New Roman"/>
+                <w:rFonts w:asciiTheme="minorEastAsia" w:eastAsiaTheme="minorEastAsia" w:hAnsiTheme="minorEastAsia"/>
+                <w:sz w:val="20"/>
+              </w:rPr>
+            </w:pPr>
+            <w:r>
+              <w:rPr>
+                <w:rFonts w:asciiTheme="minorEastAsia" w:eastAsiaTheme="minorEastAsia" w:hAnsiTheme="minorEastAsia"/>
                 <w:sz w:val="18"/>
               </w:rPr>
               <w:t>{</w:t>
             </w:r>
             <w:r>
               <w:rPr>
-                <w:rFonts w:ascii="Times New Roman" w:hint="eastAsia"/>
+                <w:rFonts w:asciiTheme="minorEastAsia" w:eastAsiaTheme="minorEastAsia" w:hAnsiTheme="minorEastAsia" w:hint="eastAsia"/>
                 <w:sz w:val="18"/>
               </w:rPr>
-              <w:t>유통기한</w:t>
-            </w:r>
-            <w:r>
-              <w:rPr>
-                <w:rFonts w:ascii="Times New Roman" w:hint="eastAsia"/>
-                <w:sz w:val="18"/>
-              </w:rPr>
-              <w:t>}</w:t>
+              <w:t>유통기한}</w:t>
             </w:r>
           </w:p>
         </w:tc>
@@ -3885,6 +4004,7 @@
           <w:p>
             <w:pPr>
               <w:rPr>
+                <w:rFonts w:asciiTheme="minorEastAsia" w:hAnsiTheme="minorEastAsia"/>
                 <w:sz w:val="2"/>
                 <w:szCs w:val="2"/>
               </w:rPr>
@@ -3905,25 +4025,16 @@
               <w:pStyle w:val="TableParagraph"/>
               <w:spacing w:line="248" w:lineRule="exact"/>
               <w:ind w:left="9"/>
-            </w:pPr>
-            <w:r>
-              <w:rPr>
+              <w:rPr>
+                <w:rFonts w:asciiTheme="minorEastAsia" w:eastAsiaTheme="minorEastAsia" w:hAnsiTheme="minorEastAsia"/>
+              </w:rPr>
+            </w:pPr>
+            <w:r>
+              <w:rPr>
+                <w:rFonts w:asciiTheme="minorEastAsia" w:eastAsiaTheme="minorEastAsia" w:hAnsiTheme="minorEastAsia"/>
                 <w:spacing w:val="-2"/>
               </w:rPr>
-              <w:t>수량</w:t>
-            </w:r>
-            <w:r>
-              <w:rPr>
-                <w:rFonts w:ascii="Calibri" w:eastAsia="Calibri"/>
-                <w:spacing w:val="-2"/>
-              </w:rPr>
-              <w:t>/</w:t>
-            </w:r>
-            <w:r>
-              <w:rPr>
-                <w:spacing w:val="-2"/>
-              </w:rPr>
-              <w:t>단위</w:t>
+              <w:t>수량/단위</w:t>
             </w:r>
           </w:p>
         </w:tc>
@@ -3936,30 +4047,16 @@
             <w:pPr>
               <w:pStyle w:val="TableParagraph"/>
               <w:rPr>
-                <w:rFonts w:ascii="Times New Roman"/>
+                <w:rFonts w:asciiTheme="minorEastAsia" w:eastAsiaTheme="minorEastAsia" w:hAnsiTheme="minorEastAsia"/>
                 <w:sz w:val="18"/>
               </w:rPr>
             </w:pPr>
             <w:r>
               <w:rPr>
-                <w:rFonts w:ascii="Times New Roman" w:hint="eastAsia"/>
-                <w:sz w:val="20"/>
-              </w:rPr>
-              <w:t>{</w:t>
-            </w:r>
-            <w:r>
-              <w:rPr>
-                <w:rFonts w:ascii="Times New Roman" w:hint="eastAsia"/>
-                <w:sz w:val="20"/>
-              </w:rPr>
-              <w:t>수량</w:t>
-            </w:r>
-            <w:r>
-              <w:rPr>
-                <w:rFonts w:ascii="Times New Roman" w:hint="eastAsia"/>
-                <w:sz w:val="20"/>
-              </w:rPr>
-              <w:t>}</w:t>
+                <w:rFonts w:asciiTheme="minorEastAsia" w:eastAsiaTheme="minorEastAsia" w:hAnsiTheme="minorEastAsia" w:hint="eastAsia"/>
+                <w:sz w:val="20"/>
+              </w:rPr>
+              <w:t>{수량}</w:t>
             </w:r>
           </w:p>
         </w:tc>
@@ -3974,6 +4071,7 @@
           <w:p>
             <w:pPr>
               <w:rPr>
+                <w:rFonts w:asciiTheme="minorEastAsia" w:hAnsiTheme="minorEastAsia"/>
                 <w:sz w:val="2"/>
                 <w:szCs w:val="2"/>
               </w:rPr>
@@ -3994,9 +4092,13 @@
               <w:pStyle w:val="TableParagraph"/>
               <w:spacing w:line="253" w:lineRule="exact"/>
               <w:ind w:left="9"/>
-            </w:pPr>
-            <w:r>
-              <w:rPr>
+              <w:rPr>
+                <w:rFonts w:asciiTheme="minorEastAsia" w:eastAsiaTheme="minorEastAsia" w:hAnsiTheme="minorEastAsia"/>
+              </w:rPr>
+            </w:pPr>
+            <w:r>
+              <w:rPr>
+                <w:rFonts w:asciiTheme="minorEastAsia" w:eastAsiaTheme="minorEastAsia" w:hAnsiTheme="minorEastAsia"/>
                 <w:spacing w:val="-4"/>
               </w:rPr>
               <w:t>시험번호</w:t>
@@ -4012,37 +4114,30 @@
             <w:pPr>
               <w:pStyle w:val="TableParagraph"/>
               <w:rPr>
-                <w:rFonts w:ascii="Times New Roman"/>
-                <w:sz w:val="20"/>
-              </w:rPr>
-            </w:pPr>
-            <w:r>
-              <w:rPr>
-                <w:rFonts w:ascii="Times New Roman" w:hint="eastAsia"/>
+                <w:rFonts w:asciiTheme="minorEastAsia" w:eastAsiaTheme="minorEastAsia" w:hAnsiTheme="minorEastAsia"/>
+                <w:sz w:val="20"/>
+              </w:rPr>
+            </w:pPr>
+            <w:r>
+              <w:rPr>
+                <w:rFonts w:asciiTheme="minorEastAsia" w:eastAsiaTheme="minorEastAsia" w:hAnsiTheme="minorEastAsia" w:hint="eastAsia"/>
                 <w:sz w:val="20"/>
               </w:rPr>
               <w:t>{</w:t>
             </w:r>
             <w:r>
               <w:rPr>
-                <w:rFonts w:ascii="Times New Roman"/>
+                <w:rFonts w:asciiTheme="minorEastAsia" w:eastAsiaTheme="minorEastAsia" w:hAnsiTheme="minorEastAsia"/>
                 <w:sz w:val="20"/>
               </w:rPr>
               <w:t>LOT</w:t>
             </w:r>
             <w:r>
               <w:rPr>
-                <w:rFonts w:ascii="Times New Roman" w:hint="eastAsia"/>
-                <w:sz w:val="20"/>
-              </w:rPr>
-              <w:t>번호</w:t>
-            </w:r>
-            <w:r>
-              <w:rPr>
-                <w:rFonts w:ascii="Times New Roman" w:hint="eastAsia"/>
-                <w:sz w:val="20"/>
-              </w:rPr>
-              <w:t>}</w:t>
+                <w:rFonts w:asciiTheme="minorEastAsia" w:eastAsiaTheme="minorEastAsia" w:hAnsiTheme="minorEastAsia" w:hint="eastAsia"/>
+                <w:sz w:val="20"/>
+              </w:rPr>
+              <w:t>번호}</w:t>
             </w:r>
           </w:p>
         </w:tc>
@@ -4056,36 +4151,52 @@
               <w:spacing w:line="253" w:lineRule="exact"/>
               <w:ind w:left="838"/>
               <w:jc w:val="left"/>
-            </w:pPr>
-            <w:r>
+              <w:rPr>
+                <w:rFonts w:asciiTheme="minorEastAsia" w:eastAsiaTheme="minorEastAsia" w:hAnsiTheme="minorEastAsia"/>
+              </w:rPr>
+            </w:pPr>
+            <w:r>
+              <w:rPr>
+                <w:rFonts w:asciiTheme="minorEastAsia" w:eastAsiaTheme="minorEastAsia" w:hAnsiTheme="minorEastAsia"/>
+              </w:rPr>
               <w:t>조</w:t>
             </w:r>
             <w:r>
               <w:rPr>
+                <w:rFonts w:asciiTheme="minorEastAsia" w:eastAsiaTheme="minorEastAsia" w:hAnsiTheme="minorEastAsia"/>
                 <w:spacing w:val="36"/>
               </w:rPr>
               <w:t xml:space="preserve"> </w:t>
             </w:r>
             <w:r>
+              <w:rPr>
+                <w:rFonts w:asciiTheme="minorEastAsia" w:eastAsiaTheme="minorEastAsia" w:hAnsiTheme="minorEastAsia"/>
+              </w:rPr>
               <w:t>치</w:t>
             </w:r>
             <w:r>
               <w:rPr>
+                <w:rFonts w:asciiTheme="minorEastAsia" w:eastAsiaTheme="minorEastAsia" w:hAnsiTheme="minorEastAsia"/>
                 <w:spacing w:val="32"/>
               </w:rPr>
               <w:t xml:space="preserve"> </w:t>
             </w:r>
             <w:r>
+              <w:rPr>
+                <w:rFonts w:asciiTheme="minorEastAsia" w:eastAsiaTheme="minorEastAsia" w:hAnsiTheme="minorEastAsia"/>
+              </w:rPr>
               <w:t>사</w:t>
             </w:r>
             <w:r>
               <w:rPr>
+                <w:rFonts w:asciiTheme="minorEastAsia" w:eastAsiaTheme="minorEastAsia" w:hAnsiTheme="minorEastAsia"/>
                 <w:spacing w:val="36"/>
               </w:rPr>
               <w:t xml:space="preserve"> </w:t>
             </w:r>
             <w:r>
               <w:rPr>
+                <w:rFonts w:asciiTheme="minorEastAsia" w:eastAsiaTheme="minorEastAsia" w:hAnsiTheme="minorEastAsia"/>
                 <w:spacing w:val="-10"/>
               </w:rPr>
               <w:t>항</w:t>
@@ -4106,18 +4217,26 @@
               <w:pStyle w:val="TableParagraph"/>
               <w:spacing w:line="253" w:lineRule="exact"/>
               <w:ind w:left="13"/>
-            </w:pPr>
-            <w:r>
+              <w:rPr>
+                <w:rFonts w:asciiTheme="minorEastAsia" w:eastAsiaTheme="minorEastAsia" w:hAnsiTheme="minorEastAsia"/>
+              </w:rPr>
+            </w:pPr>
+            <w:r>
+              <w:rPr>
+                <w:rFonts w:asciiTheme="minorEastAsia" w:eastAsiaTheme="minorEastAsia" w:hAnsiTheme="minorEastAsia"/>
+              </w:rPr>
               <w:t>시험</w:t>
             </w:r>
             <w:r>
               <w:rPr>
+                <w:rFonts w:asciiTheme="minorEastAsia" w:eastAsiaTheme="minorEastAsia" w:hAnsiTheme="minorEastAsia"/>
                 <w:spacing w:val="31"/>
               </w:rPr>
               <w:t xml:space="preserve"> </w:t>
             </w:r>
             <w:r>
               <w:rPr>
+                <w:rFonts w:asciiTheme="minorEastAsia" w:eastAsiaTheme="minorEastAsia" w:hAnsiTheme="minorEastAsia"/>
                 <w:spacing w:val="-5"/>
               </w:rPr>
               <w:t>의뢰일</w:t>
@@ -4133,30 +4252,16 @@
             <w:pPr>
               <w:pStyle w:val="TableParagraph"/>
               <w:rPr>
-                <w:rFonts w:ascii="Times New Roman"/>
-                <w:sz w:val="20"/>
-              </w:rPr>
-            </w:pPr>
-            <w:r>
-              <w:rPr>
-                <w:rFonts w:ascii="Times New Roman" w:hint="eastAsia"/>
-                <w:sz w:val="20"/>
-              </w:rPr>
-              <w:t>{</w:t>
-            </w:r>
-            <w:r>
-              <w:rPr>
-                <w:rFonts w:ascii="Times New Roman" w:hint="eastAsia"/>
-                <w:sz w:val="20"/>
-              </w:rPr>
-              <w:t>오늘날짜</w:t>
-            </w:r>
-            <w:r>
-              <w:rPr>
-                <w:rFonts w:ascii="Times New Roman" w:hint="eastAsia"/>
-                <w:sz w:val="20"/>
-              </w:rPr>
-              <w:t>}</w:t>
+                <w:rFonts w:asciiTheme="minorEastAsia" w:eastAsiaTheme="minorEastAsia" w:hAnsiTheme="minorEastAsia"/>
+                <w:sz w:val="20"/>
+              </w:rPr>
+            </w:pPr>
+            <w:r>
+              <w:rPr>
+                <w:rFonts w:asciiTheme="minorEastAsia" w:eastAsiaTheme="minorEastAsia" w:hAnsiTheme="minorEastAsia" w:hint="eastAsia"/>
+                <w:sz w:val="20"/>
+              </w:rPr>
+              <w:t>{오늘날짜}</w:t>
             </w:r>
           </w:p>
         </w:tc>
@@ -4170,7 +4275,7 @@
               <w:pStyle w:val="TableParagraph"/>
               <w:jc w:val="left"/>
               <w:rPr>
-                <w:rFonts w:ascii="Times New Roman"/>
+                <w:rFonts w:asciiTheme="minorEastAsia" w:eastAsiaTheme="minorEastAsia" w:hAnsiTheme="minorEastAsia"/>
                 <w:sz w:val="24"/>
               </w:rPr>
             </w:pPr>
@@ -4190,10 +4295,14 @@
               <w:pStyle w:val="TableParagraph"/>
               <w:spacing w:line="248" w:lineRule="exact"/>
               <w:ind w:left="9"/>
+              <w:rPr>
+                <w:rFonts w:asciiTheme="minorEastAsia" w:eastAsiaTheme="minorEastAsia" w:hAnsiTheme="minorEastAsia"/>
+              </w:rPr>
             </w:pPr>
             <w:proofErr w:type="spellStart"/>
             <w:r>
               <w:rPr>
+                <w:rFonts w:asciiTheme="minorEastAsia" w:eastAsiaTheme="minorEastAsia" w:hAnsiTheme="minorEastAsia"/>
                 <w:spacing w:val="-2"/>
               </w:rPr>
               <w:t>검체채취일</w:t>
@@ -4209,30 +4318,16 @@
             <w:pPr>
               <w:pStyle w:val="TableParagraph"/>
               <w:rPr>
-                <w:rFonts w:ascii="Times New Roman"/>
+                <w:rFonts w:asciiTheme="minorEastAsia" w:eastAsiaTheme="minorEastAsia" w:hAnsiTheme="minorEastAsia"/>
                 <w:sz w:val="18"/>
               </w:rPr>
             </w:pPr>
             <w:r>
               <w:rPr>
-                <w:rFonts w:ascii="Times New Roman" w:hint="eastAsia"/>
-                <w:sz w:val="20"/>
-              </w:rPr>
-              <w:t>{</w:t>
-            </w:r>
-            <w:r>
-              <w:rPr>
-                <w:rFonts w:ascii="Times New Roman" w:hint="eastAsia"/>
-                <w:sz w:val="20"/>
-              </w:rPr>
-              <w:t>오늘날짜</w:t>
-            </w:r>
-            <w:r>
-              <w:rPr>
-                <w:rFonts w:ascii="Times New Roman" w:hint="eastAsia"/>
-                <w:sz w:val="20"/>
-              </w:rPr>
-              <w:t>}</w:t>
+                <w:rFonts w:asciiTheme="minorEastAsia" w:eastAsiaTheme="minorEastAsia" w:hAnsiTheme="minorEastAsia" w:hint="eastAsia"/>
+                <w:sz w:val="20"/>
+              </w:rPr>
+              <w:t>{오늘날짜}</w:t>
             </w:r>
           </w:p>
         </w:tc>
@@ -4245,27 +4340,39 @@
               <w:pStyle w:val="TableParagraph"/>
               <w:spacing w:line="248" w:lineRule="exact"/>
               <w:ind w:left="7"/>
-            </w:pPr>
-            <w:r>
+              <w:rPr>
+                <w:rFonts w:asciiTheme="minorEastAsia" w:eastAsiaTheme="minorEastAsia" w:hAnsiTheme="minorEastAsia"/>
+              </w:rPr>
+            </w:pPr>
+            <w:r>
+              <w:rPr>
+                <w:rFonts w:asciiTheme="minorEastAsia" w:eastAsiaTheme="minorEastAsia" w:hAnsiTheme="minorEastAsia"/>
+              </w:rPr>
               <w:t>판</w:t>
             </w:r>
             <w:r>
               <w:rPr>
+                <w:rFonts w:asciiTheme="minorEastAsia" w:eastAsiaTheme="minorEastAsia" w:hAnsiTheme="minorEastAsia"/>
                 <w:spacing w:val="36"/>
               </w:rPr>
               <w:t xml:space="preserve"> </w:t>
             </w:r>
             <w:r>
+              <w:rPr>
+                <w:rFonts w:asciiTheme="minorEastAsia" w:eastAsiaTheme="minorEastAsia" w:hAnsiTheme="minorEastAsia"/>
+              </w:rPr>
               <w:t>정</w:t>
             </w:r>
             <w:r>
               <w:rPr>
+                <w:rFonts w:asciiTheme="minorEastAsia" w:eastAsiaTheme="minorEastAsia" w:hAnsiTheme="minorEastAsia"/>
                 <w:spacing w:val="32"/>
               </w:rPr>
               <w:t xml:space="preserve"> </w:t>
             </w:r>
             <w:r>
               <w:rPr>
+                <w:rFonts w:asciiTheme="minorEastAsia" w:eastAsiaTheme="minorEastAsia" w:hAnsiTheme="minorEastAsia"/>
                 <w:spacing w:val="-10"/>
               </w:rPr>
               <w:t>일</w:t>
@@ -4280,30 +4387,16 @@
             <w:pPr>
               <w:pStyle w:val="TableParagraph"/>
               <w:rPr>
-                <w:rFonts w:ascii="Times New Roman"/>
+                <w:rFonts w:asciiTheme="minorEastAsia" w:eastAsiaTheme="minorEastAsia" w:hAnsiTheme="minorEastAsia"/>
                 <w:sz w:val="18"/>
               </w:rPr>
             </w:pPr>
             <w:r>
               <w:rPr>
-                <w:rFonts w:ascii="Times New Roman" w:hint="eastAsia"/>
-                <w:sz w:val="20"/>
-              </w:rPr>
-              <w:t>{</w:t>
-            </w:r>
-            <w:r>
-              <w:rPr>
-                <w:rFonts w:ascii="Times New Roman" w:hint="eastAsia"/>
-                <w:sz w:val="20"/>
-              </w:rPr>
-              <w:t>오늘날짜</w:t>
-            </w:r>
-            <w:r>
-              <w:rPr>
-                <w:rFonts w:ascii="Times New Roman" w:hint="eastAsia"/>
-                <w:sz w:val="20"/>
-              </w:rPr>
-              <w:t>}</w:t>
+                <w:rFonts w:asciiTheme="minorEastAsia" w:eastAsiaTheme="minorEastAsia" w:hAnsiTheme="minorEastAsia" w:hint="eastAsia"/>
+                <w:sz w:val="20"/>
+              </w:rPr>
+              <w:t>{오늘날짜}</w:t>
             </w:r>
           </w:p>
         </w:tc>
@@ -4318,6 +4411,7 @@
           <w:p>
             <w:pPr>
               <w:rPr>
+                <w:rFonts w:asciiTheme="minorEastAsia" w:hAnsiTheme="minorEastAsia"/>
                 <w:sz w:val="2"/>
                 <w:szCs w:val="2"/>
               </w:rPr>
@@ -4338,10 +4432,14 @@
               <w:pStyle w:val="TableParagraph"/>
               <w:spacing w:line="248" w:lineRule="exact"/>
               <w:ind w:left="9"/>
+              <w:rPr>
+                <w:rFonts w:asciiTheme="minorEastAsia" w:eastAsiaTheme="minorEastAsia" w:hAnsiTheme="minorEastAsia"/>
+              </w:rPr>
             </w:pPr>
             <w:proofErr w:type="spellStart"/>
             <w:r>
               <w:rPr>
+                <w:rFonts w:asciiTheme="minorEastAsia" w:eastAsiaTheme="minorEastAsia" w:hAnsiTheme="minorEastAsia"/>
                 <w:spacing w:val="-2"/>
               </w:rPr>
               <w:t>검체채취자</w:t>
@@ -4357,13 +4455,13 @@
             <w:pPr>
               <w:pStyle w:val="TableParagraph"/>
               <w:rPr>
-                <w:rFonts w:ascii="Times New Roman"/>
+                <w:rFonts w:asciiTheme="minorEastAsia" w:eastAsiaTheme="minorEastAsia" w:hAnsiTheme="minorEastAsia"/>
                 <w:sz w:val="18"/>
               </w:rPr>
             </w:pPr>
             <w:r>
               <w:rPr>
-                <w:rFonts w:ascii="Times New Roman" w:hint="eastAsia"/>
+                <w:rFonts w:asciiTheme="minorEastAsia" w:eastAsiaTheme="minorEastAsia" w:hAnsiTheme="minorEastAsia" w:hint="eastAsia"/>
                 <w:sz w:val="18"/>
               </w:rPr>
               <w:t>이상은</w:t>
@@ -4379,27 +4477,39 @@
               <w:pStyle w:val="TableParagraph"/>
               <w:spacing w:line="248" w:lineRule="exact"/>
               <w:ind w:left="7"/>
-            </w:pPr>
-            <w:r>
+              <w:rPr>
+                <w:rFonts w:asciiTheme="minorEastAsia" w:eastAsiaTheme="minorEastAsia" w:hAnsiTheme="minorEastAsia"/>
+              </w:rPr>
+            </w:pPr>
+            <w:r>
+              <w:rPr>
+                <w:rFonts w:asciiTheme="minorEastAsia" w:eastAsiaTheme="minorEastAsia" w:hAnsiTheme="minorEastAsia"/>
+              </w:rPr>
               <w:t>확</w:t>
             </w:r>
             <w:r>
               <w:rPr>
+                <w:rFonts w:asciiTheme="minorEastAsia" w:eastAsiaTheme="minorEastAsia" w:hAnsiTheme="minorEastAsia"/>
                 <w:spacing w:val="36"/>
               </w:rPr>
               <w:t xml:space="preserve"> </w:t>
             </w:r>
             <w:r>
+              <w:rPr>
+                <w:rFonts w:asciiTheme="minorEastAsia" w:eastAsiaTheme="minorEastAsia" w:hAnsiTheme="minorEastAsia"/>
+              </w:rPr>
               <w:t>인</w:t>
             </w:r>
             <w:r>
               <w:rPr>
+                <w:rFonts w:asciiTheme="minorEastAsia" w:eastAsiaTheme="minorEastAsia" w:hAnsiTheme="minorEastAsia"/>
                 <w:spacing w:val="32"/>
               </w:rPr>
               <w:t xml:space="preserve"> </w:t>
             </w:r>
             <w:r>
               <w:rPr>
+                <w:rFonts w:asciiTheme="minorEastAsia" w:eastAsiaTheme="minorEastAsia" w:hAnsiTheme="minorEastAsia"/>
                 <w:spacing w:val="-10"/>
               </w:rPr>
               <w:t>자</w:t>
@@ -4414,7 +4524,7 @@
             <w:pPr>
               <w:pStyle w:val="TableParagraph"/>
               <w:rPr>
-                <w:rFonts w:ascii="Times New Roman"/>
+                <w:rFonts w:asciiTheme="minorEastAsia" w:eastAsiaTheme="minorEastAsia" w:hAnsiTheme="minorEastAsia"/>
                 <w:sz w:val="18"/>
               </w:rPr>
             </w:pPr>
@@ -4431,6 +4541,7 @@
           <w:p>
             <w:pPr>
               <w:rPr>
+                <w:rFonts w:asciiTheme="minorEastAsia" w:hAnsiTheme="minorEastAsia"/>
                 <w:sz w:val="2"/>
                 <w:szCs w:val="2"/>
               </w:rPr>
@@ -4441,24 +4552,24 @@
     </w:tbl>
     <w:p>
       <w:pPr>
-        <w:spacing w:before="0"/>
         <w:rPr>
-          <w:rFonts w:ascii="Times New Roman" w:hint="eastAsia"/>
+          <w:rFonts w:asciiTheme="minorEastAsia" w:hAnsiTheme="minorEastAsia"/>
           <w:sz w:val="17"/>
         </w:rPr>
       </w:pPr>
     </w:p>
     <w:sectPr>
       <w:pgSz w:w="11900" w:h="16840"/>
-      <w:pgMar w:top="283" w:right="567" w:bottom="283" w:left="567" w:header="0" w:footer="0" w:gutter="0"/>
+      <w:pgMar w:top="720" w:right="720" w:bottom="720" w:left="720" w:header="720" w:footer="720" w:gutter="0"/>
       <w:cols w:space="720"/>
+      <w:docGrid w:linePitch="299"/>
     </w:sectPr>
   </w:body>
 </w:document>
 </file>
 
 <file path=word/numbering.xml><?xml version="1.0" encoding="utf-8"?>
-<w:numbering xmlns:wpc="http://schemas.microsoft.com/office/word/2010/wordprocessingCanvas" xmlns:cx="http://schemas.microsoft.com/office/drawing/2014/chartex" xmlns:cx1="http://schemas.microsoft.com/office/drawing/2015/9/8/chartex" xmlns:cx2="http://schemas.microsoft.com/office/drawing/2015/10/21/chartex" xmlns:cx3="http://schemas.microsoft.com/office/drawing/2016/5/9/chartex" xmlns:cx4="http://schemas.microsoft.com/office/drawing/2016/5/10/chartex" xmlns:cx5="http://schemas.microsoft.com/office/drawing/2016/5/11/chartex" xmlns:cx6="http://schemas.microsoft.com/office/drawing/2016/5/12/chartex" xmlns:cx7="http://schemas.microsoft.com/office/drawing/2016/5/13/chartex" xmlns:cx8="http://schemas.microsoft.com/office/drawing/2016/5/14/chartex" xmlns:mc="http://schemas.openxmlformats.org/markup-compatibility/2006" xmlns:aink="http://schemas.microsoft.com/office/drawing/2016/ink" xmlns:am3d="http://schemas.microsoft.com/office/drawing/2017/model3d" xmlns:o="urn:schemas-microsoft-com:office:office" xmlns:oel="http://schemas.microsoft.com/office/2019/extlst" xmlns:r="http://schemas.openxmlformats.org/officeDocument/2006/relationships" xmlns:m="http://schemas.openxmlformats.org/officeDocument/2006/math" xmlns:v="urn:schemas-microsoft-com:vml" xmlns:wp14="http://schemas.microsoft.com/office/word/2010/wordprocessingDrawing" xmlns:wp="http://schemas.openxmlformats.org/drawingml/2006/wordprocessingDrawing" xmlns:w10="urn:schemas-microsoft-com:office:word" xmlns:w="http://schemas.openxmlformats.org/wordprocessingml/2006/main" xmlns:w14="http://schemas.microsoft.com/office/word/2010/wordml" xmlns:w15="http://schemas.microsoft.com/office/word/2012/wordml" xmlns:w16cex="http://schemas.microsoft.com/office/word/2018/wordml/cex" xmlns:w16cid="http://schemas.microsoft.com/office/word/2016/wordml/cid" xmlns:w16="http://schemas.microsoft.com/office/word/2018/wordml" xmlns:w16du="http://schemas.microsoft.com/office/word/2023/wordml/word16du" xmlns:w16sdtdh="http://schemas.microsoft.com/office/word/2020/wordml/sdtdatahash" xmlns:w16sdtfl="http://schemas.microsoft.com/office/word/2024/wordml/sdtformatlock" xmlns:w16se="http://schemas.microsoft.com/office/word/2015/wordml/symex" xmlns:wpg="http://schemas.microsoft.com/office/word/2010/wordprocessingGroup" xmlns:wpi="http://schemas.microsoft.com/office/word/2010/wordprocessingInk" xmlns:wne="http://schemas.microsoft.com/office/word/2006/wordml" xmlns:wps="http://schemas.microsoft.com/office/word/2010/wordprocessingShape" mc:Ignorable="w14 w15 w16se w16cid w16 w16cex w16sdtdh w16sdtfl w16du wp14">
+<w:numbering xmlns:wpc="http://schemas.microsoft.com/office/word/2010/wordprocessingCanvas" xmlns:cx="http://schemas.microsoft.com/office/drawing/2014/chartex" xmlns:mc="http://schemas.openxmlformats.org/markup-compatibility/2006" xmlns:o="urn:schemas-microsoft-com:office:office" xmlns:r="http://schemas.openxmlformats.org/officeDocument/2006/relationships" xmlns:m="http://schemas.openxmlformats.org/officeDocument/2006/math" xmlns:v="urn:schemas-microsoft-com:vml" xmlns:wp14="http://schemas.microsoft.com/office/word/2010/wordprocessingDrawing" xmlns:wp="http://schemas.openxmlformats.org/drawingml/2006/wordprocessingDrawing" xmlns:w10="urn:schemas-microsoft-com:office:word" xmlns:w="http://schemas.openxmlformats.org/wordprocessingml/2006/main" xmlns:w14="http://schemas.microsoft.com/office/word/2010/wordml" xmlns:w15="http://schemas.microsoft.com/office/word/2012/wordml" xmlns:w16se="http://schemas.microsoft.com/office/word/2015/wordml/symex" xmlns:wpg="http://schemas.microsoft.com/office/word/2010/wordprocessingGroup" xmlns:wpi="http://schemas.microsoft.com/office/word/2010/wordprocessingInk" xmlns:wne="http://schemas.microsoft.com/office/word/2006/wordml" xmlns:wps="http://schemas.microsoft.com/office/word/2010/wordprocessingShape" mc:Ignorable="w14 w15 w16se wp14">
   <w:abstractNum w:abstractNumId="0" w15:restartNumberingAfterBreak="0">
     <w:nsid w:val="2861445D"/>
     <w:multiLevelType w:val="hybridMultilevel"/>
@@ -4943,23 +5054,23 @@
       </w:rPr>
     </w:lvl>
   </w:abstractNum>
-  <w:num w:numId="1" w16cid:durableId="1534224218">
+  <w:num w:numId="1">
     <w:abstractNumId w:val="2"/>
   </w:num>
-  <w:num w:numId="2" w16cid:durableId="1345980292">
+  <w:num w:numId="2">
     <w:abstractNumId w:val="0"/>
   </w:num>
-  <w:num w:numId="3" w16cid:durableId="125852830">
+  <w:num w:numId="3">
     <w:abstractNumId w:val="1"/>
   </w:num>
-  <w:num w:numId="4" w16cid:durableId="1253052183">
+  <w:num w:numId="4">
     <w:abstractNumId w:val="3"/>
   </w:num>
 </w:numbering>
 </file>
 
 <file path=word/styles.xml><?xml version="1.0" encoding="utf-8"?>
-<w:styles xmlns:mc="http://schemas.openxmlformats.org/markup-compatibility/2006" xmlns:r="http://schemas.openxmlformats.org/officeDocument/2006/relationships" xmlns:w="http://schemas.openxmlformats.org/wordprocessingml/2006/main" xmlns:w14="http://schemas.microsoft.com/office/word/2010/wordml" xmlns:w15="http://schemas.microsoft.com/office/word/2012/wordml" xmlns:w16cex="http://schemas.microsoft.com/office/word/2018/wordml/cex" xmlns:w16cid="http://schemas.microsoft.com/office/word/2016/wordml/cid" xmlns:w16="http://schemas.microsoft.com/office/word/2018/wordml" xmlns:w16du="http://schemas.microsoft.com/office/word/2023/wordml/word16du" xmlns:w16sdtdh="http://schemas.microsoft.com/office/word/2020/wordml/sdtdatahash" xmlns:w16sdtfl="http://schemas.microsoft.com/office/word/2024/wordml/sdtformatlock" xmlns:w16se="http://schemas.microsoft.com/office/word/2015/wordml/symex" mc:Ignorable="w14 w15 w16se w16cid w16 w16cex w16sdtdh w16sdtfl w16du">
+<w:styles xmlns:mc="http://schemas.openxmlformats.org/markup-compatibility/2006" xmlns:r="http://schemas.openxmlformats.org/officeDocument/2006/relationships" xmlns:w="http://schemas.openxmlformats.org/wordprocessingml/2006/main" xmlns:w14="http://schemas.microsoft.com/office/word/2010/wordml" xmlns:w15="http://schemas.microsoft.com/office/word/2012/wordml" xmlns:w16se="http://schemas.microsoft.com/office/word/2015/wordml/symex" mc:Ignorable="w14 w15 w16se">
   <w:docDefaults>
     <w:rPrDefault>
       <w:rPr>
@@ -4977,7 +5088,7 @@
       </w:pPr>
     </w:pPrDefault>
   </w:docDefaults>
-  <w:latentStyles w:defLockedState="0" w:defUIPriority="99" w:defSemiHidden="0" w:defUnhideWhenUsed="0" w:defQFormat="0" w:count="376">
+  <w:latentStyles w:defLockedState="0" w:defUIPriority="99" w:defSemiHidden="0" w:defUnhideWhenUsed="0" w:defQFormat="0" w:count="371">
     <w:lsdException w:name="Normal" w:uiPriority="0" w:qFormat="1"/>
     <w:lsdException w:name="heading 1" w:uiPriority="9" w:qFormat="1"/>
     <w:lsdException w:name="heading 2" w:semiHidden="1" w:uiPriority="9" w:unhideWhenUsed="1" w:qFormat="1"/>
@@ -5349,11 +5460,6 @@
     <w:lsdException w:name="List Table 5 Dark Accent 6" w:uiPriority="50"/>
     <w:lsdException w:name="List Table 6 Colorful Accent 6" w:uiPriority="51"/>
     <w:lsdException w:name="List Table 7 Colorful Accent 6" w:uiPriority="52"/>
-    <w:lsdException w:name="Mention" w:semiHidden="1" w:unhideWhenUsed="1"/>
-    <w:lsdException w:name="Smart Hyperlink" w:semiHidden="1" w:unhideWhenUsed="1"/>
-    <w:lsdException w:name="Hashtag" w:semiHidden="1" w:unhideWhenUsed="1"/>
-    <w:lsdException w:name="Unresolved Mention" w:semiHidden="1" w:unhideWhenUsed="1"/>
-    <w:lsdException w:name="Smart Link" w:semiHidden="1" w:unhideWhenUsed="1"/>
   </w:latentStyles>
   <w:style w:type="paragraph" w:default="1" w:styleId="a">
     <w:name w:val="Normal"/>
@@ -5420,7 +5526,7 @@
       <w:jc w:val="center"/>
     </w:pPr>
     <w:rPr>
-      <w:rFonts w:ascii="Dotum" w:eastAsia="Dotum" w:hAnsi="Dotum" w:cs="Dotum"/>
+      <w:rFonts w:ascii="돋움" w:eastAsia="돋움" w:hAnsi="돋움" w:cs="돋움"/>
     </w:rPr>
   </w:style>
 </w:styles>
@@ -5707,4 +5813,16 @@
   <a:objectDefaults/>
   <a:extraClrSchemeLst/>
 </a:theme>
+</file>
+
+<file path=customXml/item1.xml><?xml version="1.0" encoding="utf-8"?>
+<b:Sources xmlns:b="http://schemas.openxmlformats.org/officeDocument/2006/bibliography" xmlns="http://schemas.openxmlformats.org/officeDocument/2006/bibliography" SelectedStyle="\APASixthEditionOfficeOnline.xsl" StyleName="APA" Version="6"/>
+</file>
+
+<file path=customXml/itemProps1.xml><?xml version="1.0" encoding="utf-8"?>
+<ds:datastoreItem xmlns:ds="http://schemas.openxmlformats.org/officeDocument/2006/customXml" ds:itemID="{8687F1B6-AD4B-427D-95AF-6E02B9D265DE}">
+  <ds:schemaRefs>
+    <ds:schemaRef ds:uri="http://schemas.openxmlformats.org/officeDocument/2006/bibliography"/>
+  </ds:schemaRefs>
+</ds:datastoreItem>
 </file>
</xml_diff>

<commit_message>
feat(audit): add per-item auto-remembered unit spec for QC label and sync updated qc_label.docx
</commit_message>
<xml_diff>
--- a/public/templates/00_common/qc_label.docx
+++ b/public/templates/00_common/qc_label.docx
@@ -75,42 +75,12 @@
                 <w:rFonts w:asciiTheme="minorEastAsia" w:eastAsiaTheme="minorEastAsia" w:hAnsiTheme="minorEastAsia"/>
               </w:rPr>
             </w:pPr>
-            <w:proofErr w:type="spellStart"/>
             <w:r>
               <w:rPr>
                 <w:rFonts w:asciiTheme="minorEastAsia" w:eastAsiaTheme="minorEastAsia" w:hAnsiTheme="minorEastAsia"/>
                 <w:spacing w:val="-2"/>
               </w:rPr>
-              <w:t>시험중</w:t>
-            </w:r>
-            <w:proofErr w:type="spellEnd"/>
-            <w:r>
-              <w:rPr>
-                <w:rFonts w:asciiTheme="minorEastAsia" w:eastAsiaTheme="minorEastAsia" w:hAnsiTheme="minorEastAsia"/>
-                <w:spacing w:val="-2"/>
-              </w:rPr>
-              <w:t>/</w:t>
-            </w:r>
-            <w:r>
-              <w:rPr>
-                <w:rFonts w:asciiTheme="minorEastAsia" w:eastAsiaTheme="minorEastAsia" w:hAnsiTheme="minorEastAsia"/>
-                <w:spacing w:val="-2"/>
-              </w:rPr>
-              <w:t>적합</w:t>
-            </w:r>
-            <w:r>
-              <w:rPr>
-                <w:rFonts w:asciiTheme="minorEastAsia" w:eastAsiaTheme="minorEastAsia" w:hAnsiTheme="minorEastAsia"/>
-                <w:spacing w:val="-2"/>
-              </w:rPr>
-              <w:t>/</w:t>
-            </w:r>
-            <w:r>
-              <w:rPr>
-                <w:rFonts w:asciiTheme="minorEastAsia" w:eastAsiaTheme="minorEastAsia" w:hAnsiTheme="minorEastAsia"/>
-                <w:spacing w:val="-2"/>
-              </w:rPr>
-              <w:t>부적합</w:t>
+              <w:t>시험중/적합/부적합</w:t>
             </w:r>
             <w:r>
               <w:rPr>
@@ -118,7 +88,6 @@
               </w:rPr>
               <w:t xml:space="preserve"> </w:t>
             </w:r>
-            <w:proofErr w:type="spellStart"/>
             <w:r>
               <w:rPr>
                 <w:rFonts w:asciiTheme="minorEastAsia" w:eastAsiaTheme="minorEastAsia" w:hAnsiTheme="minorEastAsia"/>
@@ -126,7 +95,6 @@
               </w:rPr>
               <w:t>표시서</w:t>
             </w:r>
-            <w:proofErr w:type="spellEnd"/>
           </w:p>
         </w:tc>
       </w:tr>
@@ -374,7 +342,7 @@
                                 <pic:cNvPicPr/>
                               </pic:nvPicPr>
                               <pic:blipFill>
-                                <a:blip r:embed="rId6" cstate="print"/>
+                                <a:blip r:embed="rId8" cstate="print"/>
                                 <a:stretch>
                                   <a:fillRect/>
                                 </a:stretch>
@@ -397,7 +365,7 @@
                 </mc:Choice>
                 <mc:Fallback>
                   <w:pict>
-                    <v:group w14:anchorId="17B3460C" id="Group 1" o:spid="_x0000_s1026" style="position:absolute;left:0;text-align:left;margin-left:42.6pt;margin-top:-19.45pt;width:59.3pt;height:58.85pt;z-index:-251661824;mso-wrap-distance-left:0;mso-wrap-distance-right:0" coordsize="7531,7473" o:gfxdata="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">
+                    <v:group w14:anchorId="39F3D144" id="Group 1" o:spid="_x0000_s1026" style="position:absolute;left:0;text-align:left;margin-left:42.6pt;margin-top:-19.45pt;width:59.3pt;height:58.85pt;z-index:-251661824;mso-wrap-distance-left:0;mso-wrap-distance-right:0" coordsize="7531,7473" o:gfxdata="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">
                       <v:shapetype id="_x0000_t75" coordsize="21600,21600" o:spt="75" o:preferrelative="t" path="m@4@5l@4@11@9@11@9@5xe" filled="f" stroked="f">
                         <v:stroke joinstyle="miter"/>
                         <v:formulas>
@@ -418,7 +386,7 @@
                         <o:lock v:ext="edit" aspectratio="t"/>
                       </v:shapetype>
                       <v:shape id="Image 2" o:spid="_x0000_s1027" type="#_x0000_t75" style="position:absolute;width:7489;height:7429;visibility:visible;mso-wrap-style:square" o:gfxdata="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">
-                        <v:imagedata r:id="rId7" o:title=""/>
+                        <v:imagedata r:id="rId9" o:title=""/>
                       </v:shape>
                     </v:group>
                   </w:pict>
@@ -587,16 +555,7 @@
                 <w:rFonts w:asciiTheme="minorEastAsia" w:eastAsiaTheme="minorEastAsia" w:hAnsiTheme="minorEastAsia" w:hint="eastAsia"/>
                 <w:sz w:val="18"/>
               </w:rPr>
-              <w:t>유통</w:t>
-            </w:r>
-            <w:bookmarkStart w:id="0" w:name="_GoBack"/>
-            <w:bookmarkEnd w:id="0"/>
-            <w:r>
-              <w:rPr>
-                <w:rFonts w:asciiTheme="minorEastAsia" w:eastAsiaTheme="minorEastAsia" w:hAnsiTheme="minorEastAsia" w:hint="eastAsia"/>
-                <w:sz w:val="18"/>
-              </w:rPr>
-              <w:t>기한}</w:t>
+              <w:t>유통기한}</w:t>
             </w:r>
           </w:p>
         </w:tc>
@@ -641,21 +600,7 @@
                 <w:rFonts w:asciiTheme="minorEastAsia" w:eastAsiaTheme="minorEastAsia" w:hAnsiTheme="minorEastAsia"/>
                 <w:spacing w:val="-2"/>
               </w:rPr>
-              <w:t>수량</w:t>
-            </w:r>
-            <w:r>
-              <w:rPr>
-                <w:rFonts w:asciiTheme="minorEastAsia" w:eastAsiaTheme="minorEastAsia" w:hAnsiTheme="minorEastAsia"/>
-                <w:spacing w:val="-2"/>
-              </w:rPr>
-              <w:t>/</w:t>
-            </w:r>
-            <w:r>
-              <w:rPr>
-                <w:rFonts w:asciiTheme="minorEastAsia" w:eastAsiaTheme="minorEastAsia" w:hAnsiTheme="minorEastAsia"/>
-                <w:spacing w:val="-2"/>
-              </w:rPr>
-              <w:t>단위</w:t>
+              <w:t>수량/단위</w:t>
             </w:r>
           </w:p>
         </w:tc>
@@ -882,7 +827,14 @@
                 <w:rFonts w:asciiTheme="minorEastAsia" w:eastAsiaTheme="minorEastAsia" w:hAnsiTheme="minorEastAsia" w:hint="eastAsia"/>
                 <w:sz w:val="20"/>
               </w:rPr>
-              <w:t>{오늘날짜}</w:t>
+              <w:t>{</w:t>
+            </w:r>
+            <w:r>
+              <w:rPr>
+                <w:rFonts w:asciiTheme="minorEastAsia" w:eastAsiaTheme="minorEastAsia" w:hAnsiTheme="minorEastAsia" w:hint="eastAsia"/>
+                <w:sz w:val="20"/>
+              </w:rPr>
+              <w:t>제조일자}</w:t>
             </w:r>
           </w:p>
         </w:tc>
@@ -920,7 +872,6 @@
                 <w:rFonts w:asciiTheme="minorEastAsia" w:eastAsiaTheme="minorEastAsia" w:hAnsiTheme="minorEastAsia"/>
               </w:rPr>
             </w:pPr>
-            <w:proofErr w:type="spellStart"/>
             <w:r>
               <w:rPr>
                 <w:rFonts w:asciiTheme="minorEastAsia" w:eastAsiaTheme="minorEastAsia" w:hAnsiTheme="minorEastAsia"/>
@@ -928,7 +879,6 @@
               </w:rPr>
               <w:t>검체채취일</w:t>
             </w:r>
-            <w:proofErr w:type="spellEnd"/>
           </w:p>
         </w:tc>
         <w:tc>
@@ -948,7 +898,14 @@
                 <w:rFonts w:asciiTheme="minorEastAsia" w:eastAsiaTheme="minorEastAsia" w:hAnsiTheme="minorEastAsia" w:hint="eastAsia"/>
                 <w:sz w:val="20"/>
               </w:rPr>
-              <w:t>{오늘날짜}</w:t>
+              <w:t>{</w:t>
+            </w:r>
+            <w:r>
+              <w:rPr>
+                <w:rFonts w:asciiTheme="minorEastAsia" w:eastAsiaTheme="minorEastAsia" w:hAnsiTheme="minorEastAsia" w:hint="eastAsia"/>
+                <w:sz w:val="20"/>
+              </w:rPr>
+              <w:t>제조일자}</w:t>
             </w:r>
           </w:p>
         </w:tc>
@@ -1017,7 +974,14 @@
                 <w:rFonts w:asciiTheme="minorEastAsia" w:eastAsiaTheme="minorEastAsia" w:hAnsiTheme="minorEastAsia" w:hint="eastAsia"/>
                 <w:sz w:val="20"/>
               </w:rPr>
-              <w:t>{오늘날짜}</w:t>
+              <w:t>{</w:t>
+            </w:r>
+            <w:r>
+              <w:rPr>
+                <w:rFonts w:asciiTheme="minorEastAsia" w:eastAsiaTheme="minorEastAsia" w:hAnsiTheme="minorEastAsia" w:hint="eastAsia"/>
+                <w:sz w:val="20"/>
+              </w:rPr>
+              <w:t>제조일자}</w:t>
             </w:r>
           </w:p>
         </w:tc>
@@ -1057,7 +1021,6 @@
                 <w:rFonts w:asciiTheme="minorEastAsia" w:eastAsiaTheme="minorEastAsia" w:hAnsiTheme="minorEastAsia"/>
               </w:rPr>
             </w:pPr>
-            <w:proofErr w:type="spellStart"/>
             <w:r>
               <w:rPr>
                 <w:rFonts w:asciiTheme="minorEastAsia" w:eastAsiaTheme="minorEastAsia" w:hAnsiTheme="minorEastAsia"/>
@@ -1065,7 +1028,6 @@
               </w:rPr>
               <w:t>검체채취자</w:t>
             </w:r>
-            <w:proofErr w:type="spellEnd"/>
           </w:p>
         </w:tc>
         <w:tc>
@@ -1243,42 +1205,12 @@
                 <w:rFonts w:asciiTheme="minorEastAsia" w:eastAsiaTheme="minorEastAsia" w:hAnsiTheme="minorEastAsia"/>
               </w:rPr>
             </w:pPr>
-            <w:proofErr w:type="spellStart"/>
             <w:r>
               <w:rPr>
                 <w:rFonts w:asciiTheme="minorEastAsia" w:eastAsiaTheme="minorEastAsia" w:hAnsiTheme="minorEastAsia"/>
                 <w:spacing w:val="-2"/>
               </w:rPr>
-              <w:t>시험중</w:t>
-            </w:r>
-            <w:proofErr w:type="spellEnd"/>
-            <w:r>
-              <w:rPr>
-                <w:rFonts w:asciiTheme="minorEastAsia" w:eastAsiaTheme="minorEastAsia" w:hAnsiTheme="minorEastAsia"/>
-                <w:spacing w:val="-2"/>
-              </w:rPr>
-              <w:t>/</w:t>
-            </w:r>
-            <w:r>
-              <w:rPr>
-                <w:rFonts w:asciiTheme="minorEastAsia" w:eastAsiaTheme="minorEastAsia" w:hAnsiTheme="minorEastAsia"/>
-                <w:spacing w:val="-2"/>
-              </w:rPr>
-              <w:t>적합</w:t>
-            </w:r>
-            <w:r>
-              <w:rPr>
-                <w:rFonts w:asciiTheme="minorEastAsia" w:eastAsiaTheme="minorEastAsia" w:hAnsiTheme="minorEastAsia"/>
-                <w:spacing w:val="-2"/>
-              </w:rPr>
-              <w:t>/</w:t>
-            </w:r>
-            <w:r>
-              <w:rPr>
-                <w:rFonts w:asciiTheme="minorEastAsia" w:eastAsiaTheme="minorEastAsia" w:hAnsiTheme="minorEastAsia"/>
-                <w:spacing w:val="-2"/>
-              </w:rPr>
-              <w:t>부적합</w:t>
+              <w:t>시험중/적합/부적합</w:t>
             </w:r>
             <w:r>
               <w:rPr>
@@ -1286,7 +1218,6 @@
               </w:rPr>
               <w:t xml:space="preserve"> </w:t>
             </w:r>
-            <w:proofErr w:type="spellStart"/>
             <w:r>
               <w:rPr>
                 <w:rFonts w:asciiTheme="minorEastAsia" w:eastAsiaTheme="minorEastAsia" w:hAnsiTheme="minorEastAsia"/>
@@ -1294,7 +1225,6 @@
               </w:rPr>
               <w:t>표시서</w:t>
             </w:r>
-            <w:proofErr w:type="spellEnd"/>
           </w:p>
         </w:tc>
       </w:tr>
@@ -1542,7 +1472,7 @@
                                 <pic:cNvPicPr/>
                               </pic:nvPicPr>
                               <pic:blipFill>
-                                <a:blip r:embed="rId8" cstate="print"/>
+                                <a:blip r:embed="rId10" cstate="print"/>
                                 <a:stretch>
                                   <a:fillRect/>
                                 </a:stretch>
@@ -1565,9 +1495,9 @@
                 </mc:Choice>
                 <mc:Fallback>
                   <w:pict>
-                    <v:group w14:anchorId="35895755" id="Group 3" o:spid="_x0000_s1026" style="position:absolute;left:0;text-align:left;margin-left:42.6pt;margin-top:-19.2pt;width:59.3pt;height:58.35pt;z-index:-251659776;mso-wrap-distance-left:0;mso-wrap-distance-right:0" coordsize="7531,7410" o:gfxdata="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">
+                    <v:group w14:anchorId="28519EE4" id="Group 3" o:spid="_x0000_s1026" style="position:absolute;left:0;text-align:left;margin-left:42.6pt;margin-top:-19.2pt;width:59.3pt;height:58.35pt;z-index:-251659776;mso-wrap-distance-left:0;mso-wrap-distance-right:0" coordsize="7531,7410" o:gfxdata="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">
                       <v:shape id="Image 4" o:spid="_x0000_s1027" type="#_x0000_t75" style="position:absolute;width:7503;height:7381;visibility:visible;mso-wrap-style:square" o:gfxdata="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">
-                        <v:imagedata r:id="rId9" o:title=""/>
+                        <v:imagedata r:id="rId11" o:title=""/>
                       </v:shape>
                     </v:group>
                   </w:pict>
@@ -2008,7 +1938,14 @@
                 <w:rFonts w:asciiTheme="minorEastAsia" w:eastAsiaTheme="minorEastAsia" w:hAnsiTheme="minorEastAsia" w:hint="eastAsia"/>
                 <w:sz w:val="20"/>
               </w:rPr>
-              <w:t>{오늘날짜}</w:t>
+              <w:t>{</w:t>
+            </w:r>
+            <w:r>
+              <w:rPr>
+                <w:rFonts w:asciiTheme="minorEastAsia" w:eastAsiaTheme="minorEastAsia" w:hAnsiTheme="minorEastAsia" w:hint="eastAsia"/>
+                <w:sz w:val="20"/>
+              </w:rPr>
+              <w:t>제조일자}</w:t>
             </w:r>
           </w:p>
         </w:tc>
@@ -2046,7 +1983,6 @@
                 <w:rFonts w:asciiTheme="minorEastAsia" w:eastAsiaTheme="minorEastAsia" w:hAnsiTheme="minorEastAsia"/>
               </w:rPr>
             </w:pPr>
-            <w:proofErr w:type="spellStart"/>
             <w:r>
               <w:rPr>
                 <w:rFonts w:asciiTheme="minorEastAsia" w:eastAsiaTheme="minorEastAsia" w:hAnsiTheme="minorEastAsia"/>
@@ -2054,7 +1990,6 @@
               </w:rPr>
               <w:t>검체채취일</w:t>
             </w:r>
-            <w:proofErr w:type="spellEnd"/>
           </w:p>
         </w:tc>
         <w:tc>
@@ -2074,7 +2009,14 @@
                 <w:rFonts w:asciiTheme="minorEastAsia" w:eastAsiaTheme="minorEastAsia" w:hAnsiTheme="minorEastAsia" w:hint="eastAsia"/>
                 <w:sz w:val="20"/>
               </w:rPr>
-              <w:t>{오늘날짜}</w:t>
+              <w:t>{</w:t>
+            </w:r>
+            <w:r>
+              <w:rPr>
+                <w:rFonts w:asciiTheme="minorEastAsia" w:eastAsiaTheme="minorEastAsia" w:hAnsiTheme="minorEastAsia" w:hint="eastAsia"/>
+                <w:sz w:val="20"/>
+              </w:rPr>
+              <w:t>제조일자}</w:t>
             </w:r>
           </w:p>
         </w:tc>
@@ -2143,7 +2085,14 @@
                 <w:rFonts w:asciiTheme="minorEastAsia" w:eastAsiaTheme="minorEastAsia" w:hAnsiTheme="minorEastAsia" w:hint="eastAsia"/>
                 <w:sz w:val="20"/>
               </w:rPr>
-              <w:t>{오늘날짜}</w:t>
+              <w:t>{</w:t>
+            </w:r>
+            <w:r>
+              <w:rPr>
+                <w:rFonts w:asciiTheme="minorEastAsia" w:eastAsiaTheme="minorEastAsia" w:hAnsiTheme="minorEastAsia" w:hint="eastAsia"/>
+                <w:sz w:val="20"/>
+              </w:rPr>
+              <w:t>제조일자}</w:t>
             </w:r>
           </w:p>
         </w:tc>
@@ -2183,7 +2132,6 @@
                 <w:rFonts w:asciiTheme="minorEastAsia" w:eastAsiaTheme="minorEastAsia" w:hAnsiTheme="minorEastAsia"/>
               </w:rPr>
             </w:pPr>
-            <w:proofErr w:type="spellStart"/>
             <w:r>
               <w:rPr>
                 <w:rFonts w:asciiTheme="minorEastAsia" w:eastAsiaTheme="minorEastAsia" w:hAnsiTheme="minorEastAsia"/>
@@ -2191,7 +2139,6 @@
               </w:rPr>
               <w:t>검체채취자</w:t>
             </w:r>
-            <w:proofErr w:type="spellEnd"/>
           </w:p>
         </w:tc>
         <w:tc>
@@ -2370,42 +2317,12 @@
                 <w:rFonts w:asciiTheme="minorEastAsia" w:eastAsiaTheme="minorEastAsia" w:hAnsiTheme="minorEastAsia"/>
               </w:rPr>
             </w:pPr>
-            <w:proofErr w:type="spellStart"/>
             <w:r>
               <w:rPr>
                 <w:rFonts w:asciiTheme="minorEastAsia" w:eastAsiaTheme="minorEastAsia" w:hAnsiTheme="minorEastAsia"/>
                 <w:spacing w:val="-2"/>
               </w:rPr>
-              <w:t>시험중</w:t>
-            </w:r>
-            <w:proofErr w:type="spellEnd"/>
-            <w:r>
-              <w:rPr>
-                <w:rFonts w:asciiTheme="minorEastAsia" w:eastAsiaTheme="minorEastAsia" w:hAnsiTheme="minorEastAsia"/>
-                <w:spacing w:val="-2"/>
-              </w:rPr>
-              <w:t>/</w:t>
-            </w:r>
-            <w:r>
-              <w:rPr>
-                <w:rFonts w:asciiTheme="minorEastAsia" w:eastAsiaTheme="minorEastAsia" w:hAnsiTheme="minorEastAsia"/>
-                <w:spacing w:val="-2"/>
-              </w:rPr>
-              <w:t>적합</w:t>
-            </w:r>
-            <w:r>
-              <w:rPr>
-                <w:rFonts w:asciiTheme="minorEastAsia" w:eastAsiaTheme="minorEastAsia" w:hAnsiTheme="minorEastAsia"/>
-                <w:spacing w:val="-2"/>
-              </w:rPr>
-              <w:t>/</w:t>
-            </w:r>
-            <w:r>
-              <w:rPr>
-                <w:rFonts w:asciiTheme="minorEastAsia" w:eastAsiaTheme="minorEastAsia" w:hAnsiTheme="minorEastAsia"/>
-                <w:spacing w:val="-2"/>
-              </w:rPr>
-              <w:t>부적합</w:t>
+              <w:t>시험중/적합/부적합</w:t>
             </w:r>
             <w:r>
               <w:rPr>
@@ -2413,7 +2330,6 @@
               </w:rPr>
               <w:t xml:space="preserve"> </w:t>
             </w:r>
-            <w:proofErr w:type="spellStart"/>
             <w:r>
               <w:rPr>
                 <w:rFonts w:asciiTheme="minorEastAsia" w:eastAsiaTheme="minorEastAsia" w:hAnsiTheme="minorEastAsia"/>
@@ -2421,7 +2337,6 @@
               </w:rPr>
               <w:t>표시서</w:t>
             </w:r>
-            <w:proofErr w:type="spellEnd"/>
           </w:p>
         </w:tc>
       </w:tr>
@@ -2669,7 +2584,7 @@
                                 <pic:cNvPicPr/>
                               </pic:nvPicPr>
                               <pic:blipFill>
-                                <a:blip r:embed="rId10" cstate="print"/>
+                                <a:blip r:embed="rId12" cstate="print"/>
                                 <a:stretch>
                                   <a:fillRect/>
                                 </a:stretch>
@@ -2692,9 +2607,9 @@
                 </mc:Choice>
                 <mc:Fallback>
                   <w:pict>
-                    <v:group w14:anchorId="3F2120CE" id="Group 5" o:spid="_x0000_s1026" style="position:absolute;left:0;text-align:left;margin-left:42.6pt;margin-top:-19.4pt;width:59.3pt;height:58.8pt;z-index:-251657728;mso-wrap-distance-left:0;mso-wrap-distance-right:0" coordsize="7531,7467" o:gfxdata="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">
+                    <v:group w14:anchorId="0A96B26C" id="Group 5" o:spid="_x0000_s1026" style="position:absolute;left:0;text-align:left;margin-left:42.6pt;margin-top:-19.4pt;width:59.3pt;height:58.8pt;z-index:-251657728;mso-wrap-distance-left:0;mso-wrap-distance-right:0" coordsize="7531,7467" o:gfxdata="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">
                       <v:shape id="Image 6" o:spid="_x0000_s1027" type="#_x0000_t75" style="position:absolute;width:7490;height:7429;visibility:visible;mso-wrap-style:square" o:gfxdata="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">
-                        <v:imagedata r:id="rId11" o:title=""/>
+                        <v:imagedata r:id="rId13" o:title=""/>
                       </v:shape>
                     </v:group>
                   </w:pict>
@@ -3135,7 +3050,14 @@
                 <w:rFonts w:asciiTheme="minorEastAsia" w:eastAsiaTheme="minorEastAsia" w:hAnsiTheme="minorEastAsia" w:hint="eastAsia"/>
                 <w:sz w:val="20"/>
               </w:rPr>
-              <w:t>{오늘날짜}</w:t>
+              <w:t>{</w:t>
+            </w:r>
+            <w:r>
+              <w:rPr>
+                <w:rFonts w:asciiTheme="minorEastAsia" w:eastAsiaTheme="minorEastAsia" w:hAnsiTheme="minorEastAsia" w:hint="eastAsia"/>
+                <w:sz w:val="20"/>
+              </w:rPr>
+              <w:t>제조일자}</w:t>
             </w:r>
           </w:p>
         </w:tc>
@@ -3173,7 +3095,6 @@
                 <w:rFonts w:asciiTheme="minorEastAsia" w:eastAsiaTheme="minorEastAsia" w:hAnsiTheme="minorEastAsia"/>
               </w:rPr>
             </w:pPr>
-            <w:proofErr w:type="spellStart"/>
             <w:r>
               <w:rPr>
                 <w:rFonts w:asciiTheme="minorEastAsia" w:eastAsiaTheme="minorEastAsia" w:hAnsiTheme="minorEastAsia"/>
@@ -3181,7 +3102,6 @@
               </w:rPr>
               <w:t>검체채취일</w:t>
             </w:r>
-            <w:proofErr w:type="spellEnd"/>
           </w:p>
         </w:tc>
         <w:tc>
@@ -3201,7 +3121,14 @@
                 <w:rFonts w:asciiTheme="minorEastAsia" w:eastAsiaTheme="minorEastAsia" w:hAnsiTheme="minorEastAsia" w:hint="eastAsia"/>
                 <w:sz w:val="20"/>
               </w:rPr>
-              <w:t>{오늘날짜}</w:t>
+              <w:t>{</w:t>
+            </w:r>
+            <w:r>
+              <w:rPr>
+                <w:rFonts w:asciiTheme="minorEastAsia" w:eastAsiaTheme="minorEastAsia" w:hAnsiTheme="minorEastAsia" w:hint="eastAsia"/>
+                <w:sz w:val="20"/>
+              </w:rPr>
+              <w:t>제조일자}</w:t>
             </w:r>
           </w:p>
         </w:tc>
@@ -3270,7 +3197,14 @@
                 <w:rFonts w:asciiTheme="minorEastAsia" w:eastAsiaTheme="minorEastAsia" w:hAnsiTheme="minorEastAsia" w:hint="eastAsia"/>
                 <w:sz w:val="20"/>
               </w:rPr>
-              <w:t>{오늘날짜}</w:t>
+              <w:t>{</w:t>
+            </w:r>
+            <w:r>
+              <w:rPr>
+                <w:rFonts w:asciiTheme="minorEastAsia" w:eastAsiaTheme="minorEastAsia" w:hAnsiTheme="minorEastAsia" w:hint="eastAsia"/>
+                <w:sz w:val="20"/>
+              </w:rPr>
+              <w:t>제조일자}</w:t>
             </w:r>
           </w:p>
         </w:tc>
@@ -3310,7 +3244,6 @@
                 <w:rFonts w:asciiTheme="minorEastAsia" w:eastAsiaTheme="minorEastAsia" w:hAnsiTheme="minorEastAsia"/>
               </w:rPr>
             </w:pPr>
-            <w:proofErr w:type="spellStart"/>
             <w:r>
               <w:rPr>
                 <w:rFonts w:asciiTheme="minorEastAsia" w:eastAsiaTheme="minorEastAsia" w:hAnsiTheme="minorEastAsia"/>
@@ -3318,7 +3251,6 @@
               </w:rPr>
               <w:t>검체채취자</w:t>
             </w:r>
-            <w:proofErr w:type="spellEnd"/>
           </w:p>
         </w:tc>
         <w:tc>
@@ -3496,42 +3428,12 @@
                 <w:rFonts w:asciiTheme="minorEastAsia" w:eastAsiaTheme="minorEastAsia" w:hAnsiTheme="minorEastAsia"/>
               </w:rPr>
             </w:pPr>
-            <w:proofErr w:type="spellStart"/>
             <w:r>
               <w:rPr>
                 <w:rFonts w:asciiTheme="minorEastAsia" w:eastAsiaTheme="minorEastAsia" w:hAnsiTheme="minorEastAsia"/>
                 <w:spacing w:val="-2"/>
               </w:rPr>
-              <w:t>시험중</w:t>
-            </w:r>
-            <w:proofErr w:type="spellEnd"/>
-            <w:r>
-              <w:rPr>
-                <w:rFonts w:asciiTheme="minorEastAsia" w:eastAsiaTheme="minorEastAsia" w:hAnsiTheme="minorEastAsia"/>
-                <w:spacing w:val="-2"/>
-              </w:rPr>
-              <w:t>/</w:t>
-            </w:r>
-            <w:r>
-              <w:rPr>
-                <w:rFonts w:asciiTheme="minorEastAsia" w:eastAsiaTheme="minorEastAsia" w:hAnsiTheme="minorEastAsia"/>
-                <w:spacing w:val="-2"/>
-              </w:rPr>
-              <w:t>적합</w:t>
-            </w:r>
-            <w:r>
-              <w:rPr>
-                <w:rFonts w:asciiTheme="minorEastAsia" w:eastAsiaTheme="minorEastAsia" w:hAnsiTheme="minorEastAsia"/>
-                <w:spacing w:val="-2"/>
-              </w:rPr>
-              <w:t>/</w:t>
-            </w:r>
-            <w:r>
-              <w:rPr>
-                <w:rFonts w:asciiTheme="minorEastAsia" w:eastAsiaTheme="minorEastAsia" w:hAnsiTheme="minorEastAsia"/>
-                <w:spacing w:val="-2"/>
-              </w:rPr>
-              <w:t>부적합</w:t>
+              <w:t>시험중/적합/부적합</w:t>
             </w:r>
             <w:r>
               <w:rPr>
@@ -3539,7 +3441,6 @@
               </w:rPr>
               <w:t xml:space="preserve"> </w:t>
             </w:r>
-            <w:proofErr w:type="spellStart"/>
             <w:r>
               <w:rPr>
                 <w:rFonts w:asciiTheme="minorEastAsia" w:eastAsiaTheme="minorEastAsia" w:hAnsiTheme="minorEastAsia"/>
@@ -3547,7 +3448,6 @@
               </w:rPr>
               <w:t>표시서</w:t>
             </w:r>
-            <w:proofErr w:type="spellEnd"/>
           </w:p>
         </w:tc>
       </w:tr>
@@ -3795,7 +3695,7 @@
                                 <pic:cNvPicPr/>
                               </pic:nvPicPr>
                               <pic:blipFill>
-                                <a:blip r:embed="rId12" cstate="print"/>
+                                <a:blip r:embed="rId14" cstate="print"/>
                                 <a:stretch>
                                   <a:fillRect/>
                                 </a:stretch>
@@ -3818,9 +3718,9 @@
                 </mc:Choice>
                 <mc:Fallback>
                   <w:pict>
-                    <v:group w14:anchorId="289DA39B" id="Group 7" o:spid="_x0000_s1026" style="position:absolute;left:0;text-align:left;margin-left:42.6pt;margin-top:-19.4pt;width:59.3pt;height:58.8pt;z-index:-251654656;mso-wrap-distance-left:0;mso-wrap-distance-right:0" coordsize="7531,7467" o:gfxdata="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">
+                    <v:group w14:anchorId="55C70AE3" id="Group 7" o:spid="_x0000_s1026" style="position:absolute;left:0;text-align:left;margin-left:42.6pt;margin-top:-19.4pt;width:59.3pt;height:58.8pt;z-index:-251654656;mso-wrap-distance-left:0;mso-wrap-distance-right:0" coordsize="7531,7467" o:gfxdata="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">
                       <v:shape id="Image 8" o:spid="_x0000_s1027" type="#_x0000_t75" style="position:absolute;width:7538;height:7477;visibility:visible;mso-wrap-style:square" o:gfxdata="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">
-                        <v:imagedata r:id="rId13" o:title=""/>
+                        <v:imagedata r:id="rId15" o:title=""/>
                       </v:shape>
                     </v:group>
                   </w:pict>
@@ -4261,7 +4161,14 @@
                 <w:rFonts w:asciiTheme="minorEastAsia" w:eastAsiaTheme="minorEastAsia" w:hAnsiTheme="minorEastAsia" w:hint="eastAsia"/>
                 <w:sz w:val="20"/>
               </w:rPr>
-              <w:t>{오늘날짜}</w:t>
+              <w:t>{</w:t>
+            </w:r>
+            <w:r>
+              <w:rPr>
+                <w:rFonts w:asciiTheme="minorEastAsia" w:eastAsiaTheme="minorEastAsia" w:hAnsiTheme="minorEastAsia" w:hint="eastAsia"/>
+                <w:sz w:val="20"/>
+              </w:rPr>
+              <w:t>제조일자}</w:t>
             </w:r>
           </w:p>
         </w:tc>
@@ -4279,6 +4186,8 @@
                 <w:sz w:val="24"/>
               </w:rPr>
             </w:pPr>
+            <w:bookmarkStart w:id="0" w:name="_GoBack"/>
+            <w:bookmarkEnd w:id="0"/>
           </w:p>
         </w:tc>
       </w:tr>
@@ -4299,7 +4208,6 @@
                 <w:rFonts w:asciiTheme="minorEastAsia" w:eastAsiaTheme="minorEastAsia" w:hAnsiTheme="minorEastAsia"/>
               </w:rPr>
             </w:pPr>
-            <w:proofErr w:type="spellStart"/>
             <w:r>
               <w:rPr>
                 <w:rFonts w:asciiTheme="minorEastAsia" w:eastAsiaTheme="minorEastAsia" w:hAnsiTheme="minorEastAsia"/>
@@ -4307,7 +4215,6 @@
               </w:rPr>
               <w:t>검체채취일</w:t>
             </w:r>
-            <w:proofErr w:type="spellEnd"/>
           </w:p>
         </w:tc>
         <w:tc>
@@ -4327,7 +4234,14 @@
                 <w:rFonts w:asciiTheme="minorEastAsia" w:eastAsiaTheme="minorEastAsia" w:hAnsiTheme="minorEastAsia" w:hint="eastAsia"/>
                 <w:sz w:val="20"/>
               </w:rPr>
-              <w:t>{오늘날짜}</w:t>
+              <w:t>{</w:t>
+            </w:r>
+            <w:r>
+              <w:rPr>
+                <w:rFonts w:asciiTheme="minorEastAsia" w:eastAsiaTheme="minorEastAsia" w:hAnsiTheme="minorEastAsia" w:hint="eastAsia"/>
+                <w:sz w:val="20"/>
+              </w:rPr>
+              <w:t>제조일자}</w:t>
             </w:r>
           </w:p>
         </w:tc>
@@ -4396,7 +4310,14 @@
                 <w:rFonts w:asciiTheme="minorEastAsia" w:eastAsiaTheme="minorEastAsia" w:hAnsiTheme="minorEastAsia" w:hint="eastAsia"/>
                 <w:sz w:val="20"/>
               </w:rPr>
-              <w:t>{오늘날짜}</w:t>
+              <w:t>{</w:t>
+            </w:r>
+            <w:r>
+              <w:rPr>
+                <w:rFonts w:asciiTheme="minorEastAsia" w:eastAsiaTheme="minorEastAsia" w:hAnsiTheme="minorEastAsia" w:hint="eastAsia"/>
+                <w:sz w:val="20"/>
+              </w:rPr>
+              <w:t>제조일자}</w:t>
             </w:r>
           </w:p>
         </w:tc>
@@ -4436,7 +4357,6 @@
                 <w:rFonts w:asciiTheme="minorEastAsia" w:eastAsiaTheme="minorEastAsia" w:hAnsiTheme="minorEastAsia"/>
               </w:rPr>
             </w:pPr>
-            <w:proofErr w:type="spellStart"/>
             <w:r>
               <w:rPr>
                 <w:rFonts w:asciiTheme="minorEastAsia" w:eastAsiaTheme="minorEastAsia" w:hAnsiTheme="minorEastAsia"/>
@@ -4444,7 +4364,6 @@
               </w:rPr>
               <w:t>검체채취자</w:t>
             </w:r>
-            <w:proofErr w:type="spellEnd"/>
           </w:p>
         </w:tc>
         <w:tc>
@@ -4566,6 +4485,44 @@
     </w:sectPr>
   </w:body>
 </w:document>
+</file>
+
+<file path=word/endnotes.xml><?xml version="1.0" encoding="utf-8"?>
+<w:endnotes xmlns:wpc="http://schemas.microsoft.com/office/word/2010/wordprocessingCanvas" xmlns:cx="http://schemas.microsoft.com/office/drawing/2014/chartex" xmlns:mc="http://schemas.openxmlformats.org/markup-compatibility/2006" xmlns:o="urn:schemas-microsoft-com:office:office" xmlns:r="http://schemas.openxmlformats.org/officeDocument/2006/relationships" xmlns:m="http://schemas.openxmlformats.org/officeDocument/2006/math" xmlns:v="urn:schemas-microsoft-com:vml" xmlns:wp14="http://schemas.microsoft.com/office/word/2010/wordprocessingDrawing" xmlns:wp="http://schemas.openxmlformats.org/drawingml/2006/wordprocessingDrawing" xmlns:w10="urn:schemas-microsoft-com:office:word" xmlns:w="http://schemas.openxmlformats.org/wordprocessingml/2006/main" xmlns:w14="http://schemas.microsoft.com/office/word/2010/wordml" xmlns:w15="http://schemas.microsoft.com/office/word/2012/wordml" xmlns:w16se="http://schemas.microsoft.com/office/word/2015/wordml/symex" xmlns:wpg="http://schemas.microsoft.com/office/word/2010/wordprocessingGroup" xmlns:wpi="http://schemas.microsoft.com/office/word/2010/wordprocessingInk" xmlns:wne="http://schemas.microsoft.com/office/word/2006/wordml" xmlns:wps="http://schemas.microsoft.com/office/word/2010/wordprocessingShape" mc:Ignorable="w14 w15 w16se wp14">
+  <w:endnote w:type="separator" w:id="-1">
+    <w:p>
+      <w:r>
+        <w:separator/>
+      </w:r>
+    </w:p>
+  </w:endnote>
+  <w:endnote w:type="continuationSeparator" w:id="0">
+    <w:p>
+      <w:r>
+        <w:continuationSeparator/>
+      </w:r>
+    </w:p>
+  </w:endnote>
+</w:endnotes>
+</file>
+
+<file path=word/footnotes.xml><?xml version="1.0" encoding="utf-8"?>
+<w:footnotes xmlns:wpc="http://schemas.microsoft.com/office/word/2010/wordprocessingCanvas" xmlns:cx="http://schemas.microsoft.com/office/drawing/2014/chartex" xmlns:mc="http://schemas.openxmlformats.org/markup-compatibility/2006" xmlns:o="urn:schemas-microsoft-com:office:office" xmlns:r="http://schemas.openxmlformats.org/officeDocument/2006/relationships" xmlns:m="http://schemas.openxmlformats.org/officeDocument/2006/math" xmlns:v="urn:schemas-microsoft-com:vml" xmlns:wp14="http://schemas.microsoft.com/office/word/2010/wordprocessingDrawing" xmlns:wp="http://schemas.openxmlformats.org/drawingml/2006/wordprocessingDrawing" xmlns:w10="urn:schemas-microsoft-com:office:word" xmlns:w="http://schemas.openxmlformats.org/wordprocessingml/2006/main" xmlns:w14="http://schemas.microsoft.com/office/word/2010/wordml" xmlns:w15="http://schemas.microsoft.com/office/word/2012/wordml" xmlns:w16se="http://schemas.microsoft.com/office/word/2015/wordml/symex" xmlns:wpg="http://schemas.microsoft.com/office/word/2010/wordprocessingGroup" xmlns:wpi="http://schemas.microsoft.com/office/word/2010/wordprocessingInk" xmlns:wne="http://schemas.microsoft.com/office/word/2006/wordml" xmlns:wps="http://schemas.microsoft.com/office/word/2010/wordprocessingShape" mc:Ignorable="w14 w15 w16se wp14">
+  <w:footnote w:type="separator" w:id="-1">
+    <w:p>
+      <w:r>
+        <w:separator/>
+      </w:r>
+    </w:p>
+  </w:footnote>
+  <w:footnote w:type="continuationSeparator" w:id="0">
+    <w:p>
+      <w:r>
+        <w:continuationSeparator/>
+      </w:r>
+    </w:p>
+  </w:footnote>
+</w:footnotes>
 </file>
 
 <file path=word/numbering.xml><?xml version="1.0" encoding="utf-8"?>
@@ -5529,6 +5486,56 @@
       <w:rFonts w:ascii="돋움" w:eastAsia="돋움" w:hAnsi="돋움" w:cs="돋움"/>
     </w:rPr>
   </w:style>
+  <w:style w:type="paragraph" w:styleId="a4">
+    <w:name w:val="header"/>
+    <w:basedOn w:val="a"/>
+    <w:link w:val="Char"/>
+    <w:uiPriority w:val="99"/>
+    <w:unhideWhenUsed/>
+    <w:rsid w:val="007E63CD"/>
+    <w:pPr>
+      <w:tabs>
+        <w:tab w:val="center" w:pos="4513"/>
+        <w:tab w:val="right" w:pos="9026"/>
+      </w:tabs>
+      <w:snapToGrid w:val="0"/>
+    </w:pPr>
+  </w:style>
+  <w:style w:type="character" w:customStyle="1" w:styleId="Char">
+    <w:name w:val="머리글 Char"/>
+    <w:basedOn w:val="a0"/>
+    <w:link w:val="a4"/>
+    <w:uiPriority w:val="99"/>
+    <w:rsid w:val="007E63CD"/>
+    <w:rPr>
+      <w:lang w:eastAsia="ko-KR"/>
+    </w:rPr>
+  </w:style>
+  <w:style w:type="paragraph" w:styleId="a5">
+    <w:name w:val="footer"/>
+    <w:basedOn w:val="a"/>
+    <w:link w:val="Char0"/>
+    <w:uiPriority w:val="99"/>
+    <w:unhideWhenUsed/>
+    <w:rsid w:val="007E63CD"/>
+    <w:pPr>
+      <w:tabs>
+        <w:tab w:val="center" w:pos="4513"/>
+        <w:tab w:val="right" w:pos="9026"/>
+      </w:tabs>
+      <w:snapToGrid w:val="0"/>
+    </w:pPr>
+  </w:style>
+  <w:style w:type="character" w:customStyle="1" w:styleId="Char0">
+    <w:name w:val="바닥글 Char"/>
+    <w:basedOn w:val="a0"/>
+    <w:link w:val="a5"/>
+    <w:uiPriority w:val="99"/>
+    <w:rsid w:val="007E63CD"/>
+    <w:rPr>
+      <w:lang w:eastAsia="ko-KR"/>
+    </w:rPr>
+  </w:style>
 </w:styles>
 </file>
 
@@ -5820,7 +5827,7 @@
 </file>
 
 <file path=customXml/itemProps1.xml><?xml version="1.0" encoding="utf-8"?>
-<ds:datastoreItem xmlns:ds="http://schemas.openxmlformats.org/officeDocument/2006/customXml" ds:itemID="{8687F1B6-AD4B-427D-95AF-6E02B9D265DE}">
+<ds:datastoreItem xmlns:ds="http://schemas.openxmlformats.org/officeDocument/2006/customXml" ds:itemID="{5F2C8E3D-1A63-4F4B-AF29-C477F6CFAFEF}">
   <ds:schemaRefs>
     <ds:schemaRef ds:uri="http://schemas.openxmlformats.org/officeDocument/2006/bibliography"/>
   </ds:schemaRefs>

</xml_diff>